<commit_message>
fix: update eligible corpus to N=23 (Ahmad retracted Aug 2026), regenerate figs 1-8, S1, S3 and README
</commit_message>
<xml_diff>
--- a/prisma/PRISMA_2020.docx
+++ b/prisma/PRISMA_2020.docx
@@ -186,6 +186,583 @@
       <w:pPr>
         <w:spacing w:after="0" w:line="240" w:lineRule="auto"/>
       </w:pPr>
+      <w:r>
+        <w:rPr>
+          <w:noProof/>
+        </w:rPr>
+        <mc:AlternateContent>
+          <mc:Choice Requires="wps">
+            <w:drawing>
+              <wp:anchor distT="0" distB="0" distL="114300" distR="114300" simplePos="0" relativeHeight="251743232" behindDoc="0" locked="0" layoutInCell="1" allowOverlap="1" wp14:anchorId="182F8B76" wp14:editId="6378FB47">
+                <wp:simplePos x="0" y="0"/>
+                <wp:positionH relativeFrom="column">
+                  <wp:posOffset>4689696</wp:posOffset>
+                </wp:positionH>
+                <wp:positionV relativeFrom="paragraph">
+                  <wp:posOffset>95175</wp:posOffset>
+                </wp:positionV>
+                <wp:extent cx="1534562" cy="611044"/>
+                <wp:effectExtent l="0" t="0" r="27940" b="17780"/>
+                <wp:wrapNone/>
+                <wp:docPr id="1362377682" name="Rectangle 2"/>
+                <wp:cNvGraphicFramePr/>
+                <a:graphic xmlns:a="http://schemas.openxmlformats.org/drawingml/2006/main">
+                  <a:graphicData uri="http://schemas.microsoft.com/office/word/2010/wordprocessingShape">
+                    <wps:wsp>
+                      <wps:cNvSpPr/>
+                      <wps:spPr>
+                        <a:xfrm>
+                          <a:off x="0" y="0"/>
+                          <a:ext cx="1534562" cy="611044"/>
+                        </a:xfrm>
+                        <a:prstGeom prst="rect">
+                          <a:avLst/>
+                        </a:prstGeom>
+                        <a:noFill/>
+                        <a:ln>
+                          <a:solidFill>
+                            <a:schemeClr val="tx1"/>
+                          </a:solidFill>
+                        </a:ln>
+                      </wps:spPr>
+                      <wps:style>
+                        <a:lnRef idx="2">
+                          <a:schemeClr val="accent1">
+                            <a:shade val="50000"/>
+                          </a:schemeClr>
+                        </a:lnRef>
+                        <a:fillRef idx="1">
+                          <a:schemeClr val="accent1"/>
+                        </a:fillRef>
+                        <a:effectRef idx="0">
+                          <a:schemeClr val="accent1"/>
+                        </a:effectRef>
+                        <a:fontRef idx="minor">
+                          <a:schemeClr val="lt1"/>
+                        </a:fontRef>
+                      </wps:style>
+                      <wps:txbx>
+                        <w:txbxContent>
+                          <w:p>
+                            <w:pPr>
+                              <w:spacing w:after="0" w:line="240" w:lineRule="auto"/>
+                              <w:ind w:left="142"/>
+                              <w:rPr>
+                                <w:rFonts w:ascii="Arial" w:hAnsi="Arial" w:cs="Arial"/>
+                                <w:color w:val="000000" w:themeColor="text1"/>
+                                <w:sz w:val="18"/>
+                                <w:szCs w:val="20"/>
+                                <w:lang w:val="en-US"/>
+                              </w:rPr>
+                            </w:pPr>
+                            <w:r>
+                              <w:rPr>
+                                <w:rFonts w:ascii="Arial" w:hAnsi="Arial" w:cs="Arial"/>
+                                <w:color w:val="000000" w:themeColor="text1"/>
+                                <w:sz w:val="18"/>
+                                <w:szCs w:val="20"/>
+                                <w:lang w:val="en-US"/>
+                              </w:rPr>
+                              <w:t>Records excluded from</w:t>
+                            </w:r>
+                          </w:p>
+                          <w:p>
+                            <w:pPr>
+                              <w:spacing w:after="0" w:line="240" w:lineRule="auto"/>
+                              <w:ind w:left="142"/>
+                              <w:rPr>
+                                <w:rFonts w:ascii="Arial" w:hAnsi="Arial" w:cs="Arial"/>
+                                <w:color w:val="000000" w:themeColor="text1"/>
+                                <w:sz w:val="18"/>
+                                <w:szCs w:val="20"/>
+                                <w:lang w:val="en-US"/>
+                              </w:rPr>
+                            </w:pPr>
+                            <w:r>
+                              <w:rPr>
+                                <w:rFonts w:ascii="Arial" w:hAnsi="Arial" w:cs="Arial"/>
+                                <w:color w:val="000000" w:themeColor="text1"/>
+                                <w:sz w:val="18"/>
+                                <w:szCs w:val="20"/>
+                                <w:lang w:val="en-US"/>
+                              </w:rPr>
+                              <w:t>other met</w:t>
+                            </w:r>
+                            <w:r>
+                              <w:rPr>
+                                <w:rFonts w:ascii="Arial" w:hAnsi="Arial" w:cs="Arial"/>
+                                <w:color w:val="000000" w:themeColor="text1"/>
+                                <w:sz w:val="18"/>
+                                <w:szCs w:val="20"/>
+                                <w:lang w:val="en-US"/>
+                              </w:rPr>
+                              <w:t>h</w:t>
+                            </w:r>
+                            <w:r>
+                              <w:rPr>
+                                <w:rFonts w:ascii="Arial" w:hAnsi="Arial" w:cs="Arial"/>
+                                <w:color w:val="000000" w:themeColor="text1"/>
+                                <w:sz w:val="18"/>
+                                <w:szCs w:val="20"/>
+                                <w:lang w:val="en-US"/>
+                              </w:rPr>
+                              <w:t>ods (n = 5)</w:t>
+                            </w:r>
+                            <w:r>
+                              <w:rPr>
+                                <w:rFonts w:ascii="Arial" w:hAnsi="Arial" w:cs="Arial"/>
+                                <w:color w:val="000000" w:themeColor="text1"/>
+                                <w:sz w:val="18"/>
+                                <w:szCs w:val="20"/>
+                                <w:lang w:val="en-US"/>
+                              </w:rPr>
+                              <w:t>:</w:t>
+                            </w:r>
+                          </w:p>
+                          <w:p>
+                            <w:pPr>
+                              <w:spacing w:after="0" w:line="240" w:lineRule="auto"/>
+                              <w:ind w:left="142"/>
+                              <w:rPr>
+                                <w:rFonts w:ascii="Arial" w:hAnsi="Arial" w:cs="Arial"/>
+                                <w:color w:val="000000" w:themeColor="text1"/>
+                                <w:sz w:val="18"/>
+                                <w:szCs w:val="20"/>
+                                <w:lang w:val="en-US"/>
+                              </w:rPr>
+                            </w:pPr>
+                            <w:r>
+                              <w:rPr>
+                                <w:rFonts w:ascii="Arial" w:hAnsi="Arial" w:cs="Arial"/>
+                                <w:color w:val="000000" w:themeColor="text1"/>
+                                <w:sz w:val="18"/>
+                                <w:szCs w:val="20"/>
+                                <w:lang w:val="en-US"/>
+                              </w:rPr>
+                              <w:t xml:space="preserve">None </w:t>
+                            </w:r>
+                            <w:r>
+                              <w:rPr>
+                                <w:rFonts w:ascii="Arial" w:hAnsi="Arial" w:cs="Arial"/>
+                                <w:color w:val="000000" w:themeColor="text1"/>
+                                <w:sz w:val="18"/>
+                                <w:szCs w:val="20"/>
+                                <w:lang w:val="en-US"/>
+                              </w:rPr>
+                              <w:t>m</w:t>
+                            </w:r>
+                            <w:r>
+                              <w:rPr>
+                                <w:rFonts w:ascii="Arial" w:hAnsi="Arial" w:cs="Arial"/>
+                                <w:color w:val="000000" w:themeColor="text1"/>
+                                <w:sz w:val="18"/>
+                                <w:szCs w:val="20"/>
+                                <w:lang w:val="en-US"/>
+                              </w:rPr>
+                              <w:t>et eligibility</w:t>
+                            </w:r>
+                            <w:r>
+                              <w:rPr>
+                                <w:rFonts w:ascii="Arial" w:hAnsi="Arial" w:cs="Arial"/>
+                                <w:color w:val="000000" w:themeColor="text1"/>
+                                <w:sz w:val="18"/>
+                                <w:szCs w:val="20"/>
+                                <w:lang w:val="en-US"/>
+                              </w:rPr>
+                              <w:t xml:space="preserve"> criteria</w:t>
+                            </w:r>
+                          </w:p>
+                        </w:txbxContent>
+                      </wps:txbx>
+                      <wps:bodyPr rot="0" spcFirstLastPara="0" vertOverflow="overflow" horzOverflow="overflow" vert="horz" wrap="square" lIns="0" tIns="0" rIns="0" bIns="0" numCol="1" spcCol="0" rtlCol="0" fromWordArt="0" anchor="ctr" anchorCtr="0" forceAA="0" compatLnSpc="1">
+                        <a:prstTxWarp prst="textNoShape">
+                          <a:avLst/>
+                        </a:prstTxWarp>
+                        <a:noAutofit/>
+                      </wps:bodyPr>
+                    </wps:wsp>
+                  </a:graphicData>
+                </a:graphic>
+                <wp14:sizeRelH relativeFrom="margin">
+                  <wp14:pctWidth>0</wp14:pctWidth>
+                </wp14:sizeRelH>
+                <wp14:sizeRelV relativeFrom="margin">
+                  <wp14:pctHeight>0</wp14:pctHeight>
+                </wp14:sizeRelV>
+              </wp:anchor>
+            </w:drawing>
+          </mc:Choice>
+          <mc:Fallback>
+            <w:pict>
+              <v:rect w14:anchorId="182F8B76" id="Rectangle 2" o:spid="_x0000_s1027" style="position:absolute;margin-left:369.25pt;margin-top:7.5pt;width:120.85pt;height:48.1pt;z-index:251743232;visibility:visible;mso-wrap-style:square;mso-width-percent:0;mso-height-percent:0;mso-wrap-distance-left:9pt;mso-wrap-distance-top:0;mso-wrap-distance-right:9pt;mso-wrap-distance-bottom:0;mso-position-horizontal:absolute;mso-position-horizontal-relative:text;mso-position-vertical:absolute;mso-position-vertical-relative:text;mso-width-percent:0;mso-height-percent:0;mso-width-relative:margin;mso-height-relative:margin;v-text-anchor:middle" o:gfxdata="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" filled="f" strokecolor="black [3213]" strokeweight="1pt">
+                <v:textbox inset="0,0,0,0">
+                  <w:txbxContent>
+                    <w:p>
+                      <w:pPr>
+                        <w:spacing w:after="0" w:line="240" w:lineRule="auto"/>
+                        <w:ind w:left="142"/>
+                        <w:rPr>
+                          <w:rFonts w:ascii="Arial" w:hAnsi="Arial" w:cs="Arial"/>
+                          <w:color w:val="000000" w:themeColor="text1"/>
+                          <w:sz w:val="18"/>
+                          <w:szCs w:val="20"/>
+                          <w:lang w:val="en-US"/>
+                        </w:rPr>
+                      </w:pPr>
+                      <w:r>
+                        <w:rPr>
+                          <w:rFonts w:ascii="Arial" w:hAnsi="Arial" w:cs="Arial"/>
+                          <w:color w:val="000000" w:themeColor="text1"/>
+                          <w:sz w:val="18"/>
+                          <w:szCs w:val="20"/>
+                          <w:lang w:val="en-US"/>
+                        </w:rPr>
+                        <w:t>Records excluded from</w:t>
+                      </w:r>
+                    </w:p>
+                    <w:p>
+                      <w:pPr>
+                        <w:spacing w:after="0" w:line="240" w:lineRule="auto"/>
+                        <w:ind w:left="142"/>
+                        <w:rPr>
+                          <w:rFonts w:ascii="Arial" w:hAnsi="Arial" w:cs="Arial"/>
+                          <w:color w:val="000000" w:themeColor="text1"/>
+                          <w:sz w:val="18"/>
+                          <w:szCs w:val="20"/>
+                          <w:lang w:val="en-US"/>
+                        </w:rPr>
+                      </w:pPr>
+                      <w:r>
+                        <w:rPr>
+                          <w:rFonts w:ascii="Arial" w:hAnsi="Arial" w:cs="Arial"/>
+                          <w:color w:val="000000" w:themeColor="text1"/>
+                          <w:sz w:val="18"/>
+                          <w:szCs w:val="20"/>
+                          <w:lang w:val="en-US"/>
+                        </w:rPr>
+                        <w:t>other met</w:t>
+                      </w:r>
+                      <w:r>
+                        <w:rPr>
+                          <w:rFonts w:ascii="Arial" w:hAnsi="Arial" w:cs="Arial"/>
+                          <w:color w:val="000000" w:themeColor="text1"/>
+                          <w:sz w:val="18"/>
+                          <w:szCs w:val="20"/>
+                          <w:lang w:val="en-US"/>
+                        </w:rPr>
+                        <w:t>h</w:t>
+                      </w:r>
+                      <w:r>
+                        <w:rPr>
+                          <w:rFonts w:ascii="Arial" w:hAnsi="Arial" w:cs="Arial"/>
+                          <w:color w:val="000000" w:themeColor="text1"/>
+                          <w:sz w:val="18"/>
+                          <w:szCs w:val="20"/>
+                          <w:lang w:val="en-US"/>
+                        </w:rPr>
+                        <w:t>ods (n = 5)</w:t>
+                      </w:r>
+                      <w:r>
+                        <w:rPr>
+                          <w:rFonts w:ascii="Arial" w:hAnsi="Arial" w:cs="Arial"/>
+                          <w:color w:val="000000" w:themeColor="text1"/>
+                          <w:sz w:val="18"/>
+                          <w:szCs w:val="20"/>
+                          <w:lang w:val="en-US"/>
+                        </w:rPr>
+                        <w:t>:</w:t>
+                      </w:r>
+                    </w:p>
+                    <w:p>
+                      <w:pPr>
+                        <w:spacing w:after="0" w:line="240" w:lineRule="auto"/>
+                        <w:ind w:left="142"/>
+                        <w:rPr>
+                          <w:rFonts w:ascii="Arial" w:hAnsi="Arial" w:cs="Arial"/>
+                          <w:color w:val="000000" w:themeColor="text1"/>
+                          <w:sz w:val="18"/>
+                          <w:szCs w:val="20"/>
+                          <w:lang w:val="en-US"/>
+                        </w:rPr>
+                      </w:pPr>
+                      <w:r>
+                        <w:rPr>
+                          <w:rFonts w:ascii="Arial" w:hAnsi="Arial" w:cs="Arial"/>
+                          <w:color w:val="000000" w:themeColor="text1"/>
+                          <w:sz w:val="18"/>
+                          <w:szCs w:val="20"/>
+                          <w:lang w:val="en-US"/>
+                        </w:rPr>
+                        <w:t xml:space="preserve">None </w:t>
+                      </w:r>
+                      <w:r>
+                        <w:rPr>
+                          <w:rFonts w:ascii="Arial" w:hAnsi="Arial" w:cs="Arial"/>
+                          <w:color w:val="000000" w:themeColor="text1"/>
+                          <w:sz w:val="18"/>
+                          <w:szCs w:val="20"/>
+                          <w:lang w:val="en-US"/>
+                        </w:rPr>
+                        <w:t>m</w:t>
+                      </w:r>
+                      <w:r>
+                        <w:rPr>
+                          <w:rFonts w:ascii="Arial" w:hAnsi="Arial" w:cs="Arial"/>
+                          <w:color w:val="000000" w:themeColor="text1"/>
+                          <w:sz w:val="18"/>
+                          <w:szCs w:val="20"/>
+                          <w:lang w:val="en-US"/>
+                        </w:rPr>
+                        <w:t>et eligibility</w:t>
+                      </w:r>
+                      <w:r>
+                        <w:rPr>
+                          <w:rFonts w:ascii="Arial" w:hAnsi="Arial" w:cs="Arial"/>
+                          <w:color w:val="000000" w:themeColor="text1"/>
+                          <w:sz w:val="18"/>
+                          <w:szCs w:val="20"/>
+                          <w:lang w:val="en-US"/>
+                        </w:rPr>
+                        <w:t xml:space="preserve"> criteria</w:t>
+                      </w:r>
+                    </w:p>
+                  </w:txbxContent>
+                </v:textbox>
+              </v:rect>
+            </w:pict>
+          </mc:Fallback>
+        </mc:AlternateContent>
+      </w:r>
+      <w:r>
+        <w:rPr>
+          <w:noProof/>
+        </w:rPr>
+        <mc:AlternateContent>
+          <mc:Choice Requires="wps">
+            <w:drawing>
+              <wp:anchor distT="0" distB="0" distL="114300" distR="114300" simplePos="0" relativeHeight="251741184" behindDoc="0" locked="0" layoutInCell="1" allowOverlap="1" wp14:anchorId="473ED7E1" wp14:editId="55F8DDDD">
+                <wp:simplePos x="0" y="0"/>
+                <wp:positionH relativeFrom="column">
+                  <wp:posOffset>3040054</wp:posOffset>
+                </wp:positionH>
+                <wp:positionV relativeFrom="paragraph">
+                  <wp:posOffset>94853</wp:posOffset>
+                </wp:positionV>
+                <wp:extent cx="1399769" cy="606711"/>
+                <wp:effectExtent l="0" t="0" r="10160" b="22225"/>
+                <wp:wrapNone/>
+                <wp:docPr id="832253052" name="Rectangle 2"/>
+                <wp:cNvGraphicFramePr/>
+                <a:graphic xmlns:a="http://schemas.openxmlformats.org/drawingml/2006/main">
+                  <a:graphicData uri="http://schemas.microsoft.com/office/word/2010/wordprocessingShape">
+                    <wps:wsp>
+                      <wps:cNvSpPr/>
+                      <wps:spPr>
+                        <a:xfrm>
+                          <a:off x="0" y="0"/>
+                          <a:ext cx="1399769" cy="606711"/>
+                        </a:xfrm>
+                        <a:prstGeom prst="rect">
+                          <a:avLst/>
+                        </a:prstGeom>
+                        <a:noFill/>
+                        <a:ln w="12700">
+                          <a:solidFill>
+                            <a:schemeClr val="tx1"/>
+                          </a:solidFill>
+                          <a:prstDash val="sysDash"/>
+                          <a:round/>
+                        </a:ln>
+                      </wps:spPr>
+                      <wps:style>
+                        <a:lnRef idx="2">
+                          <a:schemeClr val="accent1">
+                            <a:shade val="50000"/>
+                          </a:schemeClr>
+                        </a:lnRef>
+                        <a:fillRef idx="1">
+                          <a:schemeClr val="accent1"/>
+                        </a:fillRef>
+                        <a:effectRef idx="0">
+                          <a:schemeClr val="accent1"/>
+                        </a:effectRef>
+                        <a:fontRef idx="minor">
+                          <a:schemeClr val="lt1"/>
+                        </a:fontRef>
+                      </wps:style>
+                      <wps:txbx>
+                        <w:txbxContent>
+                          <w:p>
+                            <w:pPr>
+                              <w:spacing w:after="0" w:line="240" w:lineRule="auto"/>
+                              <w:ind w:left="142"/>
+                              <w:rPr>
+                                <w:rFonts w:ascii="Arial" w:hAnsi="Arial" w:cs="Arial"/>
+                                <w:color w:val="000000" w:themeColor="text1"/>
+                                <w:sz w:val="18"/>
+                                <w:szCs w:val="20"/>
+                                <w:lang w:val="es-ES"/>
+                              </w:rPr>
+                            </w:pPr>
+                            <w:r>
+                              <w:rPr>
+                                <w:rFonts w:ascii="Arial" w:hAnsi="Arial" w:cs="Arial"/>
+                                <w:color w:val="000000" w:themeColor="text1"/>
+                                <w:sz w:val="18"/>
+                                <w:szCs w:val="20"/>
+                                <w:lang w:val="es-ES"/>
+                              </w:rPr>
+                              <w:t>Records identified from:</w:t>
+                            </w:r>
+                          </w:p>
+                          <w:p>
+                            <w:pPr>
+                              <w:spacing w:after="0" w:line="240" w:lineRule="auto"/>
+                              <w:ind w:left="142"/>
+                              <w:rPr>
+                                <w:rFonts w:ascii="Arial" w:hAnsi="Arial" w:cs="Arial"/>
+                                <w:color w:val="000000" w:themeColor="text1"/>
+                                <w:sz w:val="18"/>
+                                <w:szCs w:val="20"/>
+                                <w:lang w:val="es-ES"/>
+                              </w:rPr>
+                            </w:pPr>
+                            <w:r>
+                              <w:rPr>
+                                <w:rFonts w:ascii="Arial" w:hAnsi="Arial" w:cs="Arial"/>
+                                <w:color w:val="000000" w:themeColor="text1"/>
+                                <w:sz w:val="18"/>
+                                <w:szCs w:val="20"/>
+                                <w:lang w:val="es-ES"/>
+                              </w:rPr>
+                              <w:t>Other methods</w:t>
+                            </w:r>
+                          </w:p>
+                          <w:p>
+                            <w:pPr>
+                              <w:spacing w:after="0" w:line="240" w:lineRule="auto"/>
+                              <w:ind w:left="142"/>
+                              <w:rPr>
+                                <w:rFonts w:ascii="Arial" w:hAnsi="Arial" w:cs="Arial"/>
+                                <w:color w:val="000000" w:themeColor="text1"/>
+                                <w:sz w:val="18"/>
+                                <w:szCs w:val="20"/>
+                                <w:lang w:val="es-ES"/>
+                              </w:rPr>
+                            </w:pPr>
+                            <w:r>
+                              <w:rPr>
+                                <w:rFonts w:ascii="Arial" w:hAnsi="Arial" w:cs="Arial"/>
+                                <w:color w:val="000000" w:themeColor="text1"/>
+                                <w:sz w:val="18"/>
+                                <w:szCs w:val="20"/>
+                                <w:lang w:val="es-ES"/>
+                              </w:rPr>
+                              <w:t>Citation chasing (n = 5)</w:t>
+                            </w:r>
+                          </w:p>
+                        </w:txbxContent>
+                      </wps:txbx>
+                      <wps:bodyPr rot="0" spcFirstLastPara="0" vertOverflow="overflow" horzOverflow="overflow" vert="horz" wrap="square" lIns="0" tIns="0" rIns="0" bIns="0" numCol="1" spcCol="0" rtlCol="0" fromWordArt="0" anchor="ctr" anchorCtr="0" forceAA="0" compatLnSpc="1">
+                        <a:prstTxWarp prst="textNoShape">
+                          <a:avLst/>
+                        </a:prstTxWarp>
+                        <a:noAutofit/>
+                      </wps:bodyPr>
+                    </wps:wsp>
+                  </a:graphicData>
+                </a:graphic>
+                <wp14:sizeRelH relativeFrom="margin">
+                  <wp14:pctWidth>0</wp14:pctWidth>
+                </wp14:sizeRelH>
+                <wp14:sizeRelV relativeFrom="margin">
+                  <wp14:pctHeight>0</wp14:pctHeight>
+                </wp14:sizeRelV>
+              </wp:anchor>
+            </w:drawing>
+          </mc:Choice>
+          <mc:Fallback>
+            <w:pict>
+              <v:rect w14:anchorId="473ED7E1" id="_x0000_s1028" style="position:absolute;margin-left:239.35pt;margin-top:7.45pt;width:110.2pt;height:47.75pt;z-index:251741184;visibility:visible;mso-wrap-style:square;mso-width-percent:0;mso-height-percent:0;mso-wrap-distance-left:9pt;mso-wrap-distance-top:0;mso-wrap-distance-right:9pt;mso-wrap-distance-bottom:0;mso-position-horizontal:absolute;mso-position-horizontal-relative:text;mso-position-vertical:absolute;mso-position-vertical-relative:text;mso-width-percent:0;mso-height-percent:0;mso-width-relative:margin;mso-height-relative:margin;v-text-anchor:middle" o:gfxdata="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" filled="f" strokecolor="black [3213]" strokeweight="1pt">
+                <v:stroke dashstyle="3 1" joinstyle="round"/>
+                <v:textbox inset="0,0,0,0">
+                  <w:txbxContent>
+                    <w:p>
+                      <w:pPr>
+                        <w:spacing w:after="0" w:line="240" w:lineRule="auto"/>
+                        <w:ind w:left="142"/>
+                        <w:rPr>
+                          <w:rFonts w:ascii="Arial" w:hAnsi="Arial" w:cs="Arial"/>
+                          <w:color w:val="000000" w:themeColor="text1"/>
+                          <w:sz w:val="18"/>
+                          <w:szCs w:val="20"/>
+                          <w:lang w:val="es-ES"/>
+                        </w:rPr>
+                      </w:pPr>
+                      <w:r>
+                        <w:rPr>
+                          <w:rFonts w:ascii="Arial" w:hAnsi="Arial" w:cs="Arial"/>
+                          <w:color w:val="000000" w:themeColor="text1"/>
+                          <w:sz w:val="18"/>
+                          <w:szCs w:val="20"/>
+                          <w:lang w:val="es-ES"/>
+                        </w:rPr>
+                        <w:t>Records identified from:</w:t>
+                      </w:r>
+                    </w:p>
+                    <w:p>
+                      <w:pPr>
+                        <w:spacing w:after="0" w:line="240" w:lineRule="auto"/>
+                        <w:ind w:left="142"/>
+                        <w:rPr>
+                          <w:rFonts w:ascii="Arial" w:hAnsi="Arial" w:cs="Arial"/>
+                          <w:color w:val="000000" w:themeColor="text1"/>
+                          <w:sz w:val="18"/>
+                          <w:szCs w:val="20"/>
+                          <w:lang w:val="es-ES"/>
+                        </w:rPr>
+                      </w:pPr>
+                      <w:r>
+                        <w:rPr>
+                          <w:rFonts w:ascii="Arial" w:hAnsi="Arial" w:cs="Arial"/>
+                          <w:color w:val="000000" w:themeColor="text1"/>
+                          <w:sz w:val="18"/>
+                          <w:szCs w:val="20"/>
+                          <w:lang w:val="es-ES"/>
+                        </w:rPr>
+                        <w:t>Other methods</w:t>
+                      </w:r>
+                    </w:p>
+                    <w:p>
+                      <w:pPr>
+                        <w:spacing w:after="0" w:line="240" w:lineRule="auto"/>
+                        <w:ind w:left="142"/>
+                        <w:rPr>
+                          <w:rFonts w:ascii="Arial" w:hAnsi="Arial" w:cs="Arial"/>
+                          <w:color w:val="000000" w:themeColor="text1"/>
+                          <w:sz w:val="18"/>
+                          <w:szCs w:val="20"/>
+                          <w:lang w:val="es-ES"/>
+                        </w:rPr>
+                      </w:pPr>
+                      <w:r>
+                        <w:rPr>
+                          <w:rFonts w:ascii="Arial" w:hAnsi="Arial" w:cs="Arial"/>
+                          <w:color w:val="000000" w:themeColor="text1"/>
+                          <w:sz w:val="18"/>
+                          <w:szCs w:val="20"/>
+                          <w:lang w:val="es-ES"/>
+                        </w:rPr>
+                        <w:t>Citation chasing (n = 5)</w:t>
+                      </w:r>
+                    </w:p>
+                  </w:txbxContent>
+                </v:textbox>
+              </v:rect>
+            </w:pict>
+          </mc:Fallback>
+        </mc:AlternateContent>
+      </w:r>
       <w:r>
         <w:rPr>
           <w:noProof/>
@@ -396,7 +973,7 @@
           </mc:Choice>
           <mc:Fallback>
             <w:pict>
-              <v:rect w14:anchorId="65FC63CD" id="Rectangle 1" o:spid="_x0000_s1027" style="position:absolute;margin-left:41.9pt;margin-top:11.05pt;width:148.6pt;height:87.05pt;z-index:251659264;visibility:visible;mso-wrap-style:square;mso-width-percent:0;mso-height-percent:0;mso-wrap-distance-left:9pt;mso-wrap-distance-top:0;mso-wrap-distance-right:9pt;mso-wrap-distance-bottom:0;mso-position-horizontal:absolute;mso-position-horizontal-relative:text;mso-position-vertical:absolute;mso-position-vertical-relative:text;mso-width-percent:0;mso-height-percent:0;mso-width-relative:margin;mso-height-relative:margin;v-text-anchor:middle" o:gfxdata="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" filled="f" strokecolor="black [3213]" strokeweight="1pt">
+              <v:rect w14:anchorId="65FC63CD" id="Rectangle 1" o:spid="_x0000_s1029" style="position:absolute;margin-left:41.9pt;margin-top:11.05pt;width:148.6pt;height:87.05pt;z-index:251659264;visibility:visible;mso-wrap-style:square;mso-width-percent:0;mso-height-percent:0;mso-wrap-distance-left:9pt;mso-wrap-distance-top:0;mso-wrap-distance-right:9pt;mso-wrap-distance-bottom:0;mso-position-horizontal:absolute;mso-position-horizontal-relative:text;mso-position-vertical:absolute;mso-position-vertical-relative:text;mso-width-percent:0;mso-height-percent:0;mso-width-relative:margin;mso-height-relative:margin;v-text-anchor:middle" o:gfxdata="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" filled="f" strokecolor="black [3213]" strokeweight="1pt">
                 <v:textbox>
                   <w:txbxContent>
                     <w:p>
@@ -542,6 +1119,11 @@
       <w:pPr>
         <w:spacing w:after="0" w:line="240" w:lineRule="auto"/>
       </w:pPr>
+    </w:p>
+    <w:p>
+      <w:pPr>
+        <w:spacing w:after="0" w:line="240" w:lineRule="auto"/>
+      </w:pPr>
       <w:r>
         <w:rPr>
           <w:noProof/>
@@ -549,148 +1131,53 @@
         <mc:AlternateContent>
           <mc:Choice Requires="wps">
             <w:drawing>
-              <wp:anchor distT="0" distB="0" distL="114300" distR="114300" simplePos="0" relativeHeight="251661312" behindDoc="0" locked="0" layoutInCell="1" allowOverlap="1" wp14:anchorId="07961AC4" wp14:editId="07EA1A21">
+              <wp:anchor distT="0" distB="0" distL="114300" distR="114300" simplePos="0" relativeHeight="251745280" behindDoc="0" locked="0" layoutInCell="1" allowOverlap="1" wp14:anchorId="105884F5" wp14:editId="2881AFAB">
                 <wp:simplePos x="0" y="0"/>
                 <wp:positionH relativeFrom="column">
-                  <wp:posOffset>3057525</wp:posOffset>
+                  <wp:posOffset>4439457</wp:posOffset>
                 </wp:positionH>
                 <wp:positionV relativeFrom="paragraph">
-                  <wp:posOffset>97155</wp:posOffset>
+                  <wp:posOffset>57144</wp:posOffset>
                 </wp:positionV>
-                <wp:extent cx="3067050" cy="832513"/>
-                <wp:effectExtent l="0" t="0" r="19050" b="24765"/>
+                <wp:extent cx="256151" cy="0"/>
+                <wp:effectExtent l="0" t="76200" r="10795" b="95250"/>
                 <wp:wrapNone/>
-                <wp:docPr id="2" name="Rectangle 2"/>
+                <wp:docPr id="105242678" name="Straight Arrow Connector 14"/>
                 <wp:cNvGraphicFramePr/>
                 <a:graphic xmlns:a="http://schemas.openxmlformats.org/drawingml/2006/main">
                   <a:graphicData uri="http://schemas.microsoft.com/office/word/2010/wordprocessingShape">
                     <wps:wsp>
-                      <wps:cNvSpPr/>
+                      <wps:cNvCnPr/>
                       <wps:spPr>
-                        <a:xfrm>
+                        <a:xfrm flipV="1">
                           <a:off x="0" y="0"/>
-                          <a:ext cx="3067050" cy="832513"/>
+                          <a:ext cx="256151" cy="0"/>
                         </a:xfrm>
-                        <a:prstGeom prst="rect">
+                        <a:prstGeom prst="straightConnector1">
                           <a:avLst/>
                         </a:prstGeom>
-                        <a:noFill/>
                         <a:ln>
                           <a:solidFill>
                             <a:schemeClr val="tx1"/>
                           </a:solidFill>
+                          <a:tailEnd type="triangle"/>
                         </a:ln>
                       </wps:spPr>
                       <wps:style>
-                        <a:lnRef idx="2">
-                          <a:schemeClr val="accent1">
-                            <a:shade val="50000"/>
-                          </a:schemeClr>
+                        <a:lnRef idx="1">
+                          <a:schemeClr val="accent1"/>
                         </a:lnRef>
-                        <a:fillRef idx="1">
+                        <a:fillRef idx="0">
                           <a:schemeClr val="accent1"/>
                         </a:fillRef>
                         <a:effectRef idx="0">
                           <a:schemeClr val="accent1"/>
                         </a:effectRef>
                         <a:fontRef idx="minor">
-                          <a:schemeClr val="lt1"/>
+                          <a:schemeClr val="tx1"/>
                         </a:fontRef>
                       </wps:style>
-                      <wps:txbx>
-                        <w:txbxContent>
-                          <w:p>
-                            <w:pPr>
-                              <w:spacing w:after="0" w:line="240" w:lineRule="auto"/>
-                              <w:ind w:left="142"/>
-                              <w:rPr>
-                                <w:rFonts w:ascii="Arial" w:hAnsi="Arial" w:cs="Arial"/>
-                                <w:color w:val="000000" w:themeColor="text1"/>
-                                <w:sz w:val="18"/>
-                                <w:szCs w:val="20"/>
-                              </w:rPr>
-                            </w:pPr>
-                            <w:r>
-                              <w:rPr>
-                                <w:rFonts w:ascii="Arial" w:hAnsi="Arial" w:cs="Arial"/>
-                                <w:color w:val="000000" w:themeColor="text1"/>
-                                <w:sz w:val="18"/>
-                                <w:szCs w:val="20"/>
-                              </w:rPr>
-                              <w:t>Records removed before screening:</w:t>
-                            </w:r>
-                          </w:p>
-                          <w:p>
-                            <w:pPr>
-                              <w:spacing w:after="0" w:line="240" w:lineRule="auto"/>
-                              <w:ind w:left="142"/>
-                              <w:rPr>
-                                <w:rFonts w:ascii="Arial" w:hAnsi="Arial" w:cs="Arial"/>
-                                <w:color w:val="000000" w:themeColor="text1"/>
-                                <w:sz w:val="18"/>
-                                <w:szCs w:val="20"/>
-                              </w:rPr>
-                            </w:pPr>
-                            <w:r>
-                              <w:rPr>
-                                <w:rFonts w:ascii="Arial" w:hAnsi="Arial" w:cs="Arial"/>
-                                <w:color w:val="000000" w:themeColor="text1"/>
-                                <w:sz w:val="18"/>
-                                <w:szCs w:val="20"/>
-                              </w:rPr>
-                              <w:t xml:space="preserve">  Duplicate records removed (n = 1,002)</w:t>
-                            </w:r>
-                          </w:p>
-                          <w:p>
-                            <w:pPr>
-                              <w:spacing w:after="0" w:line="240" w:lineRule="auto"/>
-                              <w:ind w:left="142"/>
-                              <w:rPr>
-                                <w:rFonts w:ascii="Arial" w:hAnsi="Arial" w:cs="Arial"/>
-                                <w:color w:val="000000" w:themeColor="text1"/>
-                                <w:sz w:val="18"/>
-                                <w:szCs w:val="20"/>
-                              </w:rPr>
-                            </w:pPr>
-                            <w:r>
-                              <w:rPr>
-                                <w:rFonts w:ascii="Arial" w:hAnsi="Arial" w:cs="Arial"/>
-                                <w:color w:val="000000" w:themeColor="text1"/>
-                                <w:sz w:val="18"/>
-                                <w:szCs w:val="20"/>
-                              </w:rPr>
-                              <w:t xml:space="preserve">  Records marked as ineligible by automation tools (n = 0)</w:t>
-                            </w:r>
-                          </w:p>
-                          <w:p>
-                            <w:pPr>
-                              <w:spacing w:after="0" w:line="240" w:lineRule="auto"/>
-                              <w:ind w:left="142"/>
-                              <w:rPr>
-                                <w:rFonts w:ascii="Arial" w:hAnsi="Arial" w:cs="Arial"/>
-                                <w:color w:val="000000" w:themeColor="text1"/>
-                                <w:sz w:val="18"/>
-                                <w:szCs w:val="20"/>
-                              </w:rPr>
-                            </w:pPr>
-                            <w:r>
-                              <w:rPr>
-                                <w:rFonts w:ascii="Arial" w:hAnsi="Arial" w:cs="Arial"/>
-                                <w:color w:val="000000" w:themeColor="text1"/>
-                                <w:sz w:val="18"/>
-                                <w:szCs w:val="20"/>
-                              </w:rPr>
-                              <w:t xml:space="preserve">  Records removed for other reasons (n = 0)</w:t>
-                            </w:r>
-                          </w:p>
-                        </w:txbxContent>
-                      </wps:txbx>
-                      <wps:bodyPr rot="0" spcFirstLastPara="0" vertOverflow="overflow" horzOverflow="overflow" vert="horz" wrap="square" lIns="0" tIns="0" rIns="0" bIns="0" numCol="1" spcCol="0" rtlCol="0" fromWordArt="0" anchor="ctr" anchorCtr="0" forceAA="0" compatLnSpc="1">
-                        <a:prstTxWarp prst="textNoShape">
-                          <a:avLst/>
-                        </a:prstTxWarp>
-                        <a:noAutofit/>
-                      </wps:bodyPr>
+                      <wps:bodyPr/>
                     </wps:wsp>
                   </a:graphicData>
                 </a:graphic>
@@ -705,105 +1192,17 @@
           </mc:Choice>
           <mc:Fallback>
             <w:pict>
-              <v:rect w14:anchorId="07961AC4" id="Rectangle 2" o:spid="_x0000_s1028" style="position:absolute;margin-left:240.75pt;margin-top:7.65pt;width:241.5pt;height:65.55pt;z-index:251661312;visibility:visible;mso-wrap-style:square;mso-width-percent:0;mso-height-percent:0;mso-wrap-distance-left:9pt;mso-wrap-distance-top:0;mso-wrap-distance-right:9pt;mso-wrap-distance-bottom:0;mso-position-horizontal:absolute;mso-position-horizontal-relative:text;mso-position-vertical:absolute;mso-position-vertical-relative:text;mso-width-percent:0;mso-height-percent:0;mso-width-relative:margin;mso-height-relative:margin;v-text-anchor:middle" o:gfxdata="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" filled="f" strokecolor="black [3213]" strokeweight="1pt">
-                <v:textbox inset="0,0,0,0">
-                  <w:txbxContent>
-                    <w:p>
-                      <w:pPr>
-                        <w:spacing w:after="0" w:line="240" w:lineRule="auto"/>
-                        <w:ind w:left="142"/>
-                        <w:rPr>
-                          <w:rFonts w:ascii="Arial" w:hAnsi="Arial" w:cs="Arial"/>
-                          <w:color w:val="000000" w:themeColor="text1"/>
-                          <w:sz w:val="18"/>
-                          <w:szCs w:val="20"/>
-                        </w:rPr>
-                      </w:pPr>
-                      <w:r>
-                        <w:rPr>
-                          <w:rFonts w:ascii="Arial" w:hAnsi="Arial" w:cs="Arial"/>
-                          <w:color w:val="000000" w:themeColor="text1"/>
-                          <w:sz w:val="18"/>
-                          <w:szCs w:val="20"/>
-                        </w:rPr>
-                        <w:t>Records removed before screening:</w:t>
-                      </w:r>
-                    </w:p>
-                    <w:p>
-                      <w:pPr>
-                        <w:spacing w:after="0" w:line="240" w:lineRule="auto"/>
-                        <w:ind w:left="142"/>
-                        <w:rPr>
-                          <w:rFonts w:ascii="Arial" w:hAnsi="Arial" w:cs="Arial"/>
-                          <w:color w:val="000000" w:themeColor="text1"/>
-                          <w:sz w:val="18"/>
-                          <w:szCs w:val="20"/>
-                        </w:rPr>
-                      </w:pPr>
-                      <w:r>
-                        <w:rPr>
-                          <w:rFonts w:ascii="Arial" w:hAnsi="Arial" w:cs="Arial"/>
-                          <w:color w:val="000000" w:themeColor="text1"/>
-                          <w:sz w:val="18"/>
-                          <w:szCs w:val="20"/>
-                        </w:rPr>
-                        <w:t xml:space="preserve">  Duplicate records removed (n = 1,002)</w:t>
-                      </w:r>
-                    </w:p>
-                    <w:p>
-                      <w:pPr>
-                        <w:spacing w:after="0" w:line="240" w:lineRule="auto"/>
-                        <w:ind w:left="142"/>
-                        <w:rPr>
-                          <w:rFonts w:ascii="Arial" w:hAnsi="Arial" w:cs="Arial"/>
-                          <w:color w:val="000000" w:themeColor="text1"/>
-                          <w:sz w:val="18"/>
-                          <w:szCs w:val="20"/>
-                        </w:rPr>
-                      </w:pPr>
-                      <w:r>
-                        <w:rPr>
-                          <w:rFonts w:ascii="Arial" w:hAnsi="Arial" w:cs="Arial"/>
-                          <w:color w:val="000000" w:themeColor="text1"/>
-                          <w:sz w:val="18"/>
-                          <w:szCs w:val="20"/>
-                        </w:rPr>
-                        <w:t xml:space="preserve">  Records marked as ineligible by automation tools (n = 0)</w:t>
-                      </w:r>
-                    </w:p>
-                    <w:p>
-                      <w:pPr>
-                        <w:spacing w:after="0" w:line="240" w:lineRule="auto"/>
-                        <w:ind w:left="142"/>
-                        <w:rPr>
-                          <w:rFonts w:ascii="Arial" w:hAnsi="Arial" w:cs="Arial"/>
-                          <w:color w:val="000000" w:themeColor="text1"/>
-                          <w:sz w:val="18"/>
-                          <w:szCs w:val="20"/>
-                        </w:rPr>
-                      </w:pPr>
-                      <w:r>
-                        <w:rPr>
-                          <w:rFonts w:ascii="Arial" w:hAnsi="Arial" w:cs="Arial"/>
-                          <w:color w:val="000000" w:themeColor="text1"/>
-                          <w:sz w:val="18"/>
-                          <w:szCs w:val="20"/>
-                        </w:rPr>
-                        <w:t xml:space="preserve">  Records removed for other reasons (n = 0)</w:t>
-                      </w:r>
-                    </w:p>
-                  </w:txbxContent>
-                </v:textbox>
-              </v:rect>
+              <v:shapetype w14:anchorId="04F7F8C2" id="_x0000_t32" coordsize="21600,21600" o:spt="32" o:oned="t" path="m,l21600,21600e" filled="f">
+                <v:path arrowok="t" fillok="f" o:connecttype="none"/>
+                <o:lock v:ext="edit" shapetype="t"/>
+              </v:shapetype>
+              <v:shape id="Straight Arrow Connector 14" o:spid="_x0000_s1026" type="#_x0000_t32" style="position:absolute;margin-left:349.55pt;margin-top:4.5pt;width:20.15pt;height:0;flip:y;z-index:251745280;visibility:visible;mso-wrap-style:square;mso-width-percent:0;mso-height-percent:0;mso-wrap-distance-left:9pt;mso-wrap-distance-top:0;mso-wrap-distance-right:9pt;mso-wrap-distance-bottom:0;mso-position-horizontal:absolute;mso-position-horizontal-relative:text;mso-position-vertical:absolute;mso-position-vertical-relative:text;mso-width-percent:0;mso-height-percent:0;mso-width-relative:margin;mso-height-relative:margin" o:gfxdata="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" strokecolor="black [3213]" strokeweight=".5pt">
+                <v:stroke endarrow="block" joinstyle="miter"/>
+              </v:shape>
             </w:pict>
           </mc:Fallback>
         </mc:AlternateContent>
       </w:r>
-    </w:p>
-    <w:p>
-      <w:pPr>
-        <w:spacing w:after="0" w:line="240" w:lineRule="auto"/>
-      </w:pPr>
       <w:r>
         <w:rPr>
           <w:noProof/>
@@ -811,7 +1210,7 @@
         <mc:AlternateContent>
           <mc:Choice Requires="wps">
             <w:drawing>
-              <wp:anchor distT="0" distB="0" distL="114300" distR="114300" simplePos="0" relativeHeight="251701248" behindDoc="0" locked="0" layoutInCell="1" allowOverlap="1" wp14:anchorId="3999D40D" wp14:editId="1EACE2BF">
+              <wp:anchor distT="0" distB="0" distL="114300" distR="114300" simplePos="0" relativeHeight="251701248" behindDoc="0" locked="0" layoutInCell="1" allowOverlap="1" wp14:anchorId="3999D40D" wp14:editId="181AA41B">
                 <wp:simplePos x="0" y="0"/>
                 <wp:positionH relativeFrom="column">
                   <wp:posOffset>-403543</wp:posOffset>
@@ -911,7 +1310,7 @@
           </mc:Choice>
           <mc:Fallback>
             <w:pict>
-              <v:shape w14:anchorId="3999D40D" id="Flowchart: Alternate Process 31" o:spid="_x0000_s1029" type="#_x0000_t176" style="position:absolute;margin-left:-31.8pt;margin-top:17.5pt;width:100.55pt;height:20.7pt;rotation:-90;z-index:251701248;visibility:visible;mso-wrap-style:square;mso-width-percent:0;mso-height-percent:0;mso-wrap-distance-left:9pt;mso-wrap-distance-top:0;mso-wrap-distance-right:9pt;mso-wrap-distance-bottom:0;mso-position-horizontal:absolute;mso-position-horizontal-relative:text;mso-position-vertical:absolute;mso-position-vertical-relative:text;mso-width-percent:0;mso-height-percent:0;mso-width-relative:margin;mso-height-relative:margin;v-text-anchor:middle" o:gfxdata="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" fillcolor="#9cc2e5 [1944]" strokecolor="black [3213]" strokeweight="1pt">
+              <v:shape w14:anchorId="3999D40D" id="Flowchart: Alternate Process 31" o:spid="_x0000_s1030" type="#_x0000_t176" style="position:absolute;margin-left:-31.8pt;margin-top:17.5pt;width:100.55pt;height:20.7pt;rotation:-90;z-index:251701248;visibility:visible;mso-wrap-style:square;mso-width-percent:0;mso-height-percent:0;mso-wrap-distance-left:9pt;mso-wrap-distance-top:0;mso-wrap-distance-right:9pt;mso-wrap-distance-bottom:0;mso-position-horizontal:absolute;mso-position-horizontal-relative:text;mso-position-vertical:absolute;mso-position-vertical-relative:text;mso-width-percent:0;mso-height-percent:0;mso-width-relative:margin;mso-height-relative:margin;v-text-anchor:middle" o:gfxdata="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" fillcolor="#9cc2e5 [1944]" strokecolor="black [3213]" strokeweight="1pt">
                 <v:textbox>
                   <w:txbxContent>
                     <w:p>
@@ -954,6 +1353,11 @@
       <w:pPr>
         <w:spacing w:after="0" w:line="240" w:lineRule="auto"/>
       </w:pPr>
+    </w:p>
+    <w:p>
+      <w:pPr>
+        <w:spacing w:after="0" w:line="240" w:lineRule="auto"/>
+      </w:pPr>
       <w:r>
         <w:rPr>
           <w:noProof/>
@@ -961,16 +1365,278 @@
         <mc:AlternateContent>
           <mc:Choice Requires="wps">
             <w:drawing>
-              <wp:anchor distT="0" distB="0" distL="114300" distR="114300" simplePos="0" relativeHeight="251679744" behindDoc="0" locked="0" layoutInCell="1" allowOverlap="1" wp14:anchorId="17302BD8" wp14:editId="32A218CE">
+              <wp:anchor distT="0" distB="0" distL="114300" distR="114300" simplePos="0" relativeHeight="251661312" behindDoc="0" locked="0" layoutInCell="1" allowOverlap="1" wp14:anchorId="07961AC4" wp14:editId="2FC919A5">
                 <wp:simplePos x="0" y="0"/>
                 <wp:positionH relativeFrom="column">
-                  <wp:posOffset>2415026</wp:posOffset>
+                  <wp:posOffset>3048000</wp:posOffset>
                 </wp:positionH>
                 <wp:positionV relativeFrom="paragraph">
-                  <wp:posOffset>7658</wp:posOffset>
+                  <wp:posOffset>6350</wp:posOffset>
                 </wp:positionV>
-                <wp:extent cx="645129" cy="7947"/>
-                <wp:effectExtent l="0" t="57150" r="41275" b="87630"/>
+                <wp:extent cx="3067050" cy="661035"/>
+                <wp:effectExtent l="0" t="0" r="19050" b="24765"/>
+                <wp:wrapNone/>
+                <wp:docPr id="2" name="Rectangle 2"/>
+                <wp:cNvGraphicFramePr/>
+                <a:graphic xmlns:a="http://schemas.openxmlformats.org/drawingml/2006/main">
+                  <a:graphicData uri="http://schemas.microsoft.com/office/word/2010/wordprocessingShape">
+                    <wps:wsp>
+                      <wps:cNvSpPr/>
+                      <wps:spPr>
+                        <a:xfrm>
+                          <a:off x="0" y="0"/>
+                          <a:ext cx="3067050" cy="661035"/>
+                        </a:xfrm>
+                        <a:prstGeom prst="rect">
+                          <a:avLst/>
+                        </a:prstGeom>
+                        <a:noFill/>
+                        <a:ln>
+                          <a:solidFill>
+                            <a:schemeClr val="tx1"/>
+                          </a:solidFill>
+                        </a:ln>
+                      </wps:spPr>
+                      <wps:style>
+                        <a:lnRef idx="2">
+                          <a:schemeClr val="accent1">
+                            <a:shade val="50000"/>
+                          </a:schemeClr>
+                        </a:lnRef>
+                        <a:fillRef idx="1">
+                          <a:schemeClr val="accent1"/>
+                        </a:fillRef>
+                        <a:effectRef idx="0">
+                          <a:schemeClr val="accent1"/>
+                        </a:effectRef>
+                        <a:fontRef idx="minor">
+                          <a:schemeClr val="lt1"/>
+                        </a:fontRef>
+                      </wps:style>
+                      <wps:txbx>
+                        <w:txbxContent>
+                          <w:p>
+                            <w:pPr>
+                              <w:spacing w:after="0" w:line="240" w:lineRule="auto"/>
+                              <w:ind w:left="142"/>
+                              <w:rPr>
+                                <w:rFonts w:ascii="Arial" w:hAnsi="Arial" w:cs="Arial"/>
+                                <w:color w:val="000000" w:themeColor="text1"/>
+                                <w:sz w:val="18"/>
+                                <w:szCs w:val="20"/>
+                              </w:rPr>
+                            </w:pPr>
+                            <w:r>
+                              <w:rPr>
+                                <w:rFonts w:ascii="Arial" w:hAnsi="Arial" w:cs="Arial"/>
+                                <w:color w:val="000000" w:themeColor="text1"/>
+                                <w:sz w:val="18"/>
+                                <w:szCs w:val="20"/>
+                              </w:rPr>
+                              <w:t>Records removed before screening:</w:t>
+                            </w:r>
+                          </w:p>
+                          <w:p>
+                            <w:pPr>
+                              <w:spacing w:after="0" w:line="240" w:lineRule="auto"/>
+                              <w:ind w:left="142"/>
+                              <w:rPr>
+                                <w:rFonts w:ascii="Arial" w:hAnsi="Arial" w:cs="Arial"/>
+                                <w:color w:val="000000" w:themeColor="text1"/>
+                                <w:sz w:val="18"/>
+                                <w:szCs w:val="20"/>
+                              </w:rPr>
+                            </w:pPr>
+                            <w:r>
+                              <w:rPr>
+                                <w:rFonts w:ascii="Arial" w:hAnsi="Arial" w:cs="Arial"/>
+                                <w:color w:val="000000" w:themeColor="text1"/>
+                                <w:sz w:val="18"/>
+                                <w:szCs w:val="20"/>
+                              </w:rPr>
+                              <w:t xml:space="preserve">  Duplicate records removed (n = 1,002)</w:t>
+                            </w:r>
+                          </w:p>
+                          <w:p>
+                            <w:pPr>
+                              <w:spacing w:after="0" w:line="240" w:lineRule="auto"/>
+                              <w:ind w:left="142"/>
+                              <w:rPr>
+                                <w:rFonts w:ascii="Arial" w:hAnsi="Arial" w:cs="Arial"/>
+                                <w:color w:val="000000" w:themeColor="text1"/>
+                                <w:sz w:val="18"/>
+                                <w:szCs w:val="20"/>
+                              </w:rPr>
+                            </w:pPr>
+                            <w:r>
+                              <w:rPr>
+                                <w:rFonts w:ascii="Arial" w:hAnsi="Arial" w:cs="Arial"/>
+                                <w:color w:val="000000" w:themeColor="text1"/>
+                                <w:sz w:val="18"/>
+                                <w:szCs w:val="20"/>
+                              </w:rPr>
+                              <w:t xml:space="preserve">  Records marked as ineligible by automation tools (n = 0)</w:t>
+                            </w:r>
+                          </w:p>
+                          <w:p>
+                            <w:pPr>
+                              <w:spacing w:after="0" w:line="240" w:lineRule="auto"/>
+                              <w:ind w:left="142"/>
+                              <w:rPr>
+                                <w:rFonts w:ascii="Arial" w:hAnsi="Arial" w:cs="Arial"/>
+                                <w:color w:val="000000" w:themeColor="text1"/>
+                                <w:sz w:val="18"/>
+                                <w:szCs w:val="20"/>
+                              </w:rPr>
+                            </w:pPr>
+                            <w:r>
+                              <w:rPr>
+                                <w:rFonts w:ascii="Arial" w:hAnsi="Arial" w:cs="Arial"/>
+                                <w:color w:val="000000" w:themeColor="text1"/>
+                                <w:sz w:val="18"/>
+                                <w:szCs w:val="20"/>
+                              </w:rPr>
+                              <w:t xml:space="preserve">  Records removed for other reasons (n = 0)</w:t>
+                            </w:r>
+                          </w:p>
+                        </w:txbxContent>
+                      </wps:txbx>
+                      <wps:bodyPr rot="0" spcFirstLastPara="0" vertOverflow="overflow" horzOverflow="overflow" vert="horz" wrap="square" lIns="0" tIns="0" rIns="0" bIns="0" numCol="1" spcCol="0" rtlCol="0" fromWordArt="0" anchor="ctr" anchorCtr="0" forceAA="0" compatLnSpc="1">
+                        <a:prstTxWarp prst="textNoShape">
+                          <a:avLst/>
+                        </a:prstTxWarp>
+                        <a:noAutofit/>
+                      </wps:bodyPr>
+                    </wps:wsp>
+                  </a:graphicData>
+                </a:graphic>
+                <wp14:sizeRelH relativeFrom="margin">
+                  <wp14:pctWidth>0</wp14:pctWidth>
+                </wp14:sizeRelH>
+                <wp14:sizeRelV relativeFrom="margin">
+                  <wp14:pctHeight>0</wp14:pctHeight>
+                </wp14:sizeRelV>
+              </wp:anchor>
+            </w:drawing>
+          </mc:Choice>
+          <mc:Fallback>
+            <w:pict>
+              <v:rect w14:anchorId="07961AC4" id="_x0000_s1031" style="position:absolute;margin-left:240pt;margin-top:.5pt;width:241.5pt;height:52.05pt;z-index:251661312;visibility:visible;mso-wrap-style:square;mso-width-percent:0;mso-height-percent:0;mso-wrap-distance-left:9pt;mso-wrap-distance-top:0;mso-wrap-distance-right:9pt;mso-wrap-distance-bottom:0;mso-position-horizontal:absolute;mso-position-horizontal-relative:text;mso-position-vertical:absolute;mso-position-vertical-relative:text;mso-width-percent:0;mso-height-percent:0;mso-width-relative:margin;mso-height-relative:margin;v-text-anchor:middle" o:gfxdata="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" filled="f" strokecolor="black [3213]" strokeweight="1pt">
+                <v:textbox inset="0,0,0,0">
+                  <w:txbxContent>
+                    <w:p>
+                      <w:pPr>
+                        <w:spacing w:after="0" w:line="240" w:lineRule="auto"/>
+                        <w:ind w:left="142"/>
+                        <w:rPr>
+                          <w:rFonts w:ascii="Arial" w:hAnsi="Arial" w:cs="Arial"/>
+                          <w:color w:val="000000" w:themeColor="text1"/>
+                          <w:sz w:val="18"/>
+                          <w:szCs w:val="20"/>
+                        </w:rPr>
+                      </w:pPr>
+                      <w:r>
+                        <w:rPr>
+                          <w:rFonts w:ascii="Arial" w:hAnsi="Arial" w:cs="Arial"/>
+                          <w:color w:val="000000" w:themeColor="text1"/>
+                          <w:sz w:val="18"/>
+                          <w:szCs w:val="20"/>
+                        </w:rPr>
+                        <w:t>Records removed before screening:</w:t>
+                      </w:r>
+                    </w:p>
+                    <w:p>
+                      <w:pPr>
+                        <w:spacing w:after="0" w:line="240" w:lineRule="auto"/>
+                        <w:ind w:left="142"/>
+                        <w:rPr>
+                          <w:rFonts w:ascii="Arial" w:hAnsi="Arial" w:cs="Arial"/>
+                          <w:color w:val="000000" w:themeColor="text1"/>
+                          <w:sz w:val="18"/>
+                          <w:szCs w:val="20"/>
+                        </w:rPr>
+                      </w:pPr>
+                      <w:r>
+                        <w:rPr>
+                          <w:rFonts w:ascii="Arial" w:hAnsi="Arial" w:cs="Arial"/>
+                          <w:color w:val="000000" w:themeColor="text1"/>
+                          <w:sz w:val="18"/>
+                          <w:szCs w:val="20"/>
+                        </w:rPr>
+                        <w:t xml:space="preserve">  Duplicate records removed (n = 1,002)</w:t>
+                      </w:r>
+                    </w:p>
+                    <w:p>
+                      <w:pPr>
+                        <w:spacing w:after="0" w:line="240" w:lineRule="auto"/>
+                        <w:ind w:left="142"/>
+                        <w:rPr>
+                          <w:rFonts w:ascii="Arial" w:hAnsi="Arial" w:cs="Arial"/>
+                          <w:color w:val="000000" w:themeColor="text1"/>
+                          <w:sz w:val="18"/>
+                          <w:szCs w:val="20"/>
+                        </w:rPr>
+                      </w:pPr>
+                      <w:r>
+                        <w:rPr>
+                          <w:rFonts w:ascii="Arial" w:hAnsi="Arial" w:cs="Arial"/>
+                          <w:color w:val="000000" w:themeColor="text1"/>
+                          <w:sz w:val="18"/>
+                          <w:szCs w:val="20"/>
+                        </w:rPr>
+                        <w:t xml:space="preserve">  Records marked as ineligible by automation tools (n = 0)</w:t>
+                      </w:r>
+                    </w:p>
+                    <w:p>
+                      <w:pPr>
+                        <w:spacing w:after="0" w:line="240" w:lineRule="auto"/>
+                        <w:ind w:left="142"/>
+                        <w:rPr>
+                          <w:rFonts w:ascii="Arial" w:hAnsi="Arial" w:cs="Arial"/>
+                          <w:color w:val="000000" w:themeColor="text1"/>
+                          <w:sz w:val="18"/>
+                          <w:szCs w:val="20"/>
+                        </w:rPr>
+                      </w:pPr>
+                      <w:r>
+                        <w:rPr>
+                          <w:rFonts w:ascii="Arial" w:hAnsi="Arial" w:cs="Arial"/>
+                          <w:color w:val="000000" w:themeColor="text1"/>
+                          <w:sz w:val="18"/>
+                          <w:szCs w:val="20"/>
+                        </w:rPr>
+                        <w:t xml:space="preserve">  Records removed for other reasons (n = 0)</w:t>
+                      </w:r>
+                    </w:p>
+                  </w:txbxContent>
+                </v:textbox>
+              </v:rect>
+            </w:pict>
+          </mc:Fallback>
+        </mc:AlternateContent>
+      </w:r>
+    </w:p>
+    <w:p>
+      <w:pPr>
+        <w:spacing w:after="0" w:line="240" w:lineRule="auto"/>
+      </w:pPr>
+      <w:r>
+        <w:rPr>
+          <w:noProof/>
+        </w:rPr>
+        <mc:AlternateContent>
+          <mc:Choice Requires="wps">
+            <w:drawing>
+              <wp:anchor distT="0" distB="0" distL="114300" distR="114300" simplePos="0" relativeHeight="251679744" behindDoc="0" locked="0" layoutInCell="1" allowOverlap="1" wp14:anchorId="17302BD8" wp14:editId="38D435D3">
+                <wp:simplePos x="0" y="0"/>
+                <wp:positionH relativeFrom="column">
+                  <wp:posOffset>2417365</wp:posOffset>
+                </wp:positionH>
+                <wp:positionV relativeFrom="paragraph">
+                  <wp:posOffset>62552</wp:posOffset>
+                </wp:positionV>
+                <wp:extent cx="625913" cy="3059"/>
+                <wp:effectExtent l="0" t="76200" r="22225" b="92710"/>
                 <wp:wrapNone/>
                 <wp:docPr id="14" name="Straight Arrow Connector 14"/>
                 <wp:cNvGraphicFramePr/>
@@ -979,9 +1645,9 @@
                     <wps:wsp>
                       <wps:cNvCnPr/>
                       <wps:spPr>
-                        <a:xfrm>
+                        <a:xfrm flipV="1">
                           <a:off x="0" y="0"/>
-                          <a:ext cx="645129" cy="7947"/>
+                          <a:ext cx="625913" cy="3059"/>
                         </a:xfrm>
                         <a:prstGeom prst="straightConnector1">
                           <a:avLst/>
@@ -1022,27 +1688,13 @@
           </mc:Choice>
           <mc:Fallback>
             <w:pict>
-              <v:shapetype w14:anchorId="21B59D14" id="_x0000_t32" coordsize="21600,21600" o:spt="32" o:oned="t" path="m,l21600,21600e" filled="f">
-                <v:path arrowok="t" fillok="f" o:connecttype="none"/>
-                <o:lock v:ext="edit" shapetype="t"/>
-              </v:shapetype>
-              <v:shape id="Straight Arrow Connector 14" o:spid="_x0000_s1026" type="#_x0000_t32" style="position:absolute;margin-left:190.15pt;margin-top:.6pt;width:50.8pt;height:.65pt;z-index:251679744;visibility:visible;mso-wrap-style:square;mso-width-percent:0;mso-height-percent:0;mso-wrap-distance-left:9pt;mso-wrap-distance-top:0;mso-wrap-distance-right:9pt;mso-wrap-distance-bottom:0;mso-position-horizontal:absolute;mso-position-horizontal-relative:text;mso-position-vertical:absolute;mso-position-vertical-relative:text;mso-width-percent:0;mso-height-percent:0;mso-width-relative:margin;mso-height-relative:margin" o:gfxdata="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" strokecolor="black [3213]" strokeweight=".5pt">
+              <v:shape w14:anchorId="7211BEE3" id="Straight Arrow Connector 14" o:spid="_x0000_s1026" type="#_x0000_t32" style="position:absolute;margin-left:190.35pt;margin-top:4.95pt;width:49.3pt;height:.25pt;flip:y;z-index:251679744;visibility:visible;mso-wrap-style:square;mso-width-percent:0;mso-height-percent:0;mso-wrap-distance-left:9pt;mso-wrap-distance-top:0;mso-wrap-distance-right:9pt;mso-wrap-distance-bottom:0;mso-position-horizontal:absolute;mso-position-horizontal-relative:text;mso-position-vertical:absolute;mso-position-vertical-relative:text;mso-width-percent:0;mso-height-percent:0;mso-width-relative:margin;mso-height-relative:margin" o:gfxdata="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" strokecolor="black [3213]" strokeweight=".5pt">
                 <v:stroke endarrow="block" joinstyle="miter"/>
               </v:shape>
             </w:pict>
           </mc:Fallback>
         </mc:AlternateContent>
       </w:r>
-    </w:p>
-    <w:p>
-      <w:pPr>
-        <w:spacing w:after="0" w:line="240" w:lineRule="auto"/>
-      </w:pPr>
-    </w:p>
-    <w:p>
-      <w:pPr>
-        <w:spacing w:after="0" w:line="240" w:lineRule="auto"/>
-      </w:pPr>
     </w:p>
     <w:p>
       <w:pPr>
@@ -1116,7 +1768,7 @@
           </mc:Choice>
           <mc:Fallback>
             <w:pict>
-              <v:shape w14:anchorId="5FE5E613" id="Straight Arrow Connector 27" o:spid="_x0000_s1026" type="#_x0000_t32" style="position:absolute;margin-left:110.15pt;margin-top:4pt;width:.25pt;height:28.25pt;z-index:251706368;visibility:visible;mso-wrap-style:square;mso-width-percent:0;mso-height-percent:0;mso-wrap-distance-left:9pt;mso-wrap-distance-top:0;mso-wrap-distance-right:9pt;mso-wrap-distance-bottom:0;mso-position-horizontal:absolute;mso-position-horizontal-relative:text;mso-position-vertical:absolute;mso-position-vertical-relative:text;mso-width-percent:0;mso-height-percent:0;mso-width-relative:margin;mso-height-relative:margin" o:gfxdata="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" strokecolor="black [3213]" strokeweight=".5pt">
+              <v:shape w14:anchorId="6877E486" id="Straight Arrow Connector 27" o:spid="_x0000_s1026" type="#_x0000_t32" style="position:absolute;margin-left:110.15pt;margin-top:4pt;width:.25pt;height:28.25pt;z-index:251706368;visibility:visible;mso-wrap-style:square;mso-width-percent:0;mso-height-percent:0;mso-wrap-distance-left:9pt;mso-wrap-distance-top:0;mso-wrap-distance-right:9pt;mso-wrap-distance-bottom:0;mso-position-horizontal:absolute;mso-position-horizontal-relative:text;mso-position-vertical:absolute;mso-position-vertical-relative:text;mso-width-percent:0;mso-height-percent:0;mso-width-relative:margin;mso-height-relative:margin" o:gfxdata="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" strokecolor="black [3213]" strokeweight=".5pt">
                 <v:stroke endarrow="block" joinstyle="miter"/>
               </v:shape>
             </w:pict>
@@ -1315,7 +1967,7 @@
           </mc:Choice>
           <mc:Fallback>
             <w:pict>
-              <v:rect w14:anchorId="4FF0996A" id="Rectangle 4" o:spid="_x0000_s1030" style="position:absolute;margin-left:238.75pt;margin-top:5.2pt;width:148.6pt;height:31.35pt;z-index:251665408;visibility:visible;mso-wrap-style:square;mso-width-percent:0;mso-height-percent:0;mso-wrap-distance-left:9pt;mso-wrap-distance-top:0;mso-wrap-distance-right:9pt;mso-wrap-distance-bottom:0;mso-position-horizontal:absolute;mso-position-horizontal-relative:text;mso-position-vertical:absolute;mso-position-vertical-relative:text;mso-width-percent:0;mso-height-percent:0;mso-width-relative:margin;mso-height-relative:margin;v-text-anchor:middle" o:gfxdata="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" filled="f" strokecolor="black [3213]" strokeweight="1pt">
+              <v:rect w14:anchorId="4FF0996A" id="Rectangle 4" o:spid="_x0000_s1032" style="position:absolute;margin-left:238.75pt;margin-top:5.2pt;width:148.6pt;height:31.35pt;z-index:251665408;visibility:visible;mso-wrap-style:square;mso-width-percent:0;mso-height-percent:0;mso-wrap-distance-left:9pt;mso-wrap-distance-top:0;mso-wrap-distance-right:9pt;mso-wrap-distance-bottom:0;mso-position-horizontal:absolute;mso-position-horizontal-relative:text;mso-position-vertical:absolute;mso-position-vertical-relative:text;mso-width-percent:0;mso-height-percent:0;mso-width-relative:margin;mso-height-relative:margin;v-text-anchor:middle" o:gfxdata="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" filled="f" strokecolor="black [3213]" strokeweight="1pt">
                 <v:textbox>
                   <w:txbxContent>
                     <w:p>
@@ -1547,7 +2199,7 @@
           </mc:Choice>
           <mc:Fallback>
             <w:pict>
-              <v:rect w14:anchorId="4C37AEA5" id="Rectangle 3" o:spid="_x0000_s1031" style="position:absolute;margin-left:43.95pt;margin-top:6.1pt;width:148.6pt;height:30.5pt;z-index:251663360;visibility:visible;mso-wrap-style:square;mso-width-percent:0;mso-height-percent:0;mso-wrap-distance-left:9pt;mso-wrap-distance-top:0;mso-wrap-distance-right:9pt;mso-wrap-distance-bottom:0;mso-position-horizontal:absolute;mso-position-horizontal-relative:text;mso-position-vertical:absolute;mso-position-vertical-relative:text;mso-width-percent:0;mso-height-percent:0;mso-width-relative:margin;mso-height-relative:margin;v-text-anchor:middle" o:gfxdata="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" filled="f" strokecolor="black [3213]" strokeweight="1pt">
+              <v:rect w14:anchorId="4C37AEA5" id="Rectangle 3" o:spid="_x0000_s1033" style="position:absolute;margin-left:43.95pt;margin-top:6.1pt;width:148.6pt;height:30.5pt;z-index:251663360;visibility:visible;mso-wrap-style:square;mso-width-percent:0;mso-height-percent:0;mso-wrap-distance-left:9pt;mso-wrap-distance-top:0;mso-wrap-distance-right:9pt;mso-wrap-distance-bottom:0;mso-position-horizontal:absolute;mso-position-horizontal-relative:text;mso-position-vertical:absolute;mso-position-vertical-relative:text;mso-width-percent:0;mso-height-percent:0;mso-width-relative:margin;mso-height-relative:margin;v-text-anchor:middle" o:gfxdata="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" filled="f" strokecolor="black [3213]" strokeweight="1pt">
                 <v:textbox>
                   <w:txbxContent>
                     <w:p>
@@ -1659,11 +2311,7 @@
           </mc:Choice>
           <mc:Fallback>
             <w:pict>
-              <v:shapetype w14:anchorId="01EC024C" id="_x0000_t32" coordsize="21600,21600" o:spt="32" o:oned="t" path="m,l21600,21600e" filled="f">
-                <v:path arrowok="t" fillok="f" o:connecttype="none"/>
-                <o:lock v:ext="edit" shapetype="t"/>
-              </v:shapetype>
-              <v:shape id="Straight Arrow Connector 15" o:spid="_x0000_s1026" type="#_x0000_t32" style="position:absolute;margin-left:193.2pt;margin-top:25.85pt;width:44.35pt;height:0;z-index:251681792;visibility:visible;mso-wrap-style:square;mso-wrap-distance-left:9pt;mso-wrap-distance-top:0;mso-wrap-distance-right:9pt;mso-wrap-distance-bottom:0;mso-position-horizontal:absolute;mso-position-horizontal-relative:text;mso-position-vertical:absolute;mso-position-vertical-relative:text" o:gfxdata="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" strokecolor="black [3213]" strokeweight=".5pt">
+              <v:shape w14:anchorId="3DC9F395" id="Straight Arrow Connector 15" o:spid="_x0000_s1026" type="#_x0000_t32" style="position:absolute;margin-left:193.2pt;margin-top:25.85pt;width:44.35pt;height:0;z-index:251681792;visibility:visible;mso-wrap-style:square;mso-wrap-distance-left:9pt;mso-wrap-distance-top:0;mso-wrap-distance-right:9pt;mso-wrap-distance-bottom:0;mso-position-horizontal:absolute;mso-position-horizontal-relative:text;mso-position-vertical:absolute;mso-position-vertical-relative:text" o:gfxdata="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" strokecolor="black [3213]" strokeweight=".5pt">
                 <v:stroke endarrow="block" joinstyle="miter"/>
               </v:shape>
             </w:pict>
@@ -1748,7 +2396,7 @@
           </mc:Choice>
           <mc:Fallback>
             <w:pict>
-              <v:shape w14:anchorId="3A8AAE8D" id="Straight Arrow Connector 27" o:spid="_x0000_s1026" type="#_x0000_t32" style="position:absolute;margin-left:111.15pt;margin-top:10.15pt;width:.25pt;height:16.8pt;z-index:251724800;visibility:visible;mso-wrap-style:square;mso-width-percent:0;mso-height-percent:0;mso-wrap-distance-left:9pt;mso-wrap-distance-top:0;mso-wrap-distance-right:9pt;mso-wrap-distance-bottom:0;mso-position-horizontal:absolute;mso-position-horizontal-relative:text;mso-position-vertical:absolute;mso-position-vertical-relative:text;mso-width-percent:0;mso-height-percent:0;mso-width-relative:margin;mso-height-relative:margin" o:gfxdata="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" strokecolor="black [3213]" strokeweight=".5pt">
+              <v:shape w14:anchorId="49E0AC95" id="Straight Arrow Connector 27" o:spid="_x0000_s1026" type="#_x0000_t32" style="position:absolute;margin-left:111.15pt;margin-top:10.15pt;width:.25pt;height:16.8pt;z-index:251724800;visibility:visible;mso-wrap-style:square;mso-width-percent:0;mso-height-percent:0;mso-wrap-distance-left:9pt;mso-wrap-distance-top:0;mso-wrap-distance-right:9pt;mso-wrap-distance-bottom:0;mso-position-horizontal:absolute;mso-position-horizontal-relative:text;mso-position-vertical:absolute;mso-position-vertical-relative:text;mso-width-percent:0;mso-height-percent:0;mso-width-relative:margin;mso-height-relative:margin" o:gfxdata="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" strokecolor="black [3213]" strokeweight=".5pt">
                 <v:stroke endarrow="block" joinstyle="miter"/>
               </v:shape>
             </w:pict>
@@ -1879,7 +2527,7 @@
           </mc:Choice>
           <mc:Fallback>
             <w:pict>
-              <v:rect w14:anchorId="1C9EC9A9" id="_x0000_s1032" style="position:absolute;margin-left:238.3pt;margin-top:3.15pt;width:148.6pt;height:31.3pt;z-index:251718656;visibility:visible;mso-wrap-style:square;mso-width-percent:0;mso-height-percent:0;mso-wrap-distance-left:9pt;mso-wrap-distance-top:0;mso-wrap-distance-right:9pt;mso-wrap-distance-bottom:0;mso-position-horizontal:absolute;mso-position-horizontal-relative:text;mso-position-vertical:absolute;mso-position-vertical-relative:text;mso-width-percent:0;mso-height-percent:0;mso-width-relative:margin;mso-height-relative:margin;v-text-anchor:middle" o:gfxdata="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" filled="f" strokecolor="black [3213]" strokeweight="1pt">
+              <v:rect w14:anchorId="1C9EC9A9" id="_x0000_s1034" style="position:absolute;margin-left:238.3pt;margin-top:3.15pt;width:148.6pt;height:31.3pt;z-index:251718656;visibility:visible;mso-wrap-style:square;mso-width-percent:0;mso-height-percent:0;mso-wrap-distance-left:9pt;mso-wrap-distance-top:0;mso-wrap-distance-right:9pt;mso-wrap-distance-bottom:0;mso-position-horizontal:absolute;mso-position-horizontal-relative:text;mso-position-vertical:absolute;mso-position-vertical-relative:text;mso-width-percent:0;mso-height-percent:0;mso-width-relative:margin;mso-height-relative:margin;v-text-anchor:middle" o:gfxdata="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" filled="f" strokecolor="black [3213]" strokeweight="1pt">
                 <v:textbox>
                   <w:txbxContent>
                     <w:p>
@@ -2053,7 +2701,7 @@
           </mc:Choice>
           <mc:Fallback>
             <w:pict>
-              <v:rect w14:anchorId="50319335" id="_x0000_s1033" style="position:absolute;margin-left:45.5pt;margin-top:.55pt;width:148.6pt;height:30.5pt;z-index:251714560;visibility:visible;mso-wrap-style:square;mso-width-percent:0;mso-height-percent:0;mso-wrap-distance-left:9pt;mso-wrap-distance-top:0;mso-wrap-distance-right:9pt;mso-wrap-distance-bottom:0;mso-position-horizontal:absolute;mso-position-horizontal-relative:text;mso-position-vertical:absolute;mso-position-vertical-relative:text;mso-width-percent:0;mso-height-percent:0;mso-width-relative:margin;mso-height-relative:margin;v-text-anchor:middle" o:gfxdata="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" filled="f" strokecolor="black [3213]" strokeweight="1pt">
+              <v:rect w14:anchorId="50319335" id="_x0000_s1035" style="position:absolute;margin-left:45.5pt;margin-top:.55pt;width:148.6pt;height:30.5pt;z-index:251714560;visibility:visible;mso-wrap-style:square;mso-width-percent:0;mso-height-percent:0;mso-wrap-distance-left:9pt;mso-wrap-distance-top:0;mso-wrap-distance-right:9pt;mso-wrap-distance-bottom:0;mso-position-horizontal:absolute;mso-position-horizontal-relative:text;mso-position-vertical:absolute;mso-position-vertical-relative:text;mso-width-percent:0;mso-height-percent:0;mso-width-relative:margin;mso-height-relative:margin;v-text-anchor:middle" o:gfxdata="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" filled="f" strokecolor="black [3213]" strokeweight="1pt">
                 <v:textbox>
                   <w:txbxContent>
                     <w:p>
@@ -2170,7 +2818,7 @@
           </mc:Choice>
           <mc:Fallback>
             <w:pict>
-              <v:shape w14:anchorId="0D871FAD" id="Straight Arrow Connector 15" o:spid="_x0000_s1026" type="#_x0000_t32" style="position:absolute;margin-left:193.95pt;margin-top:1.95pt;width:44.35pt;height:0;z-index:251720704;visibility:visible;mso-wrap-style:square;mso-wrap-distance-left:9pt;mso-wrap-distance-top:0;mso-wrap-distance-right:9pt;mso-wrap-distance-bottom:0;mso-position-horizontal:absolute;mso-position-horizontal-relative:text;mso-position-vertical:absolute;mso-position-vertical-relative:text" o:gfxdata="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" strokecolor="black [3213]" strokeweight=".5pt">
+              <v:shape w14:anchorId="3D364D5D" id="Straight Arrow Connector 15" o:spid="_x0000_s1026" type="#_x0000_t32" style="position:absolute;margin-left:193.95pt;margin-top:1.95pt;width:44.35pt;height:0;z-index:251720704;visibility:visible;mso-wrap-style:square;mso-wrap-distance-left:9pt;mso-wrap-distance-top:0;mso-wrap-distance-right:9pt;mso-wrap-distance-bottom:0;mso-position-horizontal:absolute;mso-position-horizontal-relative:text;mso-position-vertical:absolute;mso-position-vertical-relative:text" o:gfxdata="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" strokecolor="black [3213]" strokeweight=".5pt">
                 <v:stroke endarrow="block" joinstyle="miter"/>
               </v:shape>
             </w:pict>
@@ -2189,16 +2837,16 @@
         <mc:AlternateContent>
           <mc:Choice Requires="wps">
             <w:drawing>
-              <wp:anchor distT="0" distB="0" distL="114300" distR="114300" simplePos="0" relativeHeight="251671552" behindDoc="0" locked="0" layoutInCell="1" allowOverlap="1" wp14:anchorId="0A6784D8" wp14:editId="44CF8A3C">
+              <wp:anchor distT="0" distB="0" distL="114300" distR="114300" simplePos="0" relativeHeight="251671552" behindDoc="0" locked="0" layoutInCell="1" allowOverlap="1" wp14:anchorId="0A6784D8" wp14:editId="322F8EFB">
                 <wp:simplePos x="0" y="0"/>
                 <wp:positionH relativeFrom="column">
-                  <wp:posOffset>3022600</wp:posOffset>
+                  <wp:posOffset>3019245</wp:posOffset>
                 </wp:positionH>
                 <wp:positionV relativeFrom="paragraph">
-                  <wp:posOffset>15240</wp:posOffset>
+                  <wp:posOffset>10747</wp:posOffset>
                 </wp:positionV>
-                <wp:extent cx="2953385" cy="925195"/>
-                <wp:effectExtent l="0" t="0" r="18415" b="27305"/>
+                <wp:extent cx="2751827" cy="925195"/>
+                <wp:effectExtent l="0" t="0" r="10795" b="27305"/>
                 <wp:wrapNone/>
                 <wp:docPr id="9" name="Rectangle 9"/>
                 <wp:cNvGraphicFramePr/>
@@ -2209,7 +2857,7 @@
                       <wps:spPr>
                         <a:xfrm>
                           <a:off x="0" y="0"/>
-                          <a:ext cx="2953385" cy="925195"/>
+                          <a:ext cx="2751827" cy="925195"/>
                         </a:xfrm>
                         <a:prstGeom prst="rect">
                           <a:avLst/>
@@ -2395,7 +3043,7 @@
           </mc:Choice>
           <mc:Fallback>
             <w:pict>
-              <v:rect w14:anchorId="0A6784D8" id="Rectangle 9" o:spid="_x0000_s1034" style="position:absolute;margin-left:238pt;margin-top:1.2pt;width:232.55pt;height:72.85pt;z-index:251671552;visibility:visible;mso-wrap-style:square;mso-width-percent:0;mso-height-percent:0;mso-wrap-distance-left:9pt;mso-wrap-distance-top:0;mso-wrap-distance-right:9pt;mso-wrap-distance-bottom:0;mso-position-horizontal:absolute;mso-position-horizontal-relative:text;mso-position-vertical:absolute;mso-position-vertical-relative:text;mso-width-percent:0;mso-height-percent:0;mso-width-relative:margin;mso-height-relative:margin;v-text-anchor:middle" o:gfxdata="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" filled="f" strokecolor="black [3213]" strokeweight="1pt">
+              <v:rect w14:anchorId="0A6784D8" id="Rectangle 9" o:spid="_x0000_s1036" style="position:absolute;margin-left:237.75pt;margin-top:.85pt;width:216.7pt;height:72.85pt;z-index:251671552;visibility:visible;mso-wrap-style:square;mso-width-percent:0;mso-height-percent:0;mso-wrap-distance-left:9pt;mso-wrap-distance-top:0;mso-wrap-distance-right:9pt;mso-wrap-distance-bottom:0;mso-position-horizontal:absolute;mso-position-horizontal-relative:text;mso-position-vertical:absolute;mso-position-vertical-relative:text;mso-width-percent:0;mso-height-percent:0;mso-width-relative:margin;mso-height-relative:margin;v-text-anchor:middle" o:gfxdata="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" filled="f" strokecolor="black [3213]" strokeweight="1pt">
                 <v:textbox inset="0,0,0,0">
                   <w:txbxContent>
                     <w:p>
@@ -2607,7 +3255,7 @@
           </mc:Choice>
           <mc:Fallback>
             <w:pict>
-              <v:shape w14:anchorId="782F80CD" id="Straight Arrow Connector 27" o:spid="_x0000_s1026" type="#_x0000_t32" style="position:absolute;margin-left:112.45pt;margin-top:4.6pt;width:.2pt;height:19.9pt;z-index:251726848;visibility:visible;mso-wrap-style:square;mso-width-percent:0;mso-height-percent:0;mso-wrap-distance-left:9pt;mso-wrap-distance-top:0;mso-wrap-distance-right:9pt;mso-wrap-distance-bottom:0;mso-position-horizontal:absolute;mso-position-horizontal-relative:text;mso-position-vertical:absolute;mso-position-vertical-relative:text;mso-width-percent:0;mso-height-percent:0;mso-width-relative:margin;mso-height-relative:margin" o:gfxdata="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" strokecolor="black [3213]" strokeweight=".5pt">
+              <v:shape w14:anchorId="6A498B93" id="Straight Arrow Connector 27" o:spid="_x0000_s1026" type="#_x0000_t32" style="position:absolute;margin-left:112.45pt;margin-top:4.6pt;width:.2pt;height:19.9pt;z-index:251726848;visibility:visible;mso-wrap-style:square;mso-width-percent:0;mso-height-percent:0;mso-wrap-distance-left:9pt;mso-wrap-distance-top:0;mso-wrap-distance-right:9pt;mso-wrap-distance-bottom:0;mso-position-horizontal:absolute;mso-position-horizontal-relative:text;mso-position-vertical:absolute;mso-position-vertical-relative:text;mso-width-percent:0;mso-height-percent:0;mso-width-relative:margin;mso-height-relative:margin" o:gfxdata="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" strokecolor="black [3213]" strokeweight=".5pt">
                 <v:stroke endarrow="block" joinstyle="miter"/>
               </v:shape>
             </w:pict>
@@ -2738,7 +3386,7 @@
           </mc:Choice>
           <mc:Fallback>
             <w:pict>
-              <v:rect w14:anchorId="66893C3B" id="_x0000_s1035" style="position:absolute;margin-left:45.45pt;margin-top:11.05pt;width:148.6pt;height:30.5pt;z-index:251716608;visibility:visible;mso-wrap-style:square;mso-width-percent:0;mso-height-percent:0;mso-wrap-distance-left:9pt;mso-wrap-distance-top:0;mso-wrap-distance-right:9pt;mso-wrap-distance-bottom:0;mso-position-horizontal:absolute;mso-position-horizontal-relative:text;mso-position-vertical:absolute;mso-position-vertical-relative:text;mso-width-percent:0;mso-height-percent:0;mso-width-relative:margin;mso-height-relative:margin;v-text-anchor:middle" o:gfxdata="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" filled="f" strokecolor="black [3213]" strokeweight="1pt">
+              <v:rect w14:anchorId="66893C3B" id="_x0000_s1037" style="position:absolute;margin-left:45.45pt;margin-top:11.05pt;width:148.6pt;height:30.5pt;z-index:251716608;visibility:visible;mso-wrap-style:square;mso-width-percent:0;mso-height-percent:0;mso-wrap-distance-left:9pt;mso-wrap-distance-top:0;mso-wrap-distance-right:9pt;mso-wrap-distance-bottom:0;mso-position-horizontal:absolute;mso-position-horizontal-relative:text;mso-position-vertical:absolute;mso-position-vertical-relative:text;mso-width-percent:0;mso-height-percent:0;mso-width-relative:margin;mso-height-relative:margin;v-text-anchor:middle" o:gfxdata="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" filled="f" strokecolor="black [3213]" strokeweight="1pt">
                 <v:textbox>
                   <w:txbxContent>
                     <w:p>
@@ -2912,7 +3560,7 @@
           </mc:Choice>
           <mc:Fallback>
             <w:pict>
-              <v:shape w14:anchorId="057AAEFF" id="Flowchart: Alternate Process 32" o:spid="_x0000_s1036" type="#_x0000_t176" style="position:absolute;margin-left:-113pt;margin-top:15.35pt;width:262.8pt;height:20.7pt;rotation:-90;z-index:251703296;visibility:visible;mso-wrap-style:square;mso-width-percent:0;mso-height-percent:0;mso-wrap-distance-left:9pt;mso-wrap-distance-top:0;mso-wrap-distance-right:9pt;mso-wrap-distance-bottom:0;mso-position-horizontal:absolute;mso-position-horizontal-relative:text;mso-position-vertical:absolute;mso-position-vertical-relative:text;mso-width-percent:0;mso-height-percent:0;mso-width-relative:margin;mso-height-relative:margin;v-text-anchor:middle" o:gfxdata="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" fillcolor="#9cc2e5 [1944]" strokecolor="black [3213]" strokeweight="1pt">
+              <v:shape w14:anchorId="057AAEFF" id="Flowchart: Alternate Process 32" o:spid="_x0000_s1038" type="#_x0000_t176" style="position:absolute;margin-left:-113pt;margin-top:15.35pt;width:262.8pt;height:20.7pt;rotation:-90;z-index:251703296;visibility:visible;mso-wrap-style:square;mso-width-percent:0;mso-height-percent:0;mso-wrap-distance-left:9pt;mso-wrap-distance-top:0;mso-wrap-distance-right:9pt;mso-wrap-distance-bottom:0;mso-position-horizontal:absolute;mso-position-horizontal-relative:text;mso-position-vertical:absolute;mso-position-vertical-relative:text;mso-width-percent:0;mso-height-percent:0;mso-width-relative:margin;mso-height-relative:margin;v-text-anchor:middle" o:gfxdata="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" fillcolor="#9cc2e5 [1944]" strokecolor="black [3213]" strokeweight="1pt">
                 <v:textbox>
                   <w:txbxContent>
                     <w:p>
@@ -3019,11 +3667,7 @@
           </mc:Choice>
           <mc:Fallback>
             <w:pict>
-              <v:shapetype w14:anchorId="2CC5C3C1" id="_x0000_t32" coordsize="21600,21600" o:spt="32" o:oned="t" path="m,l21600,21600e" filled="f">
-                <v:path arrowok="t" fillok="f" o:connecttype="none"/>
-                <o:lock v:ext="edit" shapetype="t"/>
-              </v:shapetype>
-              <v:shape id="Straight Arrow Connector 15" o:spid="_x0000_s1026" type="#_x0000_t32" style="position:absolute;margin-left:194.45pt;margin-top:12.5pt;width:44.35pt;height:0;z-index:251728896;visibility:visible;mso-wrap-style:square;mso-wrap-distance-left:9pt;mso-wrap-distance-top:0;mso-wrap-distance-right:9pt;mso-wrap-distance-bottom:0;mso-position-horizontal:absolute;mso-position-horizontal-relative:text;mso-position-vertical:absolute;mso-position-vertical-relative:text" o:gfxdata="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" strokecolor="black [3213]" strokeweight=".5pt">
+              <v:shape w14:anchorId="09CA7DC8" id="Straight Arrow Connector 15" o:spid="_x0000_s1026" type="#_x0000_t32" style="position:absolute;margin-left:194.45pt;margin-top:12.5pt;width:44.35pt;height:0;z-index:251728896;visibility:visible;mso-wrap-style:square;mso-wrap-distance-left:9pt;mso-wrap-distance-top:0;mso-wrap-distance-right:9pt;mso-wrap-distance-bottom:0;mso-position-horizontal:absolute;mso-position-horizontal-relative:text;mso-position-vertical:absolute;mso-position-vertical-relative:text" o:gfxdata="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" strokecolor="black [3213]" strokeweight=".5pt">
                 <v:stroke endarrow="block" joinstyle="miter"/>
               </v:shape>
             </w:pict>
@@ -3108,7 +3752,7 @@
           </mc:Choice>
           <mc:Fallback>
             <w:pict>
-              <v:shape w14:anchorId="695A3B21" id="Straight Arrow Connector 27" o:spid="_x0000_s1026" type="#_x0000_t32" style="position:absolute;margin-left:113.5pt;margin-top:2.15pt;width:.2pt;height:19.9pt;z-index:251732992;visibility:visible;mso-wrap-style:square;mso-width-percent:0;mso-height-percent:0;mso-wrap-distance-left:9pt;mso-wrap-distance-top:0;mso-wrap-distance-right:9pt;mso-wrap-distance-bottom:0;mso-position-horizontal:absolute;mso-position-horizontal-relative:text;mso-position-vertical:absolute;mso-position-vertical-relative:text;mso-width-percent:0;mso-height-percent:0;mso-width-relative:margin;mso-height-relative:margin" o:gfxdata="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" strokecolor="black [3213]" strokeweight=".5pt">
+              <v:shape w14:anchorId="0C923005" id="Straight Arrow Connector 27" o:spid="_x0000_s1026" type="#_x0000_t32" style="position:absolute;margin-left:113.5pt;margin-top:2.15pt;width:.2pt;height:19.9pt;z-index:251732992;visibility:visible;mso-wrap-style:square;mso-width-percent:0;mso-height-percent:0;mso-wrap-distance-left:9pt;mso-wrap-distance-top:0;mso-wrap-distance-right:9pt;mso-wrap-distance-bottom:0;mso-position-horizontal:absolute;mso-position-horizontal-relative:text;mso-position-vertical:absolute;mso-position-vertical-relative:text;mso-width-percent:0;mso-height-percent:0;mso-width-relative:margin;mso-height-relative:margin" o:gfxdata="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" strokecolor="black [3213]" strokeweight=".5pt">
                 <v:stroke endarrow="block" joinstyle="miter"/>
               </v:shape>
             </w:pict>
@@ -3194,25 +3838,7 @@
                                 <w:sz w:val="18"/>
                                 <w:szCs w:val="20"/>
                               </w:rPr>
-                              <w:t>Reports meeting formal inclusion criteria</w:t>
-                            </w:r>
-                            <w:r>
-                              <w:rPr>
-                                <w:rFonts w:ascii="Arial" w:hAnsi="Arial" w:cs="Arial"/>
-                                <w:color w:val="000000" w:themeColor="text1"/>
-                                <w:sz w:val="18"/>
-                                <w:szCs w:val="20"/>
-                              </w:rPr>
-                              <w:t xml:space="preserve"> </w:t>
-                            </w:r>
-                            <w:r>
-                              <w:rPr>
-                                <w:rFonts w:ascii="Arial" w:hAnsi="Arial" w:cs="Arial"/>
-                                <w:color w:val="000000" w:themeColor="text1"/>
-                                <w:sz w:val="18"/>
-                                <w:szCs w:val="20"/>
-                              </w:rPr>
-                              <w:t>(n = 34)</w:t>
+                              <w:t>Reports passing full-text screening (n = 34)</w:t>
                             </w:r>
                           </w:p>
                         </w:txbxContent>
@@ -3237,7 +3863,7 @@
           </mc:Choice>
           <mc:Fallback>
             <w:pict>
-              <v:rect w14:anchorId="256BB765" id="Rectangle 8" o:spid="_x0000_s1037" style="position:absolute;margin-left:43.55pt;margin-top:9.25pt;width:151.9pt;height:36.3pt;z-index:251670528;visibility:visible;mso-wrap-style:square;mso-width-percent:0;mso-height-percent:0;mso-wrap-distance-left:9pt;mso-wrap-distance-top:0;mso-wrap-distance-right:9pt;mso-wrap-distance-bottom:0;mso-position-horizontal:absolute;mso-position-horizontal-relative:text;mso-position-vertical:absolute;mso-position-vertical-relative:text;mso-width-percent:0;mso-height-percent:0;mso-width-relative:margin;mso-height-relative:margin;v-text-anchor:middle" o:gfxdata="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" filled="f" strokecolor="black [3213]" strokeweight="1pt">
+              <v:rect w14:anchorId="256BB765" id="Rectangle 8" o:spid="_x0000_s1039" style="position:absolute;margin-left:43.55pt;margin-top:9.25pt;width:151.9pt;height:36.3pt;z-index:251670528;visibility:visible;mso-wrap-style:square;mso-width-percent:0;mso-height-percent:0;mso-wrap-distance-left:9pt;mso-wrap-distance-top:0;mso-wrap-distance-right:9pt;mso-wrap-distance-bottom:0;mso-position-horizontal:absolute;mso-position-horizontal-relative:text;mso-position-vertical:absolute;mso-position-vertical-relative:text;mso-width-percent:0;mso-height-percent:0;mso-width-relative:margin;mso-height-relative:margin;v-text-anchor:middle" o:gfxdata="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" filled="f" strokecolor="black [3213]" strokeweight="1pt">
                 <v:textbox>
                   <w:txbxContent>
                     <w:p>
@@ -3257,25 +3883,7 @@
                           <w:sz w:val="18"/>
                           <w:szCs w:val="20"/>
                         </w:rPr>
-                        <w:t>Reports meeting formal inclusion criteria</w:t>
-                      </w:r>
-                      <w:r>
-                        <w:rPr>
-                          <w:rFonts w:ascii="Arial" w:hAnsi="Arial" w:cs="Arial"/>
-                          <w:color w:val="000000" w:themeColor="text1"/>
-                          <w:sz w:val="18"/>
-                          <w:szCs w:val="20"/>
-                        </w:rPr>
-                        <w:t xml:space="preserve"> </w:t>
-                      </w:r>
-                      <w:r>
-                        <w:rPr>
-                          <w:rFonts w:ascii="Arial" w:hAnsi="Arial" w:cs="Arial"/>
-                          <w:color w:val="000000" w:themeColor="text1"/>
-                          <w:sz w:val="18"/>
-                          <w:szCs w:val="20"/>
-                        </w:rPr>
-                        <w:t>(n = 34)</w:t>
+                        <w:t>Reports passing full-text screening (n = 34)</w:t>
                       </w:r>
                     </w:p>
                   </w:txbxContent>
@@ -3297,7 +3905,342 @@
         <mc:AlternateContent>
           <mc:Choice Requires="wps">
             <w:drawing>
-              <wp:anchor distT="0" distB="0" distL="114300" distR="114300" simplePos="0" relativeHeight="251685888" behindDoc="0" locked="0" layoutInCell="1" allowOverlap="1" wp14:anchorId="2DFD1A2A" wp14:editId="563CA05D">
+              <wp:anchor distT="0" distB="0" distL="114300" distR="114300" simplePos="0" relativeHeight="251722752" behindDoc="0" locked="0" layoutInCell="1" allowOverlap="1" wp14:anchorId="73CCC501" wp14:editId="6BE4F365">
+                <wp:simplePos x="0" y="0"/>
+                <wp:positionH relativeFrom="column">
+                  <wp:posOffset>3045126</wp:posOffset>
+                </wp:positionH>
+                <wp:positionV relativeFrom="paragraph">
+                  <wp:posOffset>5679</wp:posOffset>
+                </wp:positionV>
+                <wp:extent cx="2009954" cy="802005"/>
+                <wp:effectExtent l="0" t="0" r="28575" b="17145"/>
+                <wp:wrapNone/>
+                <wp:docPr id="113304601" name="Rectangle 9"/>
+                <wp:cNvGraphicFramePr/>
+                <a:graphic xmlns:a="http://schemas.openxmlformats.org/drawingml/2006/main">
+                  <a:graphicData uri="http://schemas.microsoft.com/office/word/2010/wordprocessingShape">
+                    <wps:wsp>
+                      <wps:cNvSpPr/>
+                      <wps:spPr>
+                        <a:xfrm>
+                          <a:off x="0" y="0"/>
+                          <a:ext cx="2009954" cy="802005"/>
+                        </a:xfrm>
+                        <a:prstGeom prst="rect">
+                          <a:avLst/>
+                        </a:prstGeom>
+                        <a:noFill/>
+                        <a:ln>
+                          <a:solidFill>
+                            <a:schemeClr val="tx1"/>
+                          </a:solidFill>
+                        </a:ln>
+                      </wps:spPr>
+                      <wps:style>
+                        <a:lnRef idx="2">
+                          <a:schemeClr val="accent1">
+                            <a:shade val="50000"/>
+                          </a:schemeClr>
+                        </a:lnRef>
+                        <a:fillRef idx="1">
+                          <a:schemeClr val="accent1"/>
+                        </a:fillRef>
+                        <a:effectRef idx="0">
+                          <a:schemeClr val="accent1"/>
+                        </a:effectRef>
+                        <a:fontRef idx="minor">
+                          <a:schemeClr val="lt1"/>
+                        </a:fontRef>
+                      </wps:style>
+                      <wps:txbx>
+                        <w:txbxContent>
+                          <w:p>
+                            <w:pPr>
+                              <w:spacing w:after="0" w:line="240" w:lineRule="auto"/>
+                              <w:ind w:left="142"/>
+                              <w:rPr>
+                                <w:rFonts w:ascii="Arial" w:hAnsi="Arial" w:cs="Arial"/>
+                                <w:color w:val="000000" w:themeColor="text1"/>
+                                <w:sz w:val="18"/>
+                                <w:szCs w:val="20"/>
+                              </w:rPr>
+                            </w:pPr>
+                            <w:r>
+                              <w:rPr>
+                                <w:rFonts w:ascii="Arial" w:hAnsi="Arial" w:cs="Arial"/>
+                                <w:color w:val="000000" w:themeColor="text1"/>
+                                <w:sz w:val="18"/>
+                                <w:szCs w:val="20"/>
+                              </w:rPr>
+                              <w:t>Records excluded after post-search</w:t>
+                            </w:r>
+                          </w:p>
+                          <w:p>
+                            <w:pPr>
+                              <w:spacing w:after="0" w:line="240" w:lineRule="auto"/>
+                              <w:ind w:left="284"/>
+                              <w:rPr>
+                                <w:rFonts w:ascii="Arial" w:hAnsi="Arial" w:cs="Arial"/>
+                                <w:color w:val="000000" w:themeColor="text1"/>
+                                <w:sz w:val="18"/>
+                                <w:szCs w:val="20"/>
+                              </w:rPr>
+                            </w:pPr>
+                            <w:r>
+                              <w:rPr>
+                                <w:rFonts w:ascii="Arial" w:hAnsi="Arial" w:cs="Arial"/>
+                                <w:color w:val="000000" w:themeColor="text1"/>
+                                <w:sz w:val="18"/>
+                                <w:szCs w:val="20"/>
+                              </w:rPr>
+                              <w:t xml:space="preserve">integrity checking (n = </w:t>
+                            </w:r>
+                            <w:r>
+                              <w:rPr>
+                                <w:rFonts w:ascii="Arial" w:hAnsi="Arial" w:cs="Arial"/>
+                                <w:color w:val="000000" w:themeColor="text1"/>
+                                <w:sz w:val="18"/>
+                                <w:szCs w:val="20"/>
+                              </w:rPr>
+                              <w:t>4</w:t>
+                            </w:r>
+                            <w:r>
+                              <w:rPr>
+                                <w:rFonts w:ascii="Arial" w:hAnsi="Arial" w:cs="Arial"/>
+                                <w:color w:val="000000" w:themeColor="text1"/>
+                                <w:sz w:val="18"/>
+                                <w:szCs w:val="20"/>
+                              </w:rPr>
+                              <w:t>):</w:t>
+                            </w:r>
+                          </w:p>
+                          <w:p>
+                            <w:pPr>
+                              <w:spacing w:after="0" w:line="240" w:lineRule="auto"/>
+                              <w:ind w:left="284"/>
+                              <w:rPr>
+                                <w:rFonts w:ascii="Arial" w:hAnsi="Arial" w:cs="Arial"/>
+                                <w:color w:val="000000" w:themeColor="text1"/>
+                                <w:sz w:val="18"/>
+                                <w:szCs w:val="20"/>
+                              </w:rPr>
+                            </w:pPr>
+                            <w:r>
+                              <w:rPr>
+                                <w:rFonts w:ascii="Arial" w:hAnsi="Arial" w:cs="Arial"/>
+                                <w:color w:val="000000" w:themeColor="text1"/>
+                                <w:sz w:val="18"/>
+                                <w:szCs w:val="20"/>
+                              </w:rPr>
+                              <w:t>Retracted by their publishers;</w:t>
+                            </w:r>
+                          </w:p>
+                          <w:p>
+                            <w:pPr>
+                              <w:spacing w:after="0" w:line="240" w:lineRule="auto"/>
+                              <w:ind w:left="284"/>
+                              <w:rPr>
+                                <w:rFonts w:ascii="Arial" w:hAnsi="Arial" w:cs="Arial"/>
+                                <w:color w:val="000000" w:themeColor="text1"/>
+                                <w:sz w:val="18"/>
+                                <w:szCs w:val="20"/>
+                              </w:rPr>
+                            </w:pPr>
+                            <w:r>
+                              <w:rPr>
+                                <w:rFonts w:ascii="Arial" w:hAnsi="Arial" w:cs="Arial"/>
+                                <w:color w:val="000000" w:themeColor="text1"/>
+                                <w:sz w:val="18"/>
+                                <w:szCs w:val="20"/>
+                              </w:rPr>
+                              <w:t>documented separately for ethical</w:t>
+                            </w:r>
+                          </w:p>
+                          <w:p>
+                            <w:pPr>
+                              <w:spacing w:after="0" w:line="240" w:lineRule="auto"/>
+                              <w:ind w:left="284"/>
+                              <w:rPr>
+                                <w:rFonts w:ascii="Arial" w:hAnsi="Arial" w:cs="Arial"/>
+                                <w:color w:val="000000" w:themeColor="text1"/>
+                                <w:sz w:val="18"/>
+                                <w:szCs w:val="20"/>
+                              </w:rPr>
+                            </w:pPr>
+                            <w:r>
+                              <w:rPr>
+                                <w:rFonts w:ascii="Arial" w:hAnsi="Arial" w:cs="Arial"/>
+                                <w:color w:val="000000" w:themeColor="text1"/>
+                                <w:sz w:val="18"/>
+                                <w:szCs w:val="20"/>
+                              </w:rPr>
+                              <w:t>reporting only (Section 2.7)</w:t>
+                            </w:r>
+                          </w:p>
+                        </w:txbxContent>
+                      </wps:txbx>
+                      <wps:bodyPr rot="0" spcFirstLastPara="0" vertOverflow="overflow" horzOverflow="overflow" vert="horz" wrap="square" lIns="0" tIns="0" rIns="0" bIns="0" numCol="1" spcCol="0" rtlCol="0" fromWordArt="0" anchor="ctr" anchorCtr="0" forceAA="0" compatLnSpc="1">
+                        <a:prstTxWarp prst="textNoShape">
+                          <a:avLst/>
+                        </a:prstTxWarp>
+                        <a:noAutofit/>
+                      </wps:bodyPr>
+                    </wps:wsp>
+                  </a:graphicData>
+                </a:graphic>
+                <wp14:sizeRelH relativeFrom="margin">
+                  <wp14:pctWidth>0</wp14:pctWidth>
+                </wp14:sizeRelH>
+                <wp14:sizeRelV relativeFrom="margin">
+                  <wp14:pctHeight>0</wp14:pctHeight>
+                </wp14:sizeRelV>
+              </wp:anchor>
+            </w:drawing>
+          </mc:Choice>
+          <mc:Fallback>
+            <w:pict>
+              <v:rect w14:anchorId="73CCC501" id="_x0000_s1040" style="position:absolute;margin-left:239.75pt;margin-top:.45pt;width:158.25pt;height:63.15pt;z-index:251722752;visibility:visible;mso-wrap-style:square;mso-width-percent:0;mso-height-percent:0;mso-wrap-distance-left:9pt;mso-wrap-distance-top:0;mso-wrap-distance-right:9pt;mso-wrap-distance-bottom:0;mso-position-horizontal:absolute;mso-position-horizontal-relative:text;mso-position-vertical:absolute;mso-position-vertical-relative:text;mso-width-percent:0;mso-height-percent:0;mso-width-relative:margin;mso-height-relative:margin;v-text-anchor:middle" o:gfxdata="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" filled="f" strokecolor="black [3213]" strokeweight="1pt">
+                <v:textbox inset="0,0,0,0">
+                  <w:txbxContent>
+                    <w:p>
+                      <w:pPr>
+                        <w:spacing w:after="0" w:line="240" w:lineRule="auto"/>
+                        <w:ind w:left="142"/>
+                        <w:rPr>
+                          <w:rFonts w:ascii="Arial" w:hAnsi="Arial" w:cs="Arial"/>
+                          <w:color w:val="000000" w:themeColor="text1"/>
+                          <w:sz w:val="18"/>
+                          <w:szCs w:val="20"/>
+                        </w:rPr>
+                      </w:pPr>
+                      <w:r>
+                        <w:rPr>
+                          <w:rFonts w:ascii="Arial" w:hAnsi="Arial" w:cs="Arial"/>
+                          <w:color w:val="000000" w:themeColor="text1"/>
+                          <w:sz w:val="18"/>
+                          <w:szCs w:val="20"/>
+                        </w:rPr>
+                        <w:t>Records excluded after post-search</w:t>
+                      </w:r>
+                    </w:p>
+                    <w:p>
+                      <w:pPr>
+                        <w:spacing w:after="0" w:line="240" w:lineRule="auto"/>
+                        <w:ind w:left="284"/>
+                        <w:rPr>
+                          <w:rFonts w:ascii="Arial" w:hAnsi="Arial" w:cs="Arial"/>
+                          <w:color w:val="000000" w:themeColor="text1"/>
+                          <w:sz w:val="18"/>
+                          <w:szCs w:val="20"/>
+                        </w:rPr>
+                      </w:pPr>
+                      <w:r>
+                        <w:rPr>
+                          <w:rFonts w:ascii="Arial" w:hAnsi="Arial" w:cs="Arial"/>
+                          <w:color w:val="000000" w:themeColor="text1"/>
+                          <w:sz w:val="18"/>
+                          <w:szCs w:val="20"/>
+                        </w:rPr>
+                        <w:t xml:space="preserve">integrity checking (n = </w:t>
+                      </w:r>
+                      <w:r>
+                        <w:rPr>
+                          <w:rFonts w:ascii="Arial" w:hAnsi="Arial" w:cs="Arial"/>
+                          <w:color w:val="000000" w:themeColor="text1"/>
+                          <w:sz w:val="18"/>
+                          <w:szCs w:val="20"/>
+                        </w:rPr>
+                        <w:t>4</w:t>
+                      </w:r>
+                      <w:r>
+                        <w:rPr>
+                          <w:rFonts w:ascii="Arial" w:hAnsi="Arial" w:cs="Arial"/>
+                          <w:color w:val="000000" w:themeColor="text1"/>
+                          <w:sz w:val="18"/>
+                          <w:szCs w:val="20"/>
+                        </w:rPr>
+                        <w:t>):</w:t>
+                      </w:r>
+                    </w:p>
+                    <w:p>
+                      <w:pPr>
+                        <w:spacing w:after="0" w:line="240" w:lineRule="auto"/>
+                        <w:ind w:left="284"/>
+                        <w:rPr>
+                          <w:rFonts w:ascii="Arial" w:hAnsi="Arial" w:cs="Arial"/>
+                          <w:color w:val="000000" w:themeColor="text1"/>
+                          <w:sz w:val="18"/>
+                          <w:szCs w:val="20"/>
+                        </w:rPr>
+                      </w:pPr>
+                      <w:r>
+                        <w:rPr>
+                          <w:rFonts w:ascii="Arial" w:hAnsi="Arial" w:cs="Arial"/>
+                          <w:color w:val="000000" w:themeColor="text1"/>
+                          <w:sz w:val="18"/>
+                          <w:szCs w:val="20"/>
+                        </w:rPr>
+                        <w:t>Retracted by their publishers;</w:t>
+                      </w:r>
+                    </w:p>
+                    <w:p>
+                      <w:pPr>
+                        <w:spacing w:after="0" w:line="240" w:lineRule="auto"/>
+                        <w:ind w:left="284"/>
+                        <w:rPr>
+                          <w:rFonts w:ascii="Arial" w:hAnsi="Arial" w:cs="Arial"/>
+                          <w:color w:val="000000" w:themeColor="text1"/>
+                          <w:sz w:val="18"/>
+                          <w:szCs w:val="20"/>
+                        </w:rPr>
+                      </w:pPr>
+                      <w:r>
+                        <w:rPr>
+                          <w:rFonts w:ascii="Arial" w:hAnsi="Arial" w:cs="Arial"/>
+                          <w:color w:val="000000" w:themeColor="text1"/>
+                          <w:sz w:val="18"/>
+                          <w:szCs w:val="20"/>
+                        </w:rPr>
+                        <w:t>documented separately for ethical</w:t>
+                      </w:r>
+                    </w:p>
+                    <w:p>
+                      <w:pPr>
+                        <w:spacing w:after="0" w:line="240" w:lineRule="auto"/>
+                        <w:ind w:left="284"/>
+                        <w:rPr>
+                          <w:rFonts w:ascii="Arial" w:hAnsi="Arial" w:cs="Arial"/>
+                          <w:color w:val="000000" w:themeColor="text1"/>
+                          <w:sz w:val="18"/>
+                          <w:szCs w:val="20"/>
+                        </w:rPr>
+                      </w:pPr>
+                      <w:r>
+                        <w:rPr>
+                          <w:rFonts w:ascii="Arial" w:hAnsi="Arial" w:cs="Arial"/>
+                          <w:color w:val="000000" w:themeColor="text1"/>
+                          <w:sz w:val="18"/>
+                          <w:szCs w:val="20"/>
+                        </w:rPr>
+                        <w:t>reporting only (Section 2.7)</w:t>
+                      </w:r>
+                    </w:p>
+                  </w:txbxContent>
+                </v:textbox>
+              </v:rect>
+            </w:pict>
+          </mc:Fallback>
+        </mc:AlternateContent>
+      </w:r>
+      <w:r>
+        <w:rPr>
+          <w:noProof/>
+        </w:rPr>
+        <mc:AlternateContent>
+          <mc:Choice Requires="wps">
+            <w:drawing>
+              <wp:anchor distT="0" distB="0" distL="114300" distR="114300" simplePos="0" relativeHeight="251685888" behindDoc="0" locked="0" layoutInCell="1" allowOverlap="1" wp14:anchorId="2DFD1A2A" wp14:editId="42517FB0">
                 <wp:simplePos x="0" y="0"/>
                 <wp:positionH relativeFrom="column">
                   <wp:posOffset>2486025</wp:posOffset>
@@ -3352,308 +4295,9 @@
           </mc:Choice>
           <mc:Fallback>
             <w:pict>
-              <v:shape w14:anchorId="09D3569C" id="Straight Arrow Connector 17" o:spid="_x0000_s1026" type="#_x0000_t32" style="position:absolute;margin-left:195.75pt;margin-top:11.85pt;width:44.35pt;height:0;z-index:251685888;visibility:visible;mso-wrap-style:square;mso-wrap-distance-left:9pt;mso-wrap-distance-top:0;mso-wrap-distance-right:9pt;mso-wrap-distance-bottom:0;mso-position-horizontal:absolute;mso-position-horizontal-relative:text;mso-position-vertical:absolute;mso-position-vertical-relative:text" o:gfxdata="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" strokecolor="black [3213]" strokeweight=".5pt">
+              <v:shape w14:anchorId="2C35C4A4" id="Straight Arrow Connector 17" o:spid="_x0000_s1026" type="#_x0000_t32" style="position:absolute;margin-left:195.75pt;margin-top:11.85pt;width:44.35pt;height:0;z-index:251685888;visibility:visible;mso-wrap-style:square;mso-wrap-distance-left:9pt;mso-wrap-distance-top:0;mso-wrap-distance-right:9pt;mso-wrap-distance-bottom:0;mso-position-horizontal:absolute;mso-position-horizontal-relative:text;mso-position-vertical:absolute;mso-position-vertical-relative:text" o:gfxdata="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" strokecolor="black [3213]" strokeweight=".5pt">
                 <v:stroke endarrow="block" joinstyle="miter"/>
               </v:shape>
-            </w:pict>
-          </mc:Fallback>
-        </mc:AlternateContent>
-      </w:r>
-      <w:r>
-        <w:rPr>
-          <w:noProof/>
-        </w:rPr>
-        <mc:AlternateContent>
-          <mc:Choice Requires="wps">
-            <w:drawing>
-              <wp:anchor distT="0" distB="0" distL="114300" distR="114300" simplePos="0" relativeHeight="251722752" behindDoc="0" locked="0" layoutInCell="1" allowOverlap="1" wp14:anchorId="73CCC501" wp14:editId="4CAE63C1">
-                <wp:simplePos x="0" y="0"/>
-                <wp:positionH relativeFrom="column">
-                  <wp:posOffset>3047102</wp:posOffset>
-                </wp:positionH>
-                <wp:positionV relativeFrom="paragraph">
-                  <wp:posOffset>8446</wp:posOffset>
-                </wp:positionV>
-                <wp:extent cx="2956240" cy="802203"/>
-                <wp:effectExtent l="0" t="0" r="15875" b="17145"/>
-                <wp:wrapNone/>
-                <wp:docPr id="113304601" name="Rectangle 9"/>
-                <wp:cNvGraphicFramePr/>
-                <a:graphic xmlns:a="http://schemas.openxmlformats.org/drawingml/2006/main">
-                  <a:graphicData uri="http://schemas.microsoft.com/office/word/2010/wordprocessingShape">
-                    <wps:wsp>
-                      <wps:cNvSpPr/>
-                      <wps:spPr>
-                        <a:xfrm>
-                          <a:off x="0" y="0"/>
-                          <a:ext cx="2956240" cy="802203"/>
-                        </a:xfrm>
-                        <a:prstGeom prst="rect">
-                          <a:avLst/>
-                        </a:prstGeom>
-                        <a:noFill/>
-                        <a:ln>
-                          <a:solidFill>
-                            <a:schemeClr val="tx1"/>
-                          </a:solidFill>
-                        </a:ln>
-                      </wps:spPr>
-                      <wps:style>
-                        <a:lnRef idx="2">
-                          <a:schemeClr val="accent1">
-                            <a:shade val="50000"/>
-                          </a:schemeClr>
-                        </a:lnRef>
-                        <a:fillRef idx="1">
-                          <a:schemeClr val="accent1"/>
-                        </a:fillRef>
-                        <a:effectRef idx="0">
-                          <a:schemeClr val="accent1"/>
-                        </a:effectRef>
-                        <a:fontRef idx="minor">
-                          <a:schemeClr val="lt1"/>
-                        </a:fontRef>
-                      </wps:style>
-                      <wps:txbx>
-                        <w:txbxContent>
-                          <w:p>
-                            <w:pPr>
-                              <w:spacing w:after="0" w:line="240" w:lineRule="auto"/>
-                              <w:ind w:left="142"/>
-                              <w:rPr>
-                                <w:rFonts w:ascii="Arial" w:hAnsi="Arial" w:cs="Arial"/>
-                                <w:color w:val="000000" w:themeColor="text1"/>
-                                <w:sz w:val="18"/>
-                                <w:szCs w:val="20"/>
-                              </w:rPr>
-                            </w:pPr>
-                            <w:r>
-                              <w:rPr>
-                                <w:rFonts w:ascii="Arial" w:hAnsi="Arial" w:cs="Arial"/>
-                                <w:color w:val="000000" w:themeColor="text1"/>
-                                <w:sz w:val="18"/>
-                                <w:szCs w:val="20"/>
-                              </w:rPr>
-                              <w:t>Records excluded after post-search</w:t>
-                            </w:r>
-                          </w:p>
-                          <w:p>
-                            <w:pPr>
-                              <w:spacing w:after="0" w:line="240" w:lineRule="auto"/>
-                              <w:ind w:left="284"/>
-                              <w:rPr>
-                                <w:rFonts w:ascii="Arial" w:hAnsi="Arial" w:cs="Arial"/>
-                                <w:color w:val="000000" w:themeColor="text1"/>
-                                <w:sz w:val="18"/>
-                                <w:szCs w:val="20"/>
-                              </w:rPr>
-                            </w:pPr>
-                            <w:r>
-                              <w:rPr>
-                                <w:rFonts w:ascii="Arial" w:hAnsi="Arial" w:cs="Arial"/>
-                                <w:color w:val="000000" w:themeColor="text1"/>
-                                <w:sz w:val="18"/>
-                                <w:szCs w:val="20"/>
-                              </w:rPr>
-                              <w:t>integrity checking (n = 3):</w:t>
-                            </w:r>
-                          </w:p>
-                          <w:p>
-                            <w:pPr>
-                              <w:spacing w:after="0" w:line="240" w:lineRule="auto"/>
-                              <w:ind w:left="284"/>
-                              <w:rPr>
-                                <w:rFonts w:ascii="Arial" w:hAnsi="Arial" w:cs="Arial"/>
-                                <w:color w:val="000000" w:themeColor="text1"/>
-                                <w:sz w:val="18"/>
-                                <w:szCs w:val="20"/>
-                              </w:rPr>
-                            </w:pPr>
-                            <w:r>
-                              <w:rPr>
-                                <w:rFonts w:ascii="Arial" w:hAnsi="Arial" w:cs="Arial"/>
-                                <w:color w:val="000000" w:themeColor="text1"/>
-                                <w:sz w:val="18"/>
-                                <w:szCs w:val="20"/>
-                              </w:rPr>
-                              <w:t>Retracted by their publishers;</w:t>
-                            </w:r>
-                          </w:p>
-                          <w:p>
-                            <w:pPr>
-                              <w:spacing w:after="0" w:line="240" w:lineRule="auto"/>
-                              <w:ind w:left="284"/>
-                              <w:rPr>
-                                <w:rFonts w:ascii="Arial" w:hAnsi="Arial" w:cs="Arial"/>
-                                <w:color w:val="000000" w:themeColor="text1"/>
-                                <w:sz w:val="18"/>
-                                <w:szCs w:val="20"/>
-                              </w:rPr>
-                            </w:pPr>
-                            <w:r>
-                              <w:rPr>
-                                <w:rFonts w:ascii="Arial" w:hAnsi="Arial" w:cs="Arial"/>
-                                <w:color w:val="000000" w:themeColor="text1"/>
-                                <w:sz w:val="18"/>
-                                <w:szCs w:val="20"/>
-                              </w:rPr>
-                              <w:t>documented separately for ethical</w:t>
-                            </w:r>
-                          </w:p>
-                          <w:p>
-                            <w:pPr>
-                              <w:spacing w:after="0" w:line="240" w:lineRule="auto"/>
-                              <w:ind w:left="284"/>
-                              <w:rPr>
-                                <w:rFonts w:ascii="Arial" w:hAnsi="Arial" w:cs="Arial"/>
-                                <w:color w:val="000000" w:themeColor="text1"/>
-                                <w:sz w:val="18"/>
-                                <w:szCs w:val="20"/>
-                              </w:rPr>
-                            </w:pPr>
-                            <w:r>
-                              <w:rPr>
-                                <w:rFonts w:ascii="Arial" w:hAnsi="Arial" w:cs="Arial"/>
-                                <w:color w:val="000000" w:themeColor="text1"/>
-                                <w:sz w:val="18"/>
-                                <w:szCs w:val="20"/>
-                              </w:rPr>
-                              <w:t>reporting only (Section 2.7)</w:t>
-                            </w:r>
-                          </w:p>
-                        </w:txbxContent>
-                      </wps:txbx>
-                      <wps:bodyPr rot="0" spcFirstLastPara="0" vertOverflow="overflow" horzOverflow="overflow" vert="horz" wrap="square" lIns="0" tIns="0" rIns="0" bIns="0" numCol="1" spcCol="0" rtlCol="0" fromWordArt="0" anchor="ctr" anchorCtr="0" forceAA="0" compatLnSpc="1">
-                        <a:prstTxWarp prst="textNoShape">
-                          <a:avLst/>
-                        </a:prstTxWarp>
-                        <a:noAutofit/>
-                      </wps:bodyPr>
-                    </wps:wsp>
-                  </a:graphicData>
-                </a:graphic>
-                <wp14:sizeRelH relativeFrom="margin">
-                  <wp14:pctWidth>0</wp14:pctWidth>
-                </wp14:sizeRelH>
-                <wp14:sizeRelV relativeFrom="margin">
-                  <wp14:pctHeight>0</wp14:pctHeight>
-                </wp14:sizeRelV>
-              </wp:anchor>
-            </w:drawing>
-          </mc:Choice>
-          <mc:Fallback>
-            <w:pict>
-              <v:rect w14:anchorId="73CCC501" id="_x0000_s1038" style="position:absolute;margin-left:239.95pt;margin-top:.65pt;width:232.75pt;height:63.15pt;z-index:251722752;visibility:visible;mso-wrap-style:square;mso-width-percent:0;mso-height-percent:0;mso-wrap-distance-left:9pt;mso-wrap-distance-top:0;mso-wrap-distance-right:9pt;mso-wrap-distance-bottom:0;mso-position-horizontal:absolute;mso-position-horizontal-relative:text;mso-position-vertical:absolute;mso-position-vertical-relative:text;mso-width-percent:0;mso-height-percent:0;mso-width-relative:margin;mso-height-relative:margin;v-text-anchor:middle" o:gfxdata="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" filled="f" strokecolor="black [3213]" strokeweight="1pt">
-                <v:textbox inset="0,0,0,0">
-                  <w:txbxContent>
-                    <w:p>
-                      <w:pPr>
-                        <w:spacing w:after="0" w:line="240" w:lineRule="auto"/>
-                        <w:ind w:left="142"/>
-                        <w:rPr>
-                          <w:rFonts w:ascii="Arial" w:hAnsi="Arial" w:cs="Arial"/>
-                          <w:color w:val="000000" w:themeColor="text1"/>
-                          <w:sz w:val="18"/>
-                          <w:szCs w:val="20"/>
-                        </w:rPr>
-                      </w:pPr>
-                      <w:r>
-                        <w:rPr>
-                          <w:rFonts w:ascii="Arial" w:hAnsi="Arial" w:cs="Arial"/>
-                          <w:color w:val="000000" w:themeColor="text1"/>
-                          <w:sz w:val="18"/>
-                          <w:szCs w:val="20"/>
-                        </w:rPr>
-                        <w:t>Records excluded after post-search</w:t>
-                      </w:r>
-                    </w:p>
-                    <w:p>
-                      <w:pPr>
-                        <w:spacing w:after="0" w:line="240" w:lineRule="auto"/>
-                        <w:ind w:left="284"/>
-                        <w:rPr>
-                          <w:rFonts w:ascii="Arial" w:hAnsi="Arial" w:cs="Arial"/>
-                          <w:color w:val="000000" w:themeColor="text1"/>
-                          <w:sz w:val="18"/>
-                          <w:szCs w:val="20"/>
-                        </w:rPr>
-                      </w:pPr>
-                      <w:r>
-                        <w:rPr>
-                          <w:rFonts w:ascii="Arial" w:hAnsi="Arial" w:cs="Arial"/>
-                          <w:color w:val="000000" w:themeColor="text1"/>
-                          <w:sz w:val="18"/>
-                          <w:szCs w:val="20"/>
-                        </w:rPr>
-                        <w:t>integrity checking (n = 3):</w:t>
-                      </w:r>
-                    </w:p>
-                    <w:p>
-                      <w:pPr>
-                        <w:spacing w:after="0" w:line="240" w:lineRule="auto"/>
-                        <w:ind w:left="284"/>
-                        <w:rPr>
-                          <w:rFonts w:ascii="Arial" w:hAnsi="Arial" w:cs="Arial"/>
-                          <w:color w:val="000000" w:themeColor="text1"/>
-                          <w:sz w:val="18"/>
-                          <w:szCs w:val="20"/>
-                        </w:rPr>
-                      </w:pPr>
-                      <w:r>
-                        <w:rPr>
-                          <w:rFonts w:ascii="Arial" w:hAnsi="Arial" w:cs="Arial"/>
-                          <w:color w:val="000000" w:themeColor="text1"/>
-                          <w:sz w:val="18"/>
-                          <w:szCs w:val="20"/>
-                        </w:rPr>
-                        <w:t>Retracted by their publishers;</w:t>
-                      </w:r>
-                    </w:p>
-                    <w:p>
-                      <w:pPr>
-                        <w:spacing w:after="0" w:line="240" w:lineRule="auto"/>
-                        <w:ind w:left="284"/>
-                        <w:rPr>
-                          <w:rFonts w:ascii="Arial" w:hAnsi="Arial" w:cs="Arial"/>
-                          <w:color w:val="000000" w:themeColor="text1"/>
-                          <w:sz w:val="18"/>
-                          <w:szCs w:val="20"/>
-                        </w:rPr>
-                      </w:pPr>
-                      <w:r>
-                        <w:rPr>
-                          <w:rFonts w:ascii="Arial" w:hAnsi="Arial" w:cs="Arial"/>
-                          <w:color w:val="000000" w:themeColor="text1"/>
-                          <w:sz w:val="18"/>
-                          <w:szCs w:val="20"/>
-                        </w:rPr>
-                        <w:t>documented separately for ethical</w:t>
-                      </w:r>
-                    </w:p>
-                    <w:p>
-                      <w:pPr>
-                        <w:spacing w:after="0" w:line="240" w:lineRule="auto"/>
-                        <w:ind w:left="284"/>
-                        <w:rPr>
-                          <w:rFonts w:ascii="Arial" w:hAnsi="Arial" w:cs="Arial"/>
-                          <w:color w:val="000000" w:themeColor="text1"/>
-                          <w:sz w:val="18"/>
-                          <w:szCs w:val="20"/>
-                        </w:rPr>
-                      </w:pPr>
-                      <w:r>
-                        <w:rPr>
-                          <w:rFonts w:ascii="Arial" w:hAnsi="Arial" w:cs="Arial"/>
-                          <w:color w:val="000000" w:themeColor="text1"/>
-                          <w:sz w:val="18"/>
-                          <w:szCs w:val="20"/>
-                        </w:rPr>
-                        <w:t>reporting only (Section 2.7)</w:t>
-                      </w:r>
-                    </w:p>
-                  </w:txbxContent>
-                </v:textbox>
-              </v:rect>
             </w:pict>
           </mc:Fallback>
         </mc:AlternateContent>
@@ -3736,7 +4380,7 @@
           </mc:Choice>
           <mc:Fallback>
             <w:pict>
-              <v:shape w14:anchorId="5655BEE6" id="Straight Arrow Connector 36" o:spid="_x0000_s1026" type="#_x0000_t32" style="position:absolute;margin-left:114.35pt;margin-top:5.6pt;width:0;height:43.15pt;flip:x;z-index:251712512;visibility:visible;mso-wrap-style:square;mso-width-percent:0;mso-height-percent:0;mso-wrap-distance-left:9pt;mso-wrap-distance-top:0;mso-wrap-distance-right:9pt;mso-wrap-distance-bottom:0;mso-position-horizontal:absolute;mso-position-horizontal-relative:text;mso-position-vertical:absolute;mso-position-vertical-relative:text;mso-width-percent:0;mso-height-percent:0;mso-width-relative:margin;mso-height-relative:margin" o:gfxdata="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" strokecolor="black [3213]" strokeweight=".5pt">
+              <v:shape w14:anchorId="5A14D4FB" id="Straight Arrow Connector 36" o:spid="_x0000_s1026" type="#_x0000_t32" style="position:absolute;margin-left:114.35pt;margin-top:5.6pt;width:0;height:43.15pt;flip:x;z-index:251712512;visibility:visible;mso-wrap-style:square;mso-width-percent:0;mso-height-percent:0;mso-wrap-distance-left:9pt;mso-wrap-distance-top:0;mso-wrap-distance-right:9pt;mso-wrap-distance-bottom:0;mso-position-horizontal:absolute;mso-position-horizontal-relative:text;mso-position-vertical:absolute;mso-position-vertical-relative:text;mso-width-percent:0;mso-height-percent:0;mso-width-relative:margin;mso-height-relative:margin" o:gfxdata="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" strokecolor="black [3213]" strokeweight=".5pt">
                 <v:stroke endarrow="block" joinstyle="miter"/>
               </v:shape>
             </w:pict>
@@ -3850,7 +4494,25 @@
                                 <w:sz w:val="18"/>
                                 <w:szCs w:val="20"/>
                               </w:rPr>
-                              <w:t>(n = 31)</w:t>
+                              <w:t>(n = 3</w:t>
+                            </w:r>
+                            <w:r>
+                              <w:rPr>
+                                <w:rFonts w:ascii="Arial" w:hAnsi="Arial" w:cs="Arial"/>
+                                <w:color w:val="000000" w:themeColor="text1"/>
+                                <w:sz w:val="18"/>
+                                <w:szCs w:val="20"/>
+                              </w:rPr>
+                              <w:t>0</w:t>
+                            </w:r>
+                            <w:r>
+                              <w:rPr>
+                                <w:rFonts w:ascii="Arial" w:hAnsi="Arial" w:cs="Arial"/>
+                                <w:color w:val="000000" w:themeColor="text1"/>
+                                <w:sz w:val="18"/>
+                                <w:szCs w:val="20"/>
+                              </w:rPr>
+                              <w:t>)</w:t>
                             </w:r>
                           </w:p>
                         </w:txbxContent>
@@ -3875,7 +4537,7 @@
           </mc:Choice>
           <mc:Fallback>
             <w:pict>
-              <v:rect w14:anchorId="2981E01D" id="_x0000_s1039" style="position:absolute;margin-left:41.45pt;margin-top:8.3pt;width:151.9pt;height:20.15pt;z-index:251730944;visibility:visible;mso-wrap-style:square;mso-width-percent:0;mso-height-percent:0;mso-wrap-distance-left:9pt;mso-wrap-distance-top:0;mso-wrap-distance-right:9pt;mso-wrap-distance-bottom:0;mso-position-horizontal:absolute;mso-position-horizontal-relative:text;mso-position-vertical:absolute;mso-position-vertical-relative:text;mso-width-percent:0;mso-height-percent:0;mso-width-relative:margin;mso-height-relative:margin;v-text-anchor:middle" o:gfxdata="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" filled="f" strokecolor="black [3213]" strokeweight="1pt">
+              <v:rect w14:anchorId="2981E01D" id="_x0000_s1041" style="position:absolute;margin-left:41.45pt;margin-top:8.3pt;width:151.9pt;height:20.15pt;z-index:251730944;visibility:visible;mso-wrap-style:square;mso-width-percent:0;mso-height-percent:0;mso-wrap-distance-left:9pt;mso-wrap-distance-top:0;mso-wrap-distance-right:9pt;mso-wrap-distance-bottom:0;mso-position-horizontal:absolute;mso-position-horizontal-relative:text;mso-position-vertical:absolute;mso-position-vertical-relative:text;mso-width-percent:0;mso-height-percent:0;mso-width-relative:margin;mso-height-relative:margin;v-text-anchor:middle" o:gfxdata="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" filled="f" strokecolor="black [3213]" strokeweight="1pt">
                 <v:textbox>
                   <w:txbxContent>
                     <w:p>
@@ -3913,7 +4575,25 @@
                           <w:sz w:val="18"/>
                           <w:szCs w:val="20"/>
                         </w:rPr>
-                        <w:t>(n = 31)</w:t>
+                        <w:t>(n = 3</w:t>
+                      </w:r>
+                      <w:r>
+                        <w:rPr>
+                          <w:rFonts w:ascii="Arial" w:hAnsi="Arial" w:cs="Arial"/>
+                          <w:color w:val="000000" w:themeColor="text1"/>
+                          <w:sz w:val="18"/>
+                          <w:szCs w:val="20"/>
+                        </w:rPr>
+                        <w:t>0</w:t>
+                      </w:r>
+                      <w:r>
+                        <w:rPr>
+                          <w:rFonts w:ascii="Arial" w:hAnsi="Arial" w:cs="Arial"/>
+                          <w:color w:val="000000" w:themeColor="text1"/>
+                          <w:sz w:val="18"/>
+                          <w:szCs w:val="20"/>
+                        </w:rPr>
+                        <w:t>)</w:t>
                       </w:r>
                     </w:p>
                   </w:txbxContent>
@@ -4090,7 +4770,7 @@
           </mc:Choice>
           <mc:Fallback>
             <w:pict>
-              <v:rect w14:anchorId="2957DE69" id="Rectangle 13" o:spid="_x0000_s1040" style="position:absolute;margin-left:239.15pt;margin-top:5.95pt;width:206.4pt;height:53.8pt;z-index:251678720;visibility:visible;mso-wrap-style:square;mso-width-percent:0;mso-height-percent:0;mso-wrap-distance-left:9pt;mso-wrap-distance-top:0;mso-wrap-distance-right:9pt;mso-wrap-distance-bottom:0;mso-position-horizontal:absolute;mso-position-horizontal-relative:text;mso-position-vertical:absolute;mso-position-vertical-relative:text;mso-width-percent:0;mso-height-percent:0;mso-width-relative:margin;mso-height-relative:margin;v-text-anchor:middle" o:gfxdata="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" filled="f" strokecolor="black [3213]" strokeweight="1pt">
+              <v:rect w14:anchorId="2957DE69" id="Rectangle 13" o:spid="_x0000_s1042" style="position:absolute;margin-left:239.15pt;margin-top:5.95pt;width:206.4pt;height:53.8pt;z-index:251678720;visibility:visible;mso-wrap-style:square;mso-width-percent:0;mso-height-percent:0;mso-wrap-distance-left:9pt;mso-wrap-distance-top:0;mso-wrap-distance-right:9pt;mso-wrap-distance-bottom:0;mso-position-horizontal:absolute;mso-position-horizontal-relative:text;mso-position-vertical:absolute;mso-position-vertical-relative:text;mso-width-percent:0;mso-height-percent:0;mso-width-relative:margin;mso-height-relative:margin;v-text-anchor:middle" o:gfxdata="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" filled="f" strokecolor="black [3213]" strokeweight="1pt">
                 <v:textbox>
                   <w:txbxContent>
                     <w:p>
@@ -4255,7 +4935,7 @@
           </mc:Choice>
           <mc:Fallback>
             <w:pict>
-              <v:shape w14:anchorId="57F1AC0D" id="Straight Arrow Connector 17" o:spid="_x0000_s1026" type="#_x0000_t32" style="position:absolute;margin-left:194.1pt;margin-top:6.25pt;width:44.35pt;height:0;z-index:251735040;visibility:visible;mso-wrap-style:square;mso-wrap-distance-left:9pt;mso-wrap-distance-top:0;mso-wrap-distance-right:9pt;mso-wrap-distance-bottom:0;mso-position-horizontal:absolute;mso-position-horizontal-relative:text;mso-position-vertical:absolute;mso-position-vertical-relative:text" o:gfxdata="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" strokecolor="black [3213]" strokeweight=".5pt">
+              <v:shape w14:anchorId="47C67888" id="Straight Arrow Connector 17" o:spid="_x0000_s1026" type="#_x0000_t32" style="position:absolute;margin-left:194.1pt;margin-top:6.25pt;width:44.35pt;height:0;z-index:251735040;visibility:visible;mso-wrap-style:square;mso-wrap-distance-left:9pt;mso-wrap-distance-top:0;mso-wrap-distance-right:9pt;mso-wrap-distance-bottom:0;mso-position-horizontal:absolute;mso-position-horizontal-relative:text;mso-position-vertical:absolute;mso-position-vertical-relative:text" o:gfxdata="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" strokecolor="black [3213]" strokeweight=".5pt">
                 <v:stroke endarrow="block" joinstyle="miter"/>
               </v:shape>
             </w:pict>
@@ -4335,7 +5015,7 @@
           </mc:Choice>
           <mc:Fallback>
             <w:pict>
-              <v:shape w14:anchorId="787317C7" id="Straight Arrow Connector 27" o:spid="_x0000_s1026" type="#_x0000_t32" style="position:absolute;margin-left:115.05pt;margin-top:3pt;width:0;height:38.85pt;z-index:251737088;visibility:visible;mso-wrap-style:square;mso-width-percent:0;mso-height-percent:0;mso-wrap-distance-left:9pt;mso-wrap-distance-top:0;mso-wrap-distance-right:9pt;mso-wrap-distance-bottom:0;mso-position-horizontal:absolute;mso-position-horizontal-relative:text;mso-position-vertical:absolute;mso-position-vertical-relative:text;mso-width-percent:0;mso-height-percent:0;mso-width-relative:margin;mso-height-relative:margin" o:gfxdata="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" strokecolor="black [3213]" strokeweight=".5pt">
+              <v:shape w14:anchorId="4D301207" id="Straight Arrow Connector 27" o:spid="_x0000_s1026" type="#_x0000_t32" style="position:absolute;margin-left:115.05pt;margin-top:3pt;width:0;height:38.85pt;z-index:251737088;visibility:visible;mso-wrap-style:square;mso-width-percent:0;mso-height-percent:0;mso-wrap-distance-left:9pt;mso-wrap-distance-top:0;mso-wrap-distance-right:9pt;mso-wrap-distance-bottom:0;mso-position-horizontal:absolute;mso-position-horizontal-relative:text;mso-position-vertical:absolute;mso-position-vertical-relative:text;mso-width-percent:0;mso-height-percent:0;mso-width-relative:margin;mso-height-relative:margin" o:gfxdata="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" strokecolor="black [3213]" strokeweight=".5pt">
                 <v:stroke endarrow="block" joinstyle="miter"/>
               </v:shape>
             </w:pict>
@@ -4426,7 +5106,25 @@
                                 <w:sz w:val="18"/>
                                 <w:szCs w:val="20"/>
                               </w:rPr>
-                              <w:t>Eligible corpus (n = 24)</w:t>
+                              <w:t>Eligible corpus (n = 2</w:t>
+                            </w:r>
+                            <w:r>
+                              <w:rPr>
+                                <w:rFonts w:ascii="Arial" w:hAnsi="Arial" w:cs="Arial"/>
+                                <w:color w:val="000000" w:themeColor="text1"/>
+                                <w:sz w:val="18"/>
+                                <w:szCs w:val="20"/>
+                              </w:rPr>
+                              <w:t>3</w:t>
+                            </w:r>
+                            <w:r>
+                              <w:rPr>
+                                <w:rFonts w:ascii="Arial" w:hAnsi="Arial" w:cs="Arial"/>
+                                <w:color w:val="000000" w:themeColor="text1"/>
+                                <w:sz w:val="18"/>
+                                <w:szCs w:val="20"/>
+                              </w:rPr>
+                              <w:t>)</w:t>
                             </w:r>
                           </w:p>
                         </w:txbxContent>
@@ -4451,7 +5149,7 @@
           </mc:Choice>
           <mc:Fallback>
             <w:pict>
-              <v:rect w14:anchorId="39C112BF" id="_x0000_s1041" style="position:absolute;margin-left:40.35pt;margin-top:13.75pt;width:151.9pt;height:20.15pt;z-index:251739136;visibility:visible;mso-wrap-style:square;mso-width-percent:0;mso-height-percent:0;mso-wrap-distance-left:9pt;mso-wrap-distance-top:0;mso-wrap-distance-right:9pt;mso-wrap-distance-bottom:0;mso-position-horizontal:absolute;mso-position-horizontal-relative:text;mso-position-vertical:absolute;mso-position-vertical-relative:text;mso-width-percent:0;mso-height-percent:0;mso-width-relative:margin;mso-height-relative:margin;v-text-anchor:middle" o:gfxdata="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" filled="f" strokecolor="black [3213]" strokeweight="1pt">
+              <v:rect w14:anchorId="39C112BF" id="_x0000_s1043" style="position:absolute;margin-left:40.35pt;margin-top:13.75pt;width:151.9pt;height:20.15pt;z-index:251739136;visibility:visible;mso-wrap-style:square;mso-width-percent:0;mso-height-percent:0;mso-wrap-distance-left:9pt;mso-wrap-distance-top:0;mso-wrap-distance-right:9pt;mso-wrap-distance-bottom:0;mso-position-horizontal:absolute;mso-position-horizontal-relative:text;mso-position-vertical:absolute;mso-position-vertical-relative:text;mso-width-percent:0;mso-height-percent:0;mso-width-relative:margin;mso-height-relative:margin;v-text-anchor:middle" o:gfxdata="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" filled="f" strokecolor="black [3213]" strokeweight="1pt">
                 <v:textbox>
                   <w:txbxContent>
                     <w:p>
@@ -4471,7 +5169,25 @@
                           <w:sz w:val="18"/>
                           <w:szCs w:val="20"/>
                         </w:rPr>
-                        <w:t>Eligible corpus (n = 24)</w:t>
+                        <w:t>Eligible corpus (n = 2</w:t>
+                      </w:r>
+                      <w:r>
+                        <w:rPr>
+                          <w:rFonts w:ascii="Arial" w:hAnsi="Arial" w:cs="Arial"/>
+                          <w:color w:val="000000" w:themeColor="text1"/>
+                          <w:sz w:val="18"/>
+                          <w:szCs w:val="20"/>
+                        </w:rPr>
+                        <w:t>3</w:t>
+                      </w:r>
+                      <w:r>
+                        <w:rPr>
+                          <w:rFonts w:ascii="Arial" w:hAnsi="Arial" w:cs="Arial"/>
+                          <w:color w:val="000000" w:themeColor="text1"/>
+                          <w:sz w:val="18"/>
+                          <w:szCs w:val="20"/>
+                        </w:rPr>
+                        <w:t>)</w:t>
                       </w:r>
                     </w:p>
                   </w:txbxContent>
@@ -4588,7 +5304,7 @@
           </mc:Choice>
           <mc:Fallback>
             <w:pict>
-              <v:shape w14:anchorId="291789E9" id="Flowchart: Alternate Process 33" o:spid="_x0000_s1042" type="#_x0000_t176" style="position:absolute;margin-left:-12pt;margin-top:15.85pt;width:60.15pt;height:20.7pt;rotation:-90;z-index:251705344;visibility:visible;mso-wrap-style:square;mso-width-percent:0;mso-height-percent:0;mso-wrap-distance-left:9pt;mso-wrap-distance-top:0;mso-wrap-distance-right:9pt;mso-wrap-distance-bottom:0;mso-position-horizontal:absolute;mso-position-horizontal-relative:text;mso-position-vertical:absolute;mso-position-vertical-relative:text;mso-width-percent:0;mso-height-percent:0;mso-width-relative:margin;mso-height-relative:margin;v-text-anchor:middle" o:gfxdata="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" fillcolor="#9cc2e5 [1944]" strokecolor="black [3213]" strokeweight="1pt">
+              <v:shape w14:anchorId="291789E9" id="Flowchart: Alternate Process 33" o:spid="_x0000_s1044" type="#_x0000_t176" style="position:absolute;margin-left:-12pt;margin-top:15.85pt;width:60.15pt;height:20.7pt;rotation:-90;z-index:251705344;visibility:visible;mso-wrap-style:square;mso-width-percent:0;mso-height-percent:0;mso-wrap-distance-left:9pt;mso-wrap-distance-top:0;mso-wrap-distance-right:9pt;mso-wrap-distance-bottom:0;mso-position-horizontal:absolute;mso-position-horizontal-relative:text;mso-position-vertical:absolute;mso-position-vertical-relative:text;mso-width-percent:0;mso-height-percent:0;mso-width-relative:margin;mso-height-relative:margin;v-text-anchor:middle" o:gfxdata="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" fillcolor="#9cc2e5 [1944]" strokecolor="black [3213]" strokeweight="1pt">
                 <v:textbox>
                   <w:txbxContent>
                     <w:p>
@@ -4996,67 +5712,7 @@
           <w:sz w:val="18"/>
           <w:szCs w:val="20"/>
         </w:rPr>
-        <w:t>Page MJ, et al. BMJ 2021;</w:t>
-      </w:r>
-      <w:proofErr w:type="gramStart"/>
-      <w:r>
-        <w:rPr>
-          <w:rFonts w:ascii="Arial" w:hAnsi="Arial" w:cs="Arial"/>
-          <w:color w:val="000000" w:themeColor="text1"/>
-          <w:sz w:val="18"/>
-          <w:szCs w:val="20"/>
-        </w:rPr>
-        <w:t>372:n</w:t>
-      </w:r>
-      <w:proofErr w:type="gramEnd"/>
-      <w:r>
-        <w:rPr>
-          <w:rFonts w:ascii="Arial" w:hAnsi="Arial" w:cs="Arial"/>
-          <w:color w:val="000000" w:themeColor="text1"/>
-          <w:sz w:val="18"/>
-          <w:szCs w:val="20"/>
-        </w:rPr>
-        <w:t xml:space="preserve">71. </w:t>
-      </w:r>
-      <w:proofErr w:type="spellStart"/>
-      <w:r>
-        <w:rPr>
-          <w:rFonts w:ascii="Arial" w:hAnsi="Arial" w:cs="Arial"/>
-          <w:color w:val="000000" w:themeColor="text1"/>
-          <w:sz w:val="18"/>
-          <w:szCs w:val="20"/>
-        </w:rPr>
-        <w:t>doi</w:t>
-      </w:r>
-      <w:proofErr w:type="spellEnd"/>
-      <w:r>
-        <w:rPr>
-          <w:rFonts w:ascii="Arial" w:hAnsi="Arial" w:cs="Arial"/>
-          <w:color w:val="000000" w:themeColor="text1"/>
-          <w:sz w:val="18"/>
-          <w:szCs w:val="20"/>
-        </w:rPr>
-        <w:t>: 10.1136/</w:t>
-      </w:r>
-      <w:proofErr w:type="gramStart"/>
-      <w:r>
-        <w:rPr>
-          <w:rFonts w:ascii="Arial" w:hAnsi="Arial" w:cs="Arial"/>
-          <w:color w:val="000000" w:themeColor="text1"/>
-          <w:sz w:val="18"/>
-          <w:szCs w:val="20"/>
-        </w:rPr>
-        <w:t>bmj.n</w:t>
-      </w:r>
-      <w:proofErr w:type="gramEnd"/>
-      <w:r>
-        <w:rPr>
-          <w:rFonts w:ascii="Arial" w:hAnsi="Arial" w:cs="Arial"/>
-          <w:color w:val="000000" w:themeColor="text1"/>
-          <w:sz w:val="18"/>
-          <w:szCs w:val="20"/>
-        </w:rPr>
-        <w:t>71.</w:t>
+        <w:t>Page MJ, et al. BMJ 2021;372:n71. doi: 10.1136/bmj.n71.</w:t>
       </w:r>
     </w:p>
     <w:p>

</xml_diff>

<commit_message>
docs: update flow diagram to n=23, add ACM Digital Library (n=5) and citation chasing (n=5)
</commit_message>
<xml_diff>
--- a/prisma/PRISMA_2020.docx
+++ b/prisma/PRISMA_2020.docx
@@ -18,13 +18,13 @@
         <mc:AlternateContent>
           <mc:Choice Requires="wps">
             <w:drawing>
-              <wp:anchor distT="0" distB="0" distL="114300" distR="114300" simplePos="0" relativeHeight="251697152" behindDoc="0" locked="0" layoutInCell="1" allowOverlap="1" wp14:anchorId="0A1B3F5E" wp14:editId="2C955733">
+              <wp:anchor distT="0" distB="0" distL="114300" distR="114300" simplePos="0" relativeHeight="251697152" behindDoc="0" locked="0" layoutInCell="1" allowOverlap="1" wp14:anchorId="0A1B3F5E" wp14:editId="0778F907">
                 <wp:simplePos x="0" y="0"/>
                 <wp:positionH relativeFrom="column">
-                  <wp:posOffset>566928</wp:posOffset>
+                  <wp:posOffset>566420</wp:posOffset>
                 </wp:positionH>
                 <wp:positionV relativeFrom="paragraph">
-                  <wp:posOffset>74245</wp:posOffset>
+                  <wp:posOffset>16510</wp:posOffset>
                 </wp:positionV>
                 <wp:extent cx="4345229" cy="262966"/>
                 <wp:effectExtent l="0" t="0" r="17780" b="22860"/>
@@ -133,7 +133,7 @@
                 </v:formulas>
                 <v:path gradientshapeok="t" limo="10800,10800" o:connecttype="custom" o:connectlocs="@8,0;0,@9;@8,@7;@6,@9" textboxrect="@3,@3,@4,@5"/>
               </v:shapetype>
-              <v:shape id="Flowchart: Alternate Process 29" o:spid="_x0000_s1026" type="#_x0000_t176" style="position:absolute;margin-left:44.65pt;margin-top:5.85pt;width:342.15pt;height:20.7pt;z-index:251697152;visibility:visible;mso-wrap-style:square;mso-width-percent:0;mso-height-percent:0;mso-wrap-distance-left:9pt;mso-wrap-distance-top:0;mso-wrap-distance-right:9pt;mso-wrap-distance-bottom:0;mso-position-horizontal:absolute;mso-position-horizontal-relative:text;mso-position-vertical:absolute;mso-position-vertical-relative:text;mso-width-percent:0;mso-height-percent:0;mso-width-relative:margin;mso-height-relative:margin;v-text-anchor:middle" o:gfxdata="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" fillcolor="#ffc000 [3207]" strokecolor="#7f5f00 [1607]" strokeweight="1pt">
+              <v:shape id="Flowchart: Alternate Process 29" o:spid="_x0000_s1026" type="#_x0000_t176" style="position:absolute;margin-left:44.6pt;margin-top:1.3pt;width:342.15pt;height:20.7pt;z-index:251697152;visibility:visible;mso-wrap-style:square;mso-width-percent:0;mso-height-percent:0;mso-wrap-distance-left:9pt;mso-wrap-distance-top:0;mso-wrap-distance-right:9pt;mso-wrap-distance-bottom:0;mso-position-horizontal:absolute;mso-position-horizontal-relative:text;mso-position-vertical:absolute;mso-position-vertical-relative:text;mso-width-percent:0;mso-height-percent:0;mso-width-relative:margin;mso-height-relative:margin;v-text-anchor:middle" o:gfxdata="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" fillcolor="#ffc000 [3207]" strokecolor="#7f5f00 [1607]" strokeweight="1pt">
                 <v:textbox>
                   <w:txbxContent>
                     <w:p>
@@ -193,953 +193,15 @@
         <mc:AlternateContent>
           <mc:Choice Requires="wps">
             <w:drawing>
-              <wp:anchor distT="0" distB="0" distL="114300" distR="114300" simplePos="0" relativeHeight="251743232" behindDoc="0" locked="0" layoutInCell="1" allowOverlap="1" wp14:anchorId="182F8B76" wp14:editId="6378FB47">
+              <wp:anchor distT="0" distB="0" distL="114300" distR="114300" simplePos="0" relativeHeight="251745280" behindDoc="0" locked="0" layoutInCell="1" allowOverlap="1" wp14:anchorId="105884F5" wp14:editId="0774F5EA">
                 <wp:simplePos x="0" y="0"/>
                 <wp:positionH relativeFrom="column">
-                  <wp:posOffset>4689696</wp:posOffset>
+                  <wp:posOffset>4432935</wp:posOffset>
                 </wp:positionH>
                 <wp:positionV relativeFrom="paragraph">
-                  <wp:posOffset>95175</wp:posOffset>
+                  <wp:posOffset>360045</wp:posOffset>
                 </wp:positionV>
-                <wp:extent cx="1534562" cy="611044"/>
-                <wp:effectExtent l="0" t="0" r="27940" b="17780"/>
-                <wp:wrapNone/>
-                <wp:docPr id="1362377682" name="Rectangle 2"/>
-                <wp:cNvGraphicFramePr/>
-                <a:graphic xmlns:a="http://schemas.openxmlformats.org/drawingml/2006/main">
-                  <a:graphicData uri="http://schemas.microsoft.com/office/word/2010/wordprocessingShape">
-                    <wps:wsp>
-                      <wps:cNvSpPr/>
-                      <wps:spPr>
-                        <a:xfrm>
-                          <a:off x="0" y="0"/>
-                          <a:ext cx="1534562" cy="611044"/>
-                        </a:xfrm>
-                        <a:prstGeom prst="rect">
-                          <a:avLst/>
-                        </a:prstGeom>
-                        <a:noFill/>
-                        <a:ln>
-                          <a:solidFill>
-                            <a:schemeClr val="tx1"/>
-                          </a:solidFill>
-                        </a:ln>
-                      </wps:spPr>
-                      <wps:style>
-                        <a:lnRef idx="2">
-                          <a:schemeClr val="accent1">
-                            <a:shade val="50000"/>
-                          </a:schemeClr>
-                        </a:lnRef>
-                        <a:fillRef idx="1">
-                          <a:schemeClr val="accent1"/>
-                        </a:fillRef>
-                        <a:effectRef idx="0">
-                          <a:schemeClr val="accent1"/>
-                        </a:effectRef>
-                        <a:fontRef idx="minor">
-                          <a:schemeClr val="lt1"/>
-                        </a:fontRef>
-                      </wps:style>
-                      <wps:txbx>
-                        <w:txbxContent>
-                          <w:p>
-                            <w:pPr>
-                              <w:spacing w:after="0" w:line="240" w:lineRule="auto"/>
-                              <w:ind w:left="142"/>
-                              <w:rPr>
-                                <w:rFonts w:ascii="Arial" w:hAnsi="Arial" w:cs="Arial"/>
-                                <w:color w:val="000000" w:themeColor="text1"/>
-                                <w:sz w:val="18"/>
-                                <w:szCs w:val="20"/>
-                                <w:lang w:val="en-US"/>
-                              </w:rPr>
-                            </w:pPr>
-                            <w:r>
-                              <w:rPr>
-                                <w:rFonts w:ascii="Arial" w:hAnsi="Arial" w:cs="Arial"/>
-                                <w:color w:val="000000" w:themeColor="text1"/>
-                                <w:sz w:val="18"/>
-                                <w:szCs w:val="20"/>
-                                <w:lang w:val="en-US"/>
-                              </w:rPr>
-                              <w:t>Records excluded from</w:t>
-                            </w:r>
-                          </w:p>
-                          <w:p>
-                            <w:pPr>
-                              <w:spacing w:after="0" w:line="240" w:lineRule="auto"/>
-                              <w:ind w:left="142"/>
-                              <w:rPr>
-                                <w:rFonts w:ascii="Arial" w:hAnsi="Arial" w:cs="Arial"/>
-                                <w:color w:val="000000" w:themeColor="text1"/>
-                                <w:sz w:val="18"/>
-                                <w:szCs w:val="20"/>
-                                <w:lang w:val="en-US"/>
-                              </w:rPr>
-                            </w:pPr>
-                            <w:r>
-                              <w:rPr>
-                                <w:rFonts w:ascii="Arial" w:hAnsi="Arial" w:cs="Arial"/>
-                                <w:color w:val="000000" w:themeColor="text1"/>
-                                <w:sz w:val="18"/>
-                                <w:szCs w:val="20"/>
-                                <w:lang w:val="en-US"/>
-                              </w:rPr>
-                              <w:t>other met</w:t>
-                            </w:r>
-                            <w:r>
-                              <w:rPr>
-                                <w:rFonts w:ascii="Arial" w:hAnsi="Arial" w:cs="Arial"/>
-                                <w:color w:val="000000" w:themeColor="text1"/>
-                                <w:sz w:val="18"/>
-                                <w:szCs w:val="20"/>
-                                <w:lang w:val="en-US"/>
-                              </w:rPr>
-                              <w:t>h</w:t>
-                            </w:r>
-                            <w:r>
-                              <w:rPr>
-                                <w:rFonts w:ascii="Arial" w:hAnsi="Arial" w:cs="Arial"/>
-                                <w:color w:val="000000" w:themeColor="text1"/>
-                                <w:sz w:val="18"/>
-                                <w:szCs w:val="20"/>
-                                <w:lang w:val="en-US"/>
-                              </w:rPr>
-                              <w:t>ods (n = 5)</w:t>
-                            </w:r>
-                            <w:r>
-                              <w:rPr>
-                                <w:rFonts w:ascii="Arial" w:hAnsi="Arial" w:cs="Arial"/>
-                                <w:color w:val="000000" w:themeColor="text1"/>
-                                <w:sz w:val="18"/>
-                                <w:szCs w:val="20"/>
-                                <w:lang w:val="en-US"/>
-                              </w:rPr>
-                              <w:t>:</w:t>
-                            </w:r>
-                          </w:p>
-                          <w:p>
-                            <w:pPr>
-                              <w:spacing w:after="0" w:line="240" w:lineRule="auto"/>
-                              <w:ind w:left="142"/>
-                              <w:rPr>
-                                <w:rFonts w:ascii="Arial" w:hAnsi="Arial" w:cs="Arial"/>
-                                <w:color w:val="000000" w:themeColor="text1"/>
-                                <w:sz w:val="18"/>
-                                <w:szCs w:val="20"/>
-                                <w:lang w:val="en-US"/>
-                              </w:rPr>
-                            </w:pPr>
-                            <w:r>
-                              <w:rPr>
-                                <w:rFonts w:ascii="Arial" w:hAnsi="Arial" w:cs="Arial"/>
-                                <w:color w:val="000000" w:themeColor="text1"/>
-                                <w:sz w:val="18"/>
-                                <w:szCs w:val="20"/>
-                                <w:lang w:val="en-US"/>
-                              </w:rPr>
-                              <w:t xml:space="preserve">None </w:t>
-                            </w:r>
-                            <w:r>
-                              <w:rPr>
-                                <w:rFonts w:ascii="Arial" w:hAnsi="Arial" w:cs="Arial"/>
-                                <w:color w:val="000000" w:themeColor="text1"/>
-                                <w:sz w:val="18"/>
-                                <w:szCs w:val="20"/>
-                                <w:lang w:val="en-US"/>
-                              </w:rPr>
-                              <w:t>m</w:t>
-                            </w:r>
-                            <w:r>
-                              <w:rPr>
-                                <w:rFonts w:ascii="Arial" w:hAnsi="Arial" w:cs="Arial"/>
-                                <w:color w:val="000000" w:themeColor="text1"/>
-                                <w:sz w:val="18"/>
-                                <w:szCs w:val="20"/>
-                                <w:lang w:val="en-US"/>
-                              </w:rPr>
-                              <w:t>et eligibility</w:t>
-                            </w:r>
-                            <w:r>
-                              <w:rPr>
-                                <w:rFonts w:ascii="Arial" w:hAnsi="Arial" w:cs="Arial"/>
-                                <w:color w:val="000000" w:themeColor="text1"/>
-                                <w:sz w:val="18"/>
-                                <w:szCs w:val="20"/>
-                                <w:lang w:val="en-US"/>
-                              </w:rPr>
-                              <w:t xml:space="preserve"> criteria</w:t>
-                            </w:r>
-                          </w:p>
-                        </w:txbxContent>
-                      </wps:txbx>
-                      <wps:bodyPr rot="0" spcFirstLastPara="0" vertOverflow="overflow" horzOverflow="overflow" vert="horz" wrap="square" lIns="0" tIns="0" rIns="0" bIns="0" numCol="1" spcCol="0" rtlCol="0" fromWordArt="0" anchor="ctr" anchorCtr="0" forceAA="0" compatLnSpc="1">
-                        <a:prstTxWarp prst="textNoShape">
-                          <a:avLst/>
-                        </a:prstTxWarp>
-                        <a:noAutofit/>
-                      </wps:bodyPr>
-                    </wps:wsp>
-                  </a:graphicData>
-                </a:graphic>
-                <wp14:sizeRelH relativeFrom="margin">
-                  <wp14:pctWidth>0</wp14:pctWidth>
-                </wp14:sizeRelH>
-                <wp14:sizeRelV relativeFrom="margin">
-                  <wp14:pctHeight>0</wp14:pctHeight>
-                </wp14:sizeRelV>
-              </wp:anchor>
-            </w:drawing>
-          </mc:Choice>
-          <mc:Fallback>
-            <w:pict>
-              <v:rect w14:anchorId="182F8B76" id="Rectangle 2" o:spid="_x0000_s1027" style="position:absolute;margin-left:369.25pt;margin-top:7.5pt;width:120.85pt;height:48.1pt;z-index:251743232;visibility:visible;mso-wrap-style:square;mso-width-percent:0;mso-height-percent:0;mso-wrap-distance-left:9pt;mso-wrap-distance-top:0;mso-wrap-distance-right:9pt;mso-wrap-distance-bottom:0;mso-position-horizontal:absolute;mso-position-horizontal-relative:text;mso-position-vertical:absolute;mso-position-vertical-relative:text;mso-width-percent:0;mso-height-percent:0;mso-width-relative:margin;mso-height-relative:margin;v-text-anchor:middle" o:gfxdata="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" filled="f" strokecolor="black [3213]" strokeweight="1pt">
-                <v:textbox inset="0,0,0,0">
-                  <w:txbxContent>
-                    <w:p>
-                      <w:pPr>
-                        <w:spacing w:after="0" w:line="240" w:lineRule="auto"/>
-                        <w:ind w:left="142"/>
-                        <w:rPr>
-                          <w:rFonts w:ascii="Arial" w:hAnsi="Arial" w:cs="Arial"/>
-                          <w:color w:val="000000" w:themeColor="text1"/>
-                          <w:sz w:val="18"/>
-                          <w:szCs w:val="20"/>
-                          <w:lang w:val="en-US"/>
-                        </w:rPr>
-                      </w:pPr>
-                      <w:r>
-                        <w:rPr>
-                          <w:rFonts w:ascii="Arial" w:hAnsi="Arial" w:cs="Arial"/>
-                          <w:color w:val="000000" w:themeColor="text1"/>
-                          <w:sz w:val="18"/>
-                          <w:szCs w:val="20"/>
-                          <w:lang w:val="en-US"/>
-                        </w:rPr>
-                        <w:t>Records excluded from</w:t>
-                      </w:r>
-                    </w:p>
-                    <w:p>
-                      <w:pPr>
-                        <w:spacing w:after="0" w:line="240" w:lineRule="auto"/>
-                        <w:ind w:left="142"/>
-                        <w:rPr>
-                          <w:rFonts w:ascii="Arial" w:hAnsi="Arial" w:cs="Arial"/>
-                          <w:color w:val="000000" w:themeColor="text1"/>
-                          <w:sz w:val="18"/>
-                          <w:szCs w:val="20"/>
-                          <w:lang w:val="en-US"/>
-                        </w:rPr>
-                      </w:pPr>
-                      <w:r>
-                        <w:rPr>
-                          <w:rFonts w:ascii="Arial" w:hAnsi="Arial" w:cs="Arial"/>
-                          <w:color w:val="000000" w:themeColor="text1"/>
-                          <w:sz w:val="18"/>
-                          <w:szCs w:val="20"/>
-                          <w:lang w:val="en-US"/>
-                        </w:rPr>
-                        <w:t>other met</w:t>
-                      </w:r>
-                      <w:r>
-                        <w:rPr>
-                          <w:rFonts w:ascii="Arial" w:hAnsi="Arial" w:cs="Arial"/>
-                          <w:color w:val="000000" w:themeColor="text1"/>
-                          <w:sz w:val="18"/>
-                          <w:szCs w:val="20"/>
-                          <w:lang w:val="en-US"/>
-                        </w:rPr>
-                        <w:t>h</w:t>
-                      </w:r>
-                      <w:r>
-                        <w:rPr>
-                          <w:rFonts w:ascii="Arial" w:hAnsi="Arial" w:cs="Arial"/>
-                          <w:color w:val="000000" w:themeColor="text1"/>
-                          <w:sz w:val="18"/>
-                          <w:szCs w:val="20"/>
-                          <w:lang w:val="en-US"/>
-                        </w:rPr>
-                        <w:t>ods (n = 5)</w:t>
-                      </w:r>
-                      <w:r>
-                        <w:rPr>
-                          <w:rFonts w:ascii="Arial" w:hAnsi="Arial" w:cs="Arial"/>
-                          <w:color w:val="000000" w:themeColor="text1"/>
-                          <w:sz w:val="18"/>
-                          <w:szCs w:val="20"/>
-                          <w:lang w:val="en-US"/>
-                        </w:rPr>
-                        <w:t>:</w:t>
-                      </w:r>
-                    </w:p>
-                    <w:p>
-                      <w:pPr>
-                        <w:spacing w:after="0" w:line="240" w:lineRule="auto"/>
-                        <w:ind w:left="142"/>
-                        <w:rPr>
-                          <w:rFonts w:ascii="Arial" w:hAnsi="Arial" w:cs="Arial"/>
-                          <w:color w:val="000000" w:themeColor="text1"/>
-                          <w:sz w:val="18"/>
-                          <w:szCs w:val="20"/>
-                          <w:lang w:val="en-US"/>
-                        </w:rPr>
-                      </w:pPr>
-                      <w:r>
-                        <w:rPr>
-                          <w:rFonts w:ascii="Arial" w:hAnsi="Arial" w:cs="Arial"/>
-                          <w:color w:val="000000" w:themeColor="text1"/>
-                          <w:sz w:val="18"/>
-                          <w:szCs w:val="20"/>
-                          <w:lang w:val="en-US"/>
-                        </w:rPr>
-                        <w:t xml:space="preserve">None </w:t>
-                      </w:r>
-                      <w:r>
-                        <w:rPr>
-                          <w:rFonts w:ascii="Arial" w:hAnsi="Arial" w:cs="Arial"/>
-                          <w:color w:val="000000" w:themeColor="text1"/>
-                          <w:sz w:val="18"/>
-                          <w:szCs w:val="20"/>
-                          <w:lang w:val="en-US"/>
-                        </w:rPr>
-                        <w:t>m</w:t>
-                      </w:r>
-                      <w:r>
-                        <w:rPr>
-                          <w:rFonts w:ascii="Arial" w:hAnsi="Arial" w:cs="Arial"/>
-                          <w:color w:val="000000" w:themeColor="text1"/>
-                          <w:sz w:val="18"/>
-                          <w:szCs w:val="20"/>
-                          <w:lang w:val="en-US"/>
-                        </w:rPr>
-                        <w:t>et eligibility</w:t>
-                      </w:r>
-                      <w:r>
-                        <w:rPr>
-                          <w:rFonts w:ascii="Arial" w:hAnsi="Arial" w:cs="Arial"/>
-                          <w:color w:val="000000" w:themeColor="text1"/>
-                          <w:sz w:val="18"/>
-                          <w:szCs w:val="20"/>
-                          <w:lang w:val="en-US"/>
-                        </w:rPr>
-                        <w:t xml:space="preserve"> criteria</w:t>
-                      </w:r>
-                    </w:p>
-                  </w:txbxContent>
-                </v:textbox>
-              </v:rect>
-            </w:pict>
-          </mc:Fallback>
-        </mc:AlternateContent>
-      </w:r>
-      <w:r>
-        <w:rPr>
-          <w:noProof/>
-        </w:rPr>
-        <mc:AlternateContent>
-          <mc:Choice Requires="wps">
-            <w:drawing>
-              <wp:anchor distT="0" distB="0" distL="114300" distR="114300" simplePos="0" relativeHeight="251741184" behindDoc="0" locked="0" layoutInCell="1" allowOverlap="1" wp14:anchorId="473ED7E1" wp14:editId="55F8DDDD">
-                <wp:simplePos x="0" y="0"/>
-                <wp:positionH relativeFrom="column">
-                  <wp:posOffset>3040054</wp:posOffset>
-                </wp:positionH>
-                <wp:positionV relativeFrom="paragraph">
-                  <wp:posOffset>94853</wp:posOffset>
-                </wp:positionV>
-                <wp:extent cx="1399769" cy="606711"/>
-                <wp:effectExtent l="0" t="0" r="10160" b="22225"/>
-                <wp:wrapNone/>
-                <wp:docPr id="832253052" name="Rectangle 2"/>
-                <wp:cNvGraphicFramePr/>
-                <a:graphic xmlns:a="http://schemas.openxmlformats.org/drawingml/2006/main">
-                  <a:graphicData uri="http://schemas.microsoft.com/office/word/2010/wordprocessingShape">
-                    <wps:wsp>
-                      <wps:cNvSpPr/>
-                      <wps:spPr>
-                        <a:xfrm>
-                          <a:off x="0" y="0"/>
-                          <a:ext cx="1399769" cy="606711"/>
-                        </a:xfrm>
-                        <a:prstGeom prst="rect">
-                          <a:avLst/>
-                        </a:prstGeom>
-                        <a:noFill/>
-                        <a:ln w="12700">
-                          <a:solidFill>
-                            <a:schemeClr val="tx1"/>
-                          </a:solidFill>
-                          <a:prstDash val="sysDash"/>
-                          <a:round/>
-                        </a:ln>
-                      </wps:spPr>
-                      <wps:style>
-                        <a:lnRef idx="2">
-                          <a:schemeClr val="accent1">
-                            <a:shade val="50000"/>
-                          </a:schemeClr>
-                        </a:lnRef>
-                        <a:fillRef idx="1">
-                          <a:schemeClr val="accent1"/>
-                        </a:fillRef>
-                        <a:effectRef idx="0">
-                          <a:schemeClr val="accent1"/>
-                        </a:effectRef>
-                        <a:fontRef idx="minor">
-                          <a:schemeClr val="lt1"/>
-                        </a:fontRef>
-                      </wps:style>
-                      <wps:txbx>
-                        <w:txbxContent>
-                          <w:p>
-                            <w:pPr>
-                              <w:spacing w:after="0" w:line="240" w:lineRule="auto"/>
-                              <w:ind w:left="142"/>
-                              <w:rPr>
-                                <w:rFonts w:ascii="Arial" w:hAnsi="Arial" w:cs="Arial"/>
-                                <w:color w:val="000000" w:themeColor="text1"/>
-                                <w:sz w:val="18"/>
-                                <w:szCs w:val="20"/>
-                                <w:lang w:val="es-ES"/>
-                              </w:rPr>
-                            </w:pPr>
-                            <w:r>
-                              <w:rPr>
-                                <w:rFonts w:ascii="Arial" w:hAnsi="Arial" w:cs="Arial"/>
-                                <w:color w:val="000000" w:themeColor="text1"/>
-                                <w:sz w:val="18"/>
-                                <w:szCs w:val="20"/>
-                                <w:lang w:val="es-ES"/>
-                              </w:rPr>
-                              <w:t>Records identified from:</w:t>
-                            </w:r>
-                          </w:p>
-                          <w:p>
-                            <w:pPr>
-                              <w:spacing w:after="0" w:line="240" w:lineRule="auto"/>
-                              <w:ind w:left="142"/>
-                              <w:rPr>
-                                <w:rFonts w:ascii="Arial" w:hAnsi="Arial" w:cs="Arial"/>
-                                <w:color w:val="000000" w:themeColor="text1"/>
-                                <w:sz w:val="18"/>
-                                <w:szCs w:val="20"/>
-                                <w:lang w:val="es-ES"/>
-                              </w:rPr>
-                            </w:pPr>
-                            <w:r>
-                              <w:rPr>
-                                <w:rFonts w:ascii="Arial" w:hAnsi="Arial" w:cs="Arial"/>
-                                <w:color w:val="000000" w:themeColor="text1"/>
-                                <w:sz w:val="18"/>
-                                <w:szCs w:val="20"/>
-                                <w:lang w:val="es-ES"/>
-                              </w:rPr>
-                              <w:t>Other methods</w:t>
-                            </w:r>
-                          </w:p>
-                          <w:p>
-                            <w:pPr>
-                              <w:spacing w:after="0" w:line="240" w:lineRule="auto"/>
-                              <w:ind w:left="142"/>
-                              <w:rPr>
-                                <w:rFonts w:ascii="Arial" w:hAnsi="Arial" w:cs="Arial"/>
-                                <w:color w:val="000000" w:themeColor="text1"/>
-                                <w:sz w:val="18"/>
-                                <w:szCs w:val="20"/>
-                                <w:lang w:val="es-ES"/>
-                              </w:rPr>
-                            </w:pPr>
-                            <w:r>
-                              <w:rPr>
-                                <w:rFonts w:ascii="Arial" w:hAnsi="Arial" w:cs="Arial"/>
-                                <w:color w:val="000000" w:themeColor="text1"/>
-                                <w:sz w:val="18"/>
-                                <w:szCs w:val="20"/>
-                                <w:lang w:val="es-ES"/>
-                              </w:rPr>
-                              <w:t>Citation chasing (n = 5)</w:t>
-                            </w:r>
-                          </w:p>
-                        </w:txbxContent>
-                      </wps:txbx>
-                      <wps:bodyPr rot="0" spcFirstLastPara="0" vertOverflow="overflow" horzOverflow="overflow" vert="horz" wrap="square" lIns="0" tIns="0" rIns="0" bIns="0" numCol="1" spcCol="0" rtlCol="0" fromWordArt="0" anchor="ctr" anchorCtr="0" forceAA="0" compatLnSpc="1">
-                        <a:prstTxWarp prst="textNoShape">
-                          <a:avLst/>
-                        </a:prstTxWarp>
-                        <a:noAutofit/>
-                      </wps:bodyPr>
-                    </wps:wsp>
-                  </a:graphicData>
-                </a:graphic>
-                <wp14:sizeRelH relativeFrom="margin">
-                  <wp14:pctWidth>0</wp14:pctWidth>
-                </wp14:sizeRelH>
-                <wp14:sizeRelV relativeFrom="margin">
-                  <wp14:pctHeight>0</wp14:pctHeight>
-                </wp14:sizeRelV>
-              </wp:anchor>
-            </w:drawing>
-          </mc:Choice>
-          <mc:Fallback>
-            <w:pict>
-              <v:rect w14:anchorId="473ED7E1" id="_x0000_s1028" style="position:absolute;margin-left:239.35pt;margin-top:7.45pt;width:110.2pt;height:47.75pt;z-index:251741184;visibility:visible;mso-wrap-style:square;mso-width-percent:0;mso-height-percent:0;mso-wrap-distance-left:9pt;mso-wrap-distance-top:0;mso-wrap-distance-right:9pt;mso-wrap-distance-bottom:0;mso-position-horizontal:absolute;mso-position-horizontal-relative:text;mso-position-vertical:absolute;mso-position-vertical-relative:text;mso-width-percent:0;mso-height-percent:0;mso-width-relative:margin;mso-height-relative:margin;v-text-anchor:middle" o:gfxdata="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" filled="f" strokecolor="black [3213]" strokeweight="1pt">
-                <v:stroke dashstyle="3 1" joinstyle="round"/>
-                <v:textbox inset="0,0,0,0">
-                  <w:txbxContent>
-                    <w:p>
-                      <w:pPr>
-                        <w:spacing w:after="0" w:line="240" w:lineRule="auto"/>
-                        <w:ind w:left="142"/>
-                        <w:rPr>
-                          <w:rFonts w:ascii="Arial" w:hAnsi="Arial" w:cs="Arial"/>
-                          <w:color w:val="000000" w:themeColor="text1"/>
-                          <w:sz w:val="18"/>
-                          <w:szCs w:val="20"/>
-                          <w:lang w:val="es-ES"/>
-                        </w:rPr>
-                      </w:pPr>
-                      <w:r>
-                        <w:rPr>
-                          <w:rFonts w:ascii="Arial" w:hAnsi="Arial" w:cs="Arial"/>
-                          <w:color w:val="000000" w:themeColor="text1"/>
-                          <w:sz w:val="18"/>
-                          <w:szCs w:val="20"/>
-                          <w:lang w:val="es-ES"/>
-                        </w:rPr>
-                        <w:t>Records identified from:</w:t>
-                      </w:r>
-                    </w:p>
-                    <w:p>
-                      <w:pPr>
-                        <w:spacing w:after="0" w:line="240" w:lineRule="auto"/>
-                        <w:ind w:left="142"/>
-                        <w:rPr>
-                          <w:rFonts w:ascii="Arial" w:hAnsi="Arial" w:cs="Arial"/>
-                          <w:color w:val="000000" w:themeColor="text1"/>
-                          <w:sz w:val="18"/>
-                          <w:szCs w:val="20"/>
-                          <w:lang w:val="es-ES"/>
-                        </w:rPr>
-                      </w:pPr>
-                      <w:r>
-                        <w:rPr>
-                          <w:rFonts w:ascii="Arial" w:hAnsi="Arial" w:cs="Arial"/>
-                          <w:color w:val="000000" w:themeColor="text1"/>
-                          <w:sz w:val="18"/>
-                          <w:szCs w:val="20"/>
-                          <w:lang w:val="es-ES"/>
-                        </w:rPr>
-                        <w:t>Other methods</w:t>
-                      </w:r>
-                    </w:p>
-                    <w:p>
-                      <w:pPr>
-                        <w:spacing w:after="0" w:line="240" w:lineRule="auto"/>
-                        <w:ind w:left="142"/>
-                        <w:rPr>
-                          <w:rFonts w:ascii="Arial" w:hAnsi="Arial" w:cs="Arial"/>
-                          <w:color w:val="000000" w:themeColor="text1"/>
-                          <w:sz w:val="18"/>
-                          <w:szCs w:val="20"/>
-                          <w:lang w:val="es-ES"/>
-                        </w:rPr>
-                      </w:pPr>
-                      <w:r>
-                        <w:rPr>
-                          <w:rFonts w:ascii="Arial" w:hAnsi="Arial" w:cs="Arial"/>
-                          <w:color w:val="000000" w:themeColor="text1"/>
-                          <w:sz w:val="18"/>
-                          <w:szCs w:val="20"/>
-                          <w:lang w:val="es-ES"/>
-                        </w:rPr>
-                        <w:t>Citation chasing (n = 5)</w:t>
-                      </w:r>
-                    </w:p>
-                  </w:txbxContent>
-                </v:textbox>
-              </v:rect>
-            </w:pict>
-          </mc:Fallback>
-        </mc:AlternateContent>
-      </w:r>
-      <w:r>
-        <w:rPr>
-          <w:noProof/>
-        </w:rPr>
-        <mc:AlternateContent>
-          <mc:Choice Requires="wps">
-            <w:drawing>
-              <wp:anchor distT="0" distB="0" distL="114300" distR="114300" simplePos="0" relativeHeight="251659264" behindDoc="0" locked="0" layoutInCell="1" allowOverlap="1" wp14:anchorId="65FC63CD" wp14:editId="4B413295">
-                <wp:simplePos x="0" y="0"/>
-                <wp:positionH relativeFrom="column">
-                  <wp:posOffset>532140</wp:posOffset>
-                </wp:positionH>
-                <wp:positionV relativeFrom="paragraph">
-                  <wp:posOffset>140155</wp:posOffset>
-                </wp:positionV>
-                <wp:extent cx="1887220" cy="1105469"/>
-                <wp:effectExtent l="0" t="0" r="17780" b="19050"/>
-                <wp:wrapNone/>
-                <wp:docPr id="1" name="Rectangle 1"/>
-                <wp:cNvGraphicFramePr/>
-                <a:graphic xmlns:a="http://schemas.openxmlformats.org/drawingml/2006/main">
-                  <a:graphicData uri="http://schemas.microsoft.com/office/word/2010/wordprocessingShape">
-                    <wps:wsp>
-                      <wps:cNvSpPr/>
-                      <wps:spPr>
-                        <a:xfrm>
-                          <a:off x="0" y="0"/>
-                          <a:ext cx="1887220" cy="1105469"/>
-                        </a:xfrm>
-                        <a:prstGeom prst="rect">
-                          <a:avLst/>
-                        </a:prstGeom>
-                        <a:noFill/>
-                        <a:ln>
-                          <a:solidFill>
-                            <a:schemeClr val="tx1"/>
-                          </a:solidFill>
-                        </a:ln>
-                      </wps:spPr>
-                      <wps:style>
-                        <a:lnRef idx="2">
-                          <a:schemeClr val="accent1">
-                            <a:shade val="50000"/>
-                          </a:schemeClr>
-                        </a:lnRef>
-                        <a:fillRef idx="1">
-                          <a:schemeClr val="accent1"/>
-                        </a:fillRef>
-                        <a:effectRef idx="0">
-                          <a:schemeClr val="accent1"/>
-                        </a:effectRef>
-                        <a:fontRef idx="minor">
-                          <a:schemeClr val="lt1"/>
-                        </a:fontRef>
-                      </wps:style>
-                      <wps:txbx>
-                        <w:txbxContent>
-                          <w:p>
-                            <w:pPr>
-                              <w:spacing w:after="0" w:line="240" w:lineRule="auto"/>
-                              <w:rPr>
-                                <w:rFonts w:ascii="Arial" w:hAnsi="Arial" w:cs="Arial"/>
-                                <w:color w:val="000000" w:themeColor="text1"/>
-                                <w:sz w:val="18"/>
-                                <w:szCs w:val="20"/>
-                              </w:rPr>
-                            </w:pPr>
-                            <w:r>
-                              <w:rPr>
-                                <w:rFonts w:ascii="Arial" w:hAnsi="Arial" w:cs="Arial"/>
-                                <w:color w:val="000000" w:themeColor="text1"/>
-                                <w:sz w:val="18"/>
-                                <w:szCs w:val="20"/>
-                              </w:rPr>
-                              <w:t>Records identified from*:</w:t>
-                            </w:r>
-                          </w:p>
-                          <w:p>
-                            <w:pPr>
-                              <w:spacing w:after="0" w:line="240" w:lineRule="auto"/>
-                              <w:rPr>
-                                <w:rFonts w:ascii="Arial" w:hAnsi="Arial" w:cs="Arial"/>
-                                <w:color w:val="000000" w:themeColor="text1"/>
-                                <w:sz w:val="18"/>
-                                <w:szCs w:val="20"/>
-                              </w:rPr>
-                            </w:pPr>
-                            <w:r>
-                              <w:rPr>
-                                <w:rFonts w:ascii="Arial" w:hAnsi="Arial" w:cs="Arial"/>
-                                <w:color w:val="000000" w:themeColor="text1"/>
-                                <w:sz w:val="18"/>
-                                <w:szCs w:val="20"/>
-                              </w:rPr>
-                              <w:t xml:space="preserve">  Databases (n = 1,915)</w:t>
-                            </w:r>
-                          </w:p>
-                          <w:p>
-                            <w:pPr>
-                              <w:spacing w:after="0" w:line="240" w:lineRule="auto"/>
-                              <w:rPr>
-                                <w:rFonts w:ascii="Arial" w:hAnsi="Arial" w:cs="Arial"/>
-                                <w:color w:val="000000" w:themeColor="text1"/>
-                                <w:sz w:val="18"/>
-                                <w:szCs w:val="20"/>
-                              </w:rPr>
-                            </w:pPr>
-                            <w:r>
-                              <w:rPr>
-                                <w:rFonts w:ascii="Arial" w:hAnsi="Arial" w:cs="Arial"/>
-                                <w:color w:val="000000" w:themeColor="text1"/>
-                                <w:sz w:val="18"/>
-                                <w:szCs w:val="20"/>
-                              </w:rPr>
-                              <w:t xml:space="preserve">   - SCOPUS (n = 935)</w:t>
-                            </w:r>
-                          </w:p>
-                          <w:p>
-                            <w:pPr>
-                              <w:spacing w:after="0" w:line="240" w:lineRule="auto"/>
-                              <w:rPr>
-                                <w:rFonts w:ascii="Arial" w:hAnsi="Arial" w:cs="Arial"/>
-                                <w:color w:val="000000" w:themeColor="text1"/>
-                                <w:sz w:val="18"/>
-                                <w:szCs w:val="20"/>
-                              </w:rPr>
-                            </w:pPr>
-                            <w:r>
-                              <w:rPr>
-                                <w:rFonts w:ascii="Arial" w:hAnsi="Arial" w:cs="Arial"/>
-                                <w:color w:val="000000" w:themeColor="text1"/>
-                                <w:sz w:val="18"/>
-                                <w:szCs w:val="20"/>
-                              </w:rPr>
-                              <w:t xml:space="preserve">   - Web of Science (n = 942)</w:t>
-                            </w:r>
-                          </w:p>
-                          <w:p>
-                            <w:pPr>
-                              <w:spacing w:after="0" w:line="240" w:lineRule="auto"/>
-                              <w:rPr>
-                                <w:rFonts w:ascii="Arial" w:hAnsi="Arial" w:cs="Arial"/>
-                                <w:color w:val="000000" w:themeColor="text1"/>
-                                <w:sz w:val="18"/>
-                                <w:szCs w:val="20"/>
-                              </w:rPr>
-                            </w:pPr>
-                            <w:r>
-                              <w:rPr>
-                                <w:rFonts w:ascii="Arial" w:hAnsi="Arial" w:cs="Arial"/>
-                                <w:color w:val="000000" w:themeColor="text1"/>
-                                <w:sz w:val="18"/>
-                                <w:szCs w:val="20"/>
-                              </w:rPr>
-                              <w:t xml:space="preserve">   - IEEE Xplore (n = 38)</w:t>
-                            </w:r>
-                          </w:p>
-                          <w:p>
-                            <w:pPr>
-                              <w:spacing w:after="0" w:line="240" w:lineRule="auto"/>
-                              <w:rPr>
-                                <w:rFonts w:ascii="Arial" w:hAnsi="Arial" w:cs="Arial"/>
-                                <w:color w:val="000000" w:themeColor="text1"/>
-                                <w:sz w:val="18"/>
-                                <w:szCs w:val="20"/>
-                              </w:rPr>
-                            </w:pPr>
-                          </w:p>
-                          <w:p>
-                            <w:pPr>
-                              <w:spacing w:after="0" w:line="240" w:lineRule="auto"/>
-                              <w:rPr>
-                                <w:rFonts w:ascii="Arial" w:hAnsi="Arial" w:cs="Arial"/>
-                                <w:color w:val="000000" w:themeColor="text1"/>
-                                <w:sz w:val="18"/>
-                                <w:szCs w:val="20"/>
-                              </w:rPr>
-                            </w:pPr>
-                            <w:r>
-                              <w:rPr>
-                                <w:rFonts w:ascii="Arial" w:hAnsi="Arial" w:cs="Arial"/>
-                                <w:color w:val="000000" w:themeColor="text1"/>
-                                <w:sz w:val="18"/>
-                                <w:szCs w:val="20"/>
-                              </w:rPr>
-                              <w:t xml:space="preserve">  Registers (n = 0)</w:t>
-                            </w:r>
-                          </w:p>
-                        </w:txbxContent>
-                      </wps:txbx>
-                      <wps:bodyPr rot="0" spcFirstLastPara="0" vertOverflow="overflow" horzOverflow="overflow" vert="horz" wrap="square" lIns="91440" tIns="45720" rIns="91440" bIns="45720" numCol="1" spcCol="0" rtlCol="0" fromWordArt="0" anchor="ctr" anchorCtr="0" forceAA="0" compatLnSpc="1">
-                        <a:prstTxWarp prst="textNoShape">
-                          <a:avLst/>
-                        </a:prstTxWarp>
-                        <a:noAutofit/>
-                      </wps:bodyPr>
-                    </wps:wsp>
-                  </a:graphicData>
-                </a:graphic>
-                <wp14:sizeRelH relativeFrom="margin">
-                  <wp14:pctWidth>0</wp14:pctWidth>
-                </wp14:sizeRelH>
-                <wp14:sizeRelV relativeFrom="margin">
-                  <wp14:pctHeight>0</wp14:pctHeight>
-                </wp14:sizeRelV>
-              </wp:anchor>
-            </w:drawing>
-          </mc:Choice>
-          <mc:Fallback>
-            <w:pict>
-              <v:rect w14:anchorId="65FC63CD" id="Rectangle 1" o:spid="_x0000_s1029" style="position:absolute;margin-left:41.9pt;margin-top:11.05pt;width:148.6pt;height:87.05pt;z-index:251659264;visibility:visible;mso-wrap-style:square;mso-width-percent:0;mso-height-percent:0;mso-wrap-distance-left:9pt;mso-wrap-distance-top:0;mso-wrap-distance-right:9pt;mso-wrap-distance-bottom:0;mso-position-horizontal:absolute;mso-position-horizontal-relative:text;mso-position-vertical:absolute;mso-position-vertical-relative:text;mso-width-percent:0;mso-height-percent:0;mso-width-relative:margin;mso-height-relative:margin;v-text-anchor:middle" o:gfxdata="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" filled="f" strokecolor="black [3213]" strokeweight="1pt">
-                <v:textbox>
-                  <w:txbxContent>
-                    <w:p>
-                      <w:pPr>
-                        <w:spacing w:after="0" w:line="240" w:lineRule="auto"/>
-                        <w:rPr>
-                          <w:rFonts w:ascii="Arial" w:hAnsi="Arial" w:cs="Arial"/>
-                          <w:color w:val="000000" w:themeColor="text1"/>
-                          <w:sz w:val="18"/>
-                          <w:szCs w:val="20"/>
-                        </w:rPr>
-                      </w:pPr>
-                      <w:r>
-                        <w:rPr>
-                          <w:rFonts w:ascii="Arial" w:hAnsi="Arial" w:cs="Arial"/>
-                          <w:color w:val="000000" w:themeColor="text1"/>
-                          <w:sz w:val="18"/>
-                          <w:szCs w:val="20"/>
-                        </w:rPr>
-                        <w:t>Records identified from*:</w:t>
-                      </w:r>
-                    </w:p>
-                    <w:p>
-                      <w:pPr>
-                        <w:spacing w:after="0" w:line="240" w:lineRule="auto"/>
-                        <w:rPr>
-                          <w:rFonts w:ascii="Arial" w:hAnsi="Arial" w:cs="Arial"/>
-                          <w:color w:val="000000" w:themeColor="text1"/>
-                          <w:sz w:val="18"/>
-                          <w:szCs w:val="20"/>
-                        </w:rPr>
-                      </w:pPr>
-                      <w:r>
-                        <w:rPr>
-                          <w:rFonts w:ascii="Arial" w:hAnsi="Arial" w:cs="Arial"/>
-                          <w:color w:val="000000" w:themeColor="text1"/>
-                          <w:sz w:val="18"/>
-                          <w:szCs w:val="20"/>
-                        </w:rPr>
-                        <w:t xml:space="preserve">  Databases (n = 1,915)</w:t>
-                      </w:r>
-                    </w:p>
-                    <w:p>
-                      <w:pPr>
-                        <w:spacing w:after="0" w:line="240" w:lineRule="auto"/>
-                        <w:rPr>
-                          <w:rFonts w:ascii="Arial" w:hAnsi="Arial" w:cs="Arial"/>
-                          <w:color w:val="000000" w:themeColor="text1"/>
-                          <w:sz w:val="18"/>
-                          <w:szCs w:val="20"/>
-                        </w:rPr>
-                      </w:pPr>
-                      <w:r>
-                        <w:rPr>
-                          <w:rFonts w:ascii="Arial" w:hAnsi="Arial" w:cs="Arial"/>
-                          <w:color w:val="000000" w:themeColor="text1"/>
-                          <w:sz w:val="18"/>
-                          <w:szCs w:val="20"/>
-                        </w:rPr>
-                        <w:t xml:space="preserve">   - SCOPUS (n = 935)</w:t>
-                      </w:r>
-                    </w:p>
-                    <w:p>
-                      <w:pPr>
-                        <w:spacing w:after="0" w:line="240" w:lineRule="auto"/>
-                        <w:rPr>
-                          <w:rFonts w:ascii="Arial" w:hAnsi="Arial" w:cs="Arial"/>
-                          <w:color w:val="000000" w:themeColor="text1"/>
-                          <w:sz w:val="18"/>
-                          <w:szCs w:val="20"/>
-                        </w:rPr>
-                      </w:pPr>
-                      <w:r>
-                        <w:rPr>
-                          <w:rFonts w:ascii="Arial" w:hAnsi="Arial" w:cs="Arial"/>
-                          <w:color w:val="000000" w:themeColor="text1"/>
-                          <w:sz w:val="18"/>
-                          <w:szCs w:val="20"/>
-                        </w:rPr>
-                        <w:t xml:space="preserve">   - Web of Science (n = 942)</w:t>
-                      </w:r>
-                    </w:p>
-                    <w:p>
-                      <w:pPr>
-                        <w:spacing w:after="0" w:line="240" w:lineRule="auto"/>
-                        <w:rPr>
-                          <w:rFonts w:ascii="Arial" w:hAnsi="Arial" w:cs="Arial"/>
-                          <w:color w:val="000000" w:themeColor="text1"/>
-                          <w:sz w:val="18"/>
-                          <w:szCs w:val="20"/>
-                        </w:rPr>
-                      </w:pPr>
-                      <w:r>
-                        <w:rPr>
-                          <w:rFonts w:ascii="Arial" w:hAnsi="Arial" w:cs="Arial"/>
-                          <w:color w:val="000000" w:themeColor="text1"/>
-                          <w:sz w:val="18"/>
-                          <w:szCs w:val="20"/>
-                        </w:rPr>
-                        <w:t xml:space="preserve">   - IEEE Xplore (n = 38)</w:t>
-                      </w:r>
-                    </w:p>
-                    <w:p>
-                      <w:pPr>
-                        <w:spacing w:after="0" w:line="240" w:lineRule="auto"/>
-                        <w:rPr>
-                          <w:rFonts w:ascii="Arial" w:hAnsi="Arial" w:cs="Arial"/>
-                          <w:color w:val="000000" w:themeColor="text1"/>
-                          <w:sz w:val="18"/>
-                          <w:szCs w:val="20"/>
-                        </w:rPr>
-                      </w:pPr>
-                    </w:p>
-                    <w:p>
-                      <w:pPr>
-                        <w:spacing w:after="0" w:line="240" w:lineRule="auto"/>
-                        <w:rPr>
-                          <w:rFonts w:ascii="Arial" w:hAnsi="Arial" w:cs="Arial"/>
-                          <w:color w:val="000000" w:themeColor="text1"/>
-                          <w:sz w:val="18"/>
-                          <w:szCs w:val="20"/>
-                        </w:rPr>
-                      </w:pPr>
-                      <w:r>
-                        <w:rPr>
-                          <w:rFonts w:ascii="Arial" w:hAnsi="Arial" w:cs="Arial"/>
-                          <w:color w:val="000000" w:themeColor="text1"/>
-                          <w:sz w:val="18"/>
-                          <w:szCs w:val="20"/>
-                        </w:rPr>
-                        <w:t xml:space="preserve">  Registers (n = 0)</w:t>
-                      </w:r>
-                    </w:p>
-                  </w:txbxContent>
-                </v:textbox>
-              </v:rect>
-            </w:pict>
-          </mc:Fallback>
-        </mc:AlternateContent>
-      </w:r>
-    </w:p>
-    <w:p>
-      <w:pPr>
-        <w:spacing w:after="0" w:line="240" w:lineRule="auto"/>
-      </w:pPr>
-    </w:p>
-    <w:p>
-      <w:pPr>
-        <w:spacing w:after="0" w:line="240" w:lineRule="auto"/>
-      </w:pPr>
-      <w:r>
-        <w:rPr>
-          <w:noProof/>
-        </w:rPr>
-        <mc:AlternateContent>
-          <mc:Choice Requires="wps">
-            <w:drawing>
-              <wp:anchor distT="0" distB="0" distL="114300" distR="114300" simplePos="0" relativeHeight="251745280" behindDoc="0" locked="0" layoutInCell="1" allowOverlap="1" wp14:anchorId="105884F5" wp14:editId="2881AFAB">
-                <wp:simplePos x="0" y="0"/>
-                <wp:positionH relativeFrom="column">
-                  <wp:posOffset>4439457</wp:posOffset>
-                </wp:positionH>
-                <wp:positionV relativeFrom="paragraph">
-                  <wp:posOffset>57144</wp:posOffset>
-                </wp:positionV>
-                <wp:extent cx="256151" cy="0"/>
+                <wp:extent cx="255905" cy="0"/>
                 <wp:effectExtent l="0" t="76200" r="10795" b="95250"/>
                 <wp:wrapNone/>
                 <wp:docPr id="105242678" name="Straight Arrow Connector 14"/>
@@ -1151,7 +213,7 @@
                       <wps:spPr>
                         <a:xfrm flipV="1">
                           <a:off x="0" y="0"/>
-                          <a:ext cx="256151" cy="0"/>
+                          <a:ext cx="255905" cy="0"/>
                         </a:xfrm>
                         <a:prstGeom prst="straightConnector1">
                           <a:avLst/>
@@ -1192,11 +254,11 @@
           </mc:Choice>
           <mc:Fallback>
             <w:pict>
-              <v:shapetype w14:anchorId="04F7F8C2" id="_x0000_t32" coordsize="21600,21600" o:spt="32" o:oned="t" path="m,l21600,21600e" filled="f">
+              <v:shapetype w14:anchorId="7E62AC90" id="_x0000_t32" coordsize="21600,21600" o:spt="32" o:oned="t" path="m,l21600,21600e" filled="f">
                 <v:path arrowok="t" fillok="f" o:connecttype="none"/>
                 <o:lock v:ext="edit" shapetype="t"/>
               </v:shapetype>
-              <v:shape id="Straight Arrow Connector 14" o:spid="_x0000_s1026" type="#_x0000_t32" style="position:absolute;margin-left:349.55pt;margin-top:4.5pt;width:20.15pt;height:0;flip:y;z-index:251745280;visibility:visible;mso-wrap-style:square;mso-width-percent:0;mso-height-percent:0;mso-wrap-distance-left:9pt;mso-wrap-distance-top:0;mso-wrap-distance-right:9pt;mso-wrap-distance-bottom:0;mso-position-horizontal:absolute;mso-position-horizontal-relative:text;mso-position-vertical:absolute;mso-position-vertical-relative:text;mso-width-percent:0;mso-height-percent:0;mso-width-relative:margin;mso-height-relative:margin" o:gfxdata="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" strokecolor="black [3213]" strokeweight=".5pt">
+              <v:shape id="Straight Arrow Connector 14" o:spid="_x0000_s1026" type="#_x0000_t32" style="position:absolute;margin-left:349.05pt;margin-top:28.35pt;width:20.15pt;height:0;flip:y;z-index:251745280;visibility:visible;mso-wrap-style:square;mso-width-percent:0;mso-height-percent:0;mso-wrap-distance-left:9pt;mso-wrap-distance-top:0;mso-wrap-distance-right:9pt;mso-wrap-distance-bottom:0;mso-position-horizontal:absolute;mso-position-horizontal-relative:text;mso-position-vertical:absolute;mso-position-vertical-relative:text;mso-width-percent:0;mso-height-percent:0;mso-width-relative:margin;mso-height-relative:margin" o:gfxdata="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" strokecolor="black [3213]" strokeweight=".5pt">
                 <v:stroke endarrow="block" joinstyle="miter"/>
               </v:shape>
             </w:pict>
@@ -1210,7 +272,1039 @@
         <mc:AlternateContent>
           <mc:Choice Requires="wps">
             <w:drawing>
-              <wp:anchor distT="0" distB="0" distL="114300" distR="114300" simplePos="0" relativeHeight="251701248" behindDoc="0" locked="0" layoutInCell="1" allowOverlap="1" wp14:anchorId="3999D40D" wp14:editId="181AA41B">
+              <wp:anchor distT="0" distB="0" distL="114300" distR="114300" simplePos="0" relativeHeight="251741184" behindDoc="0" locked="0" layoutInCell="1" allowOverlap="1" wp14:anchorId="473ED7E1" wp14:editId="25AA0B01">
+                <wp:simplePos x="0" y="0"/>
+                <wp:positionH relativeFrom="column">
+                  <wp:posOffset>3033395</wp:posOffset>
+                </wp:positionH>
+                <wp:positionV relativeFrom="paragraph">
+                  <wp:posOffset>57150</wp:posOffset>
+                </wp:positionV>
+                <wp:extent cx="1399540" cy="606425"/>
+                <wp:effectExtent l="0" t="0" r="10160" b="22225"/>
+                <wp:wrapNone/>
+                <wp:docPr id="832253052" name="Rectangle 2"/>
+                <wp:cNvGraphicFramePr/>
+                <a:graphic xmlns:a="http://schemas.openxmlformats.org/drawingml/2006/main">
+                  <a:graphicData uri="http://schemas.microsoft.com/office/word/2010/wordprocessingShape">
+                    <wps:wsp>
+                      <wps:cNvSpPr/>
+                      <wps:spPr>
+                        <a:xfrm>
+                          <a:off x="0" y="0"/>
+                          <a:ext cx="1399540" cy="606425"/>
+                        </a:xfrm>
+                        <a:prstGeom prst="rect">
+                          <a:avLst/>
+                        </a:prstGeom>
+                        <a:noFill/>
+                        <a:ln w="12700">
+                          <a:solidFill>
+                            <a:schemeClr val="tx1"/>
+                          </a:solidFill>
+                          <a:prstDash val="sysDash"/>
+                          <a:round/>
+                        </a:ln>
+                      </wps:spPr>
+                      <wps:style>
+                        <a:lnRef idx="2">
+                          <a:schemeClr val="accent1">
+                            <a:shade val="50000"/>
+                          </a:schemeClr>
+                        </a:lnRef>
+                        <a:fillRef idx="1">
+                          <a:schemeClr val="accent1"/>
+                        </a:fillRef>
+                        <a:effectRef idx="0">
+                          <a:schemeClr val="accent1"/>
+                        </a:effectRef>
+                        <a:fontRef idx="minor">
+                          <a:schemeClr val="lt1"/>
+                        </a:fontRef>
+                      </wps:style>
+                      <wps:txbx>
+                        <w:txbxContent>
+                          <w:p>
+                            <w:pPr>
+                              <w:spacing w:after="0" w:line="240" w:lineRule="auto"/>
+                              <w:ind w:left="142"/>
+                              <w:rPr>
+                                <w:rFonts w:ascii="Arial" w:hAnsi="Arial" w:cs="Arial"/>
+                                <w:color w:val="000000" w:themeColor="text1"/>
+                                <w:sz w:val="18"/>
+                                <w:szCs w:val="20"/>
+                                <w:lang w:val="en-US"/>
+                              </w:rPr>
+                            </w:pPr>
+                            <w:r>
+                              <w:rPr>
+                                <w:rFonts w:ascii="Arial" w:hAnsi="Arial" w:cs="Arial"/>
+                                <w:color w:val="000000" w:themeColor="text1"/>
+                                <w:sz w:val="18"/>
+                                <w:szCs w:val="20"/>
+                                <w:lang w:val="en-US"/>
+                              </w:rPr>
+                              <w:t>Records identified from:</w:t>
+                            </w:r>
+                          </w:p>
+                          <w:p>
+                            <w:pPr>
+                              <w:spacing w:after="0" w:line="240" w:lineRule="auto"/>
+                              <w:ind w:left="142"/>
+                              <w:rPr>
+                                <w:rFonts w:ascii="Arial" w:hAnsi="Arial" w:cs="Arial"/>
+                                <w:color w:val="000000" w:themeColor="text1"/>
+                                <w:sz w:val="18"/>
+                                <w:szCs w:val="20"/>
+                                <w:lang w:val="en-US"/>
+                              </w:rPr>
+                            </w:pPr>
+                            <w:r>
+                              <w:rPr>
+                                <w:rFonts w:ascii="Arial" w:hAnsi="Arial" w:cs="Arial"/>
+                                <w:color w:val="000000" w:themeColor="text1"/>
+                                <w:sz w:val="18"/>
+                                <w:szCs w:val="20"/>
+                                <w:lang w:val="en-US"/>
+                              </w:rPr>
+                              <w:t>Other methods</w:t>
+                            </w:r>
+                          </w:p>
+                          <w:p>
+                            <w:pPr>
+                              <w:spacing w:after="0" w:line="240" w:lineRule="auto"/>
+                              <w:ind w:left="142"/>
+                              <w:rPr>
+                                <w:rFonts w:ascii="Arial" w:hAnsi="Arial" w:cs="Arial"/>
+                                <w:color w:val="000000" w:themeColor="text1"/>
+                                <w:sz w:val="18"/>
+                                <w:szCs w:val="20"/>
+                                <w:lang w:val="en-US"/>
+                              </w:rPr>
+                            </w:pPr>
+                            <w:r>
+                              <w:rPr>
+                                <w:rFonts w:ascii="Arial" w:hAnsi="Arial" w:cs="Arial"/>
+                                <w:color w:val="000000" w:themeColor="text1"/>
+                                <w:sz w:val="18"/>
+                                <w:szCs w:val="20"/>
+                                <w:lang w:val="en-US"/>
+                              </w:rPr>
+                              <w:t>Citation chasing (n = 5)</w:t>
+                            </w:r>
+                          </w:p>
+                        </w:txbxContent>
+                      </wps:txbx>
+                      <wps:bodyPr rot="0" spcFirstLastPara="0" vertOverflow="overflow" horzOverflow="overflow" vert="horz" wrap="square" lIns="0" tIns="0" rIns="0" bIns="0" numCol="1" spcCol="0" rtlCol="0" fromWordArt="0" anchor="ctr" anchorCtr="0" forceAA="0" compatLnSpc="1">
+                        <a:prstTxWarp prst="textNoShape">
+                          <a:avLst/>
+                        </a:prstTxWarp>
+                        <a:noAutofit/>
+                      </wps:bodyPr>
+                    </wps:wsp>
+                  </a:graphicData>
+                </a:graphic>
+                <wp14:sizeRelH relativeFrom="margin">
+                  <wp14:pctWidth>0</wp14:pctWidth>
+                </wp14:sizeRelH>
+                <wp14:sizeRelV relativeFrom="margin">
+                  <wp14:pctHeight>0</wp14:pctHeight>
+                </wp14:sizeRelV>
+              </wp:anchor>
+            </w:drawing>
+          </mc:Choice>
+          <mc:Fallback>
+            <w:pict>
+              <v:rect w14:anchorId="473ED7E1" id="Rectangle 2" o:spid="_x0000_s1027" style="position:absolute;margin-left:238.85pt;margin-top:4.5pt;width:110.2pt;height:47.75pt;z-index:251741184;visibility:visible;mso-wrap-style:square;mso-width-percent:0;mso-height-percent:0;mso-wrap-distance-left:9pt;mso-wrap-distance-top:0;mso-wrap-distance-right:9pt;mso-wrap-distance-bottom:0;mso-position-horizontal:absolute;mso-position-horizontal-relative:text;mso-position-vertical:absolute;mso-position-vertical-relative:text;mso-width-percent:0;mso-height-percent:0;mso-width-relative:margin;mso-height-relative:margin;v-text-anchor:middle" o:gfxdata="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" filled="f" strokecolor="black [3213]" strokeweight="1pt">
+                <v:stroke dashstyle="3 1" joinstyle="round"/>
+                <v:textbox inset="0,0,0,0">
+                  <w:txbxContent>
+                    <w:p>
+                      <w:pPr>
+                        <w:spacing w:after="0" w:line="240" w:lineRule="auto"/>
+                        <w:ind w:left="142"/>
+                        <w:rPr>
+                          <w:rFonts w:ascii="Arial" w:hAnsi="Arial" w:cs="Arial"/>
+                          <w:color w:val="000000" w:themeColor="text1"/>
+                          <w:sz w:val="18"/>
+                          <w:szCs w:val="20"/>
+                          <w:lang w:val="en-US"/>
+                        </w:rPr>
+                      </w:pPr>
+                      <w:r>
+                        <w:rPr>
+                          <w:rFonts w:ascii="Arial" w:hAnsi="Arial" w:cs="Arial"/>
+                          <w:color w:val="000000" w:themeColor="text1"/>
+                          <w:sz w:val="18"/>
+                          <w:szCs w:val="20"/>
+                          <w:lang w:val="en-US"/>
+                        </w:rPr>
+                        <w:t>Records identified from:</w:t>
+                      </w:r>
+                    </w:p>
+                    <w:p>
+                      <w:pPr>
+                        <w:spacing w:after="0" w:line="240" w:lineRule="auto"/>
+                        <w:ind w:left="142"/>
+                        <w:rPr>
+                          <w:rFonts w:ascii="Arial" w:hAnsi="Arial" w:cs="Arial"/>
+                          <w:color w:val="000000" w:themeColor="text1"/>
+                          <w:sz w:val="18"/>
+                          <w:szCs w:val="20"/>
+                          <w:lang w:val="en-US"/>
+                        </w:rPr>
+                      </w:pPr>
+                      <w:r>
+                        <w:rPr>
+                          <w:rFonts w:ascii="Arial" w:hAnsi="Arial" w:cs="Arial"/>
+                          <w:color w:val="000000" w:themeColor="text1"/>
+                          <w:sz w:val="18"/>
+                          <w:szCs w:val="20"/>
+                          <w:lang w:val="en-US"/>
+                        </w:rPr>
+                        <w:t>Other methods</w:t>
+                      </w:r>
+                    </w:p>
+                    <w:p>
+                      <w:pPr>
+                        <w:spacing w:after="0" w:line="240" w:lineRule="auto"/>
+                        <w:ind w:left="142"/>
+                        <w:rPr>
+                          <w:rFonts w:ascii="Arial" w:hAnsi="Arial" w:cs="Arial"/>
+                          <w:color w:val="000000" w:themeColor="text1"/>
+                          <w:sz w:val="18"/>
+                          <w:szCs w:val="20"/>
+                          <w:lang w:val="en-US"/>
+                        </w:rPr>
+                      </w:pPr>
+                      <w:r>
+                        <w:rPr>
+                          <w:rFonts w:ascii="Arial" w:hAnsi="Arial" w:cs="Arial"/>
+                          <w:color w:val="000000" w:themeColor="text1"/>
+                          <w:sz w:val="18"/>
+                          <w:szCs w:val="20"/>
+                          <w:lang w:val="en-US"/>
+                        </w:rPr>
+                        <w:t>Citation chasing (n = 5)</w:t>
+                      </w:r>
+                    </w:p>
+                  </w:txbxContent>
+                </v:textbox>
+              </v:rect>
+            </w:pict>
+          </mc:Fallback>
+        </mc:AlternateContent>
+      </w:r>
+      <w:r>
+        <w:rPr>
+          <w:noProof/>
+        </w:rPr>
+        <mc:AlternateContent>
+          <mc:Choice Requires="wps">
+            <w:drawing>
+              <wp:anchor distT="0" distB="0" distL="114300" distR="114300" simplePos="0" relativeHeight="251743232" behindDoc="0" locked="0" layoutInCell="1" allowOverlap="1" wp14:anchorId="182F8B76" wp14:editId="5E339D73">
+                <wp:simplePos x="0" y="0"/>
+                <wp:positionH relativeFrom="column">
+                  <wp:posOffset>4683125</wp:posOffset>
+                </wp:positionH>
+                <wp:positionV relativeFrom="paragraph">
+                  <wp:posOffset>57784</wp:posOffset>
+                </wp:positionV>
+                <wp:extent cx="1534160" cy="610870"/>
+                <wp:effectExtent l="0" t="0" r="27940" b="17780"/>
+                <wp:wrapNone/>
+                <wp:docPr id="1362377682" name="Rectangle 2"/>
+                <wp:cNvGraphicFramePr/>
+                <a:graphic xmlns:a="http://schemas.openxmlformats.org/drawingml/2006/main">
+                  <a:graphicData uri="http://schemas.microsoft.com/office/word/2010/wordprocessingShape">
+                    <wps:wsp>
+                      <wps:cNvSpPr/>
+                      <wps:spPr>
+                        <a:xfrm>
+                          <a:off x="0" y="0"/>
+                          <a:ext cx="1534160" cy="610870"/>
+                        </a:xfrm>
+                        <a:prstGeom prst="rect">
+                          <a:avLst/>
+                        </a:prstGeom>
+                        <a:noFill/>
+                        <a:ln>
+                          <a:solidFill>
+                            <a:schemeClr val="tx1"/>
+                          </a:solidFill>
+                        </a:ln>
+                      </wps:spPr>
+                      <wps:style>
+                        <a:lnRef idx="2">
+                          <a:schemeClr val="accent1">
+                            <a:shade val="50000"/>
+                          </a:schemeClr>
+                        </a:lnRef>
+                        <a:fillRef idx="1">
+                          <a:schemeClr val="accent1"/>
+                        </a:fillRef>
+                        <a:effectRef idx="0">
+                          <a:schemeClr val="accent1"/>
+                        </a:effectRef>
+                        <a:fontRef idx="minor">
+                          <a:schemeClr val="lt1"/>
+                        </a:fontRef>
+                      </wps:style>
+                      <wps:txbx>
+                        <w:txbxContent>
+                          <w:p>
+                            <w:pPr>
+                              <w:spacing w:after="0" w:line="240" w:lineRule="auto"/>
+                              <w:ind w:left="142"/>
+                              <w:rPr>
+                                <w:rFonts w:ascii="Arial" w:hAnsi="Arial" w:cs="Arial"/>
+                                <w:color w:val="000000" w:themeColor="text1"/>
+                                <w:sz w:val="18"/>
+                                <w:szCs w:val="20"/>
+                                <w:lang w:val="en-US"/>
+                              </w:rPr>
+                            </w:pPr>
+                            <w:r>
+                              <w:rPr>
+                                <w:rFonts w:ascii="Arial" w:hAnsi="Arial" w:cs="Arial"/>
+                                <w:color w:val="000000" w:themeColor="text1"/>
+                                <w:sz w:val="18"/>
+                                <w:szCs w:val="20"/>
+                                <w:lang w:val="en-US"/>
+                              </w:rPr>
+                              <w:t>Records excluded from</w:t>
+                            </w:r>
+                          </w:p>
+                          <w:p>
+                            <w:pPr>
+                              <w:spacing w:after="0" w:line="240" w:lineRule="auto"/>
+                              <w:ind w:left="142"/>
+                              <w:rPr>
+                                <w:rFonts w:ascii="Arial" w:hAnsi="Arial" w:cs="Arial"/>
+                                <w:color w:val="000000" w:themeColor="text1"/>
+                                <w:sz w:val="18"/>
+                                <w:szCs w:val="20"/>
+                                <w:lang w:val="en-US"/>
+                              </w:rPr>
+                            </w:pPr>
+                            <w:r>
+                              <w:rPr>
+                                <w:rFonts w:ascii="Arial" w:hAnsi="Arial" w:cs="Arial"/>
+                                <w:color w:val="000000" w:themeColor="text1"/>
+                                <w:sz w:val="18"/>
+                                <w:szCs w:val="20"/>
+                                <w:lang w:val="en-US"/>
+                              </w:rPr>
+                              <w:t>other met</w:t>
+                            </w:r>
+                            <w:r>
+                              <w:rPr>
+                                <w:rFonts w:ascii="Arial" w:hAnsi="Arial" w:cs="Arial"/>
+                                <w:color w:val="000000" w:themeColor="text1"/>
+                                <w:sz w:val="18"/>
+                                <w:szCs w:val="20"/>
+                                <w:lang w:val="en-US"/>
+                              </w:rPr>
+                              <w:t>h</w:t>
+                            </w:r>
+                            <w:r>
+                              <w:rPr>
+                                <w:rFonts w:ascii="Arial" w:hAnsi="Arial" w:cs="Arial"/>
+                                <w:color w:val="000000" w:themeColor="text1"/>
+                                <w:sz w:val="18"/>
+                                <w:szCs w:val="20"/>
+                                <w:lang w:val="en-US"/>
+                              </w:rPr>
+                              <w:t>ods (n = 5)</w:t>
+                            </w:r>
+                            <w:r>
+                              <w:rPr>
+                                <w:rFonts w:ascii="Arial" w:hAnsi="Arial" w:cs="Arial"/>
+                                <w:color w:val="000000" w:themeColor="text1"/>
+                                <w:sz w:val="18"/>
+                                <w:szCs w:val="20"/>
+                                <w:lang w:val="en-US"/>
+                              </w:rPr>
+                              <w:t>:</w:t>
+                            </w:r>
+                          </w:p>
+                          <w:p>
+                            <w:pPr>
+                              <w:spacing w:after="0" w:line="240" w:lineRule="auto"/>
+                              <w:ind w:left="142"/>
+                              <w:rPr>
+                                <w:rFonts w:ascii="Arial" w:hAnsi="Arial" w:cs="Arial"/>
+                                <w:color w:val="000000" w:themeColor="text1"/>
+                                <w:sz w:val="18"/>
+                                <w:szCs w:val="20"/>
+                                <w:lang w:val="en-US"/>
+                              </w:rPr>
+                            </w:pPr>
+                            <w:r>
+                              <w:rPr>
+                                <w:rFonts w:ascii="Arial" w:hAnsi="Arial" w:cs="Arial"/>
+                                <w:color w:val="000000" w:themeColor="text1"/>
+                                <w:sz w:val="18"/>
+                                <w:szCs w:val="20"/>
+                                <w:lang w:val="en-US"/>
+                              </w:rPr>
+                              <w:t xml:space="preserve">None </w:t>
+                            </w:r>
+                            <w:r>
+                              <w:rPr>
+                                <w:rFonts w:ascii="Arial" w:hAnsi="Arial" w:cs="Arial"/>
+                                <w:color w:val="000000" w:themeColor="text1"/>
+                                <w:sz w:val="18"/>
+                                <w:szCs w:val="20"/>
+                                <w:lang w:val="en-US"/>
+                              </w:rPr>
+                              <w:t>m</w:t>
+                            </w:r>
+                            <w:r>
+                              <w:rPr>
+                                <w:rFonts w:ascii="Arial" w:hAnsi="Arial" w:cs="Arial"/>
+                                <w:color w:val="000000" w:themeColor="text1"/>
+                                <w:sz w:val="18"/>
+                                <w:szCs w:val="20"/>
+                                <w:lang w:val="en-US"/>
+                              </w:rPr>
+                              <w:t>et eligibility</w:t>
+                            </w:r>
+                            <w:r>
+                              <w:rPr>
+                                <w:rFonts w:ascii="Arial" w:hAnsi="Arial" w:cs="Arial"/>
+                                <w:color w:val="000000" w:themeColor="text1"/>
+                                <w:sz w:val="18"/>
+                                <w:szCs w:val="20"/>
+                                <w:lang w:val="en-US"/>
+                              </w:rPr>
+                              <w:t xml:space="preserve"> criteria</w:t>
+                            </w:r>
+                          </w:p>
+                        </w:txbxContent>
+                      </wps:txbx>
+                      <wps:bodyPr rot="0" spcFirstLastPara="0" vertOverflow="overflow" horzOverflow="overflow" vert="horz" wrap="square" lIns="0" tIns="0" rIns="0" bIns="0" numCol="1" spcCol="0" rtlCol="0" fromWordArt="0" anchor="ctr" anchorCtr="0" forceAA="0" compatLnSpc="1">
+                        <a:prstTxWarp prst="textNoShape">
+                          <a:avLst/>
+                        </a:prstTxWarp>
+                        <a:noAutofit/>
+                      </wps:bodyPr>
+                    </wps:wsp>
+                  </a:graphicData>
+                </a:graphic>
+                <wp14:sizeRelH relativeFrom="margin">
+                  <wp14:pctWidth>0</wp14:pctWidth>
+                </wp14:sizeRelH>
+                <wp14:sizeRelV relativeFrom="margin">
+                  <wp14:pctHeight>0</wp14:pctHeight>
+                </wp14:sizeRelV>
+              </wp:anchor>
+            </w:drawing>
+          </mc:Choice>
+          <mc:Fallback>
+            <w:pict>
+              <v:rect w14:anchorId="182F8B76" id="_x0000_s1028" style="position:absolute;margin-left:368.75pt;margin-top:4.55pt;width:120.8pt;height:48.1pt;z-index:251743232;visibility:visible;mso-wrap-style:square;mso-width-percent:0;mso-height-percent:0;mso-wrap-distance-left:9pt;mso-wrap-distance-top:0;mso-wrap-distance-right:9pt;mso-wrap-distance-bottom:0;mso-position-horizontal:absolute;mso-position-horizontal-relative:text;mso-position-vertical:absolute;mso-position-vertical-relative:text;mso-width-percent:0;mso-height-percent:0;mso-width-relative:margin;mso-height-relative:margin;v-text-anchor:middle" o:gfxdata="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" filled="f" strokecolor="black [3213]" strokeweight="1pt">
+                <v:textbox inset="0,0,0,0">
+                  <w:txbxContent>
+                    <w:p>
+                      <w:pPr>
+                        <w:spacing w:after="0" w:line="240" w:lineRule="auto"/>
+                        <w:ind w:left="142"/>
+                        <w:rPr>
+                          <w:rFonts w:ascii="Arial" w:hAnsi="Arial" w:cs="Arial"/>
+                          <w:color w:val="000000" w:themeColor="text1"/>
+                          <w:sz w:val="18"/>
+                          <w:szCs w:val="20"/>
+                          <w:lang w:val="en-US"/>
+                        </w:rPr>
+                      </w:pPr>
+                      <w:r>
+                        <w:rPr>
+                          <w:rFonts w:ascii="Arial" w:hAnsi="Arial" w:cs="Arial"/>
+                          <w:color w:val="000000" w:themeColor="text1"/>
+                          <w:sz w:val="18"/>
+                          <w:szCs w:val="20"/>
+                          <w:lang w:val="en-US"/>
+                        </w:rPr>
+                        <w:t>Records excluded from</w:t>
+                      </w:r>
+                    </w:p>
+                    <w:p>
+                      <w:pPr>
+                        <w:spacing w:after="0" w:line="240" w:lineRule="auto"/>
+                        <w:ind w:left="142"/>
+                        <w:rPr>
+                          <w:rFonts w:ascii="Arial" w:hAnsi="Arial" w:cs="Arial"/>
+                          <w:color w:val="000000" w:themeColor="text1"/>
+                          <w:sz w:val="18"/>
+                          <w:szCs w:val="20"/>
+                          <w:lang w:val="en-US"/>
+                        </w:rPr>
+                      </w:pPr>
+                      <w:r>
+                        <w:rPr>
+                          <w:rFonts w:ascii="Arial" w:hAnsi="Arial" w:cs="Arial"/>
+                          <w:color w:val="000000" w:themeColor="text1"/>
+                          <w:sz w:val="18"/>
+                          <w:szCs w:val="20"/>
+                          <w:lang w:val="en-US"/>
+                        </w:rPr>
+                        <w:t>other met</w:t>
+                      </w:r>
+                      <w:r>
+                        <w:rPr>
+                          <w:rFonts w:ascii="Arial" w:hAnsi="Arial" w:cs="Arial"/>
+                          <w:color w:val="000000" w:themeColor="text1"/>
+                          <w:sz w:val="18"/>
+                          <w:szCs w:val="20"/>
+                          <w:lang w:val="en-US"/>
+                        </w:rPr>
+                        <w:t>h</w:t>
+                      </w:r>
+                      <w:r>
+                        <w:rPr>
+                          <w:rFonts w:ascii="Arial" w:hAnsi="Arial" w:cs="Arial"/>
+                          <w:color w:val="000000" w:themeColor="text1"/>
+                          <w:sz w:val="18"/>
+                          <w:szCs w:val="20"/>
+                          <w:lang w:val="en-US"/>
+                        </w:rPr>
+                        <w:t>ods (n = 5)</w:t>
+                      </w:r>
+                      <w:r>
+                        <w:rPr>
+                          <w:rFonts w:ascii="Arial" w:hAnsi="Arial" w:cs="Arial"/>
+                          <w:color w:val="000000" w:themeColor="text1"/>
+                          <w:sz w:val="18"/>
+                          <w:szCs w:val="20"/>
+                          <w:lang w:val="en-US"/>
+                        </w:rPr>
+                        <w:t>:</w:t>
+                      </w:r>
+                    </w:p>
+                    <w:p>
+                      <w:pPr>
+                        <w:spacing w:after="0" w:line="240" w:lineRule="auto"/>
+                        <w:ind w:left="142"/>
+                        <w:rPr>
+                          <w:rFonts w:ascii="Arial" w:hAnsi="Arial" w:cs="Arial"/>
+                          <w:color w:val="000000" w:themeColor="text1"/>
+                          <w:sz w:val="18"/>
+                          <w:szCs w:val="20"/>
+                          <w:lang w:val="en-US"/>
+                        </w:rPr>
+                      </w:pPr>
+                      <w:r>
+                        <w:rPr>
+                          <w:rFonts w:ascii="Arial" w:hAnsi="Arial" w:cs="Arial"/>
+                          <w:color w:val="000000" w:themeColor="text1"/>
+                          <w:sz w:val="18"/>
+                          <w:szCs w:val="20"/>
+                          <w:lang w:val="en-US"/>
+                        </w:rPr>
+                        <w:t xml:space="preserve">None </w:t>
+                      </w:r>
+                      <w:r>
+                        <w:rPr>
+                          <w:rFonts w:ascii="Arial" w:hAnsi="Arial" w:cs="Arial"/>
+                          <w:color w:val="000000" w:themeColor="text1"/>
+                          <w:sz w:val="18"/>
+                          <w:szCs w:val="20"/>
+                          <w:lang w:val="en-US"/>
+                        </w:rPr>
+                        <w:t>m</w:t>
+                      </w:r>
+                      <w:r>
+                        <w:rPr>
+                          <w:rFonts w:ascii="Arial" w:hAnsi="Arial" w:cs="Arial"/>
+                          <w:color w:val="000000" w:themeColor="text1"/>
+                          <w:sz w:val="18"/>
+                          <w:szCs w:val="20"/>
+                          <w:lang w:val="en-US"/>
+                        </w:rPr>
+                        <w:t>et eligibility</w:t>
+                      </w:r>
+                      <w:r>
+                        <w:rPr>
+                          <w:rFonts w:ascii="Arial" w:hAnsi="Arial" w:cs="Arial"/>
+                          <w:color w:val="000000" w:themeColor="text1"/>
+                          <w:sz w:val="18"/>
+                          <w:szCs w:val="20"/>
+                          <w:lang w:val="en-US"/>
+                        </w:rPr>
+                        <w:t xml:space="preserve"> criteria</w:t>
+                      </w:r>
+                    </w:p>
+                  </w:txbxContent>
+                </v:textbox>
+              </v:rect>
+            </w:pict>
+          </mc:Fallback>
+        </mc:AlternateContent>
+      </w:r>
+      <w:r>
+        <w:rPr>
+          <w:noProof/>
+        </w:rPr>
+        <mc:AlternateContent>
+          <mc:Choice Requires="wps">
+            <w:drawing>
+              <wp:anchor distT="0" distB="0" distL="114300" distR="114300" simplePos="0" relativeHeight="251659264" behindDoc="0" locked="0" layoutInCell="1" allowOverlap="1" wp14:anchorId="65FC63CD" wp14:editId="6543C4A7">
+                <wp:simplePos x="0" y="0"/>
+                <wp:positionH relativeFrom="column">
+                  <wp:posOffset>533400</wp:posOffset>
+                </wp:positionH>
+                <wp:positionV relativeFrom="paragraph">
+                  <wp:posOffset>57149</wp:posOffset>
+                </wp:positionV>
+                <wp:extent cx="1887220" cy="1257301"/>
+                <wp:effectExtent l="0" t="0" r="17780" b="19050"/>
+                <wp:wrapNone/>
+                <wp:docPr id="1" name="Rectangle 1"/>
+                <wp:cNvGraphicFramePr/>
+                <a:graphic xmlns:a="http://schemas.openxmlformats.org/drawingml/2006/main">
+                  <a:graphicData uri="http://schemas.microsoft.com/office/word/2010/wordprocessingShape">
+                    <wps:wsp>
+                      <wps:cNvSpPr/>
+                      <wps:spPr>
+                        <a:xfrm>
+                          <a:off x="0" y="0"/>
+                          <a:ext cx="1887220" cy="1257301"/>
+                        </a:xfrm>
+                        <a:prstGeom prst="rect">
+                          <a:avLst/>
+                        </a:prstGeom>
+                        <a:noFill/>
+                        <a:ln>
+                          <a:solidFill>
+                            <a:schemeClr val="tx1"/>
+                          </a:solidFill>
+                        </a:ln>
+                      </wps:spPr>
+                      <wps:style>
+                        <a:lnRef idx="2">
+                          <a:schemeClr val="accent1">
+                            <a:shade val="50000"/>
+                          </a:schemeClr>
+                        </a:lnRef>
+                        <a:fillRef idx="1">
+                          <a:schemeClr val="accent1"/>
+                        </a:fillRef>
+                        <a:effectRef idx="0">
+                          <a:schemeClr val="accent1"/>
+                        </a:effectRef>
+                        <a:fontRef idx="minor">
+                          <a:schemeClr val="lt1"/>
+                        </a:fontRef>
+                      </wps:style>
+                      <wps:txbx>
+                        <w:txbxContent>
+                          <w:p>
+                            <w:pPr>
+                              <w:spacing w:after="0" w:line="240" w:lineRule="auto"/>
+                              <w:rPr>
+                                <w:rFonts w:ascii="Arial" w:hAnsi="Arial" w:cs="Arial"/>
+                                <w:color w:val="000000" w:themeColor="text1"/>
+                                <w:sz w:val="18"/>
+                                <w:szCs w:val="20"/>
+                              </w:rPr>
+                            </w:pPr>
+                            <w:r>
+                              <w:rPr>
+                                <w:rFonts w:ascii="Arial" w:hAnsi="Arial" w:cs="Arial"/>
+                                <w:color w:val="000000" w:themeColor="text1"/>
+                                <w:sz w:val="18"/>
+                                <w:szCs w:val="20"/>
+                              </w:rPr>
+                              <w:t>Records identified from*:</w:t>
+                            </w:r>
+                          </w:p>
+                          <w:p>
+                            <w:pPr>
+                              <w:spacing w:after="0" w:line="240" w:lineRule="auto"/>
+                              <w:rPr>
+                                <w:rFonts w:ascii="Arial" w:hAnsi="Arial" w:cs="Arial"/>
+                                <w:color w:val="000000" w:themeColor="text1"/>
+                                <w:sz w:val="18"/>
+                                <w:szCs w:val="20"/>
+                              </w:rPr>
+                            </w:pPr>
+                            <w:r>
+                              <w:rPr>
+                                <w:rFonts w:ascii="Arial" w:hAnsi="Arial" w:cs="Arial"/>
+                                <w:color w:val="000000" w:themeColor="text1"/>
+                                <w:sz w:val="18"/>
+                                <w:szCs w:val="20"/>
+                              </w:rPr>
+                              <w:t xml:space="preserve">  Databases (n = 1,9</w:t>
+                            </w:r>
+                            <w:r>
+                              <w:rPr>
+                                <w:rFonts w:ascii="Arial" w:hAnsi="Arial" w:cs="Arial"/>
+                                <w:color w:val="000000" w:themeColor="text1"/>
+                                <w:sz w:val="18"/>
+                                <w:szCs w:val="20"/>
+                              </w:rPr>
+                              <w:t>20</w:t>
+                            </w:r>
+                            <w:r>
+                              <w:rPr>
+                                <w:rFonts w:ascii="Arial" w:hAnsi="Arial" w:cs="Arial"/>
+                                <w:color w:val="000000" w:themeColor="text1"/>
+                                <w:sz w:val="18"/>
+                                <w:szCs w:val="20"/>
+                              </w:rPr>
+                              <w:t>)</w:t>
+                            </w:r>
+                          </w:p>
+                          <w:p>
+                            <w:pPr>
+                              <w:spacing w:after="0" w:line="240" w:lineRule="auto"/>
+                              <w:rPr>
+                                <w:rFonts w:ascii="Arial" w:hAnsi="Arial" w:cs="Arial"/>
+                                <w:color w:val="000000" w:themeColor="text1"/>
+                                <w:sz w:val="18"/>
+                                <w:szCs w:val="20"/>
+                              </w:rPr>
+                            </w:pPr>
+                            <w:r>
+                              <w:rPr>
+                                <w:rFonts w:ascii="Arial" w:hAnsi="Arial" w:cs="Arial"/>
+                                <w:color w:val="000000" w:themeColor="text1"/>
+                                <w:sz w:val="18"/>
+                                <w:szCs w:val="20"/>
+                              </w:rPr>
+                              <w:t xml:space="preserve">   - SCOPUS (n = 935)</w:t>
+                            </w:r>
+                          </w:p>
+                          <w:p>
+                            <w:pPr>
+                              <w:spacing w:after="0" w:line="240" w:lineRule="auto"/>
+                              <w:rPr>
+                                <w:rFonts w:ascii="Arial" w:hAnsi="Arial" w:cs="Arial"/>
+                                <w:color w:val="000000" w:themeColor="text1"/>
+                                <w:sz w:val="18"/>
+                                <w:szCs w:val="20"/>
+                              </w:rPr>
+                            </w:pPr>
+                            <w:r>
+                              <w:rPr>
+                                <w:rFonts w:ascii="Arial" w:hAnsi="Arial" w:cs="Arial"/>
+                                <w:color w:val="000000" w:themeColor="text1"/>
+                                <w:sz w:val="18"/>
+                                <w:szCs w:val="20"/>
+                              </w:rPr>
+                              <w:t xml:space="preserve">   - Web of Science (n = 942)</w:t>
+                            </w:r>
+                          </w:p>
+                          <w:p>
+                            <w:pPr>
+                              <w:spacing w:after="0" w:line="240" w:lineRule="auto"/>
+                              <w:rPr>
+                                <w:rFonts w:ascii="Arial" w:hAnsi="Arial" w:cs="Arial"/>
+                                <w:color w:val="000000" w:themeColor="text1"/>
+                                <w:sz w:val="18"/>
+                                <w:szCs w:val="20"/>
+                              </w:rPr>
+                            </w:pPr>
+                            <w:r>
+                              <w:rPr>
+                                <w:rFonts w:ascii="Arial" w:hAnsi="Arial" w:cs="Arial"/>
+                                <w:color w:val="000000" w:themeColor="text1"/>
+                                <w:sz w:val="18"/>
+                                <w:szCs w:val="20"/>
+                              </w:rPr>
+                              <w:t xml:space="preserve">   - IEEE Xplore (n = 38)</w:t>
+                            </w:r>
+                          </w:p>
+                          <w:p>
+                            <w:pPr>
+                              <w:spacing w:after="0" w:line="240" w:lineRule="auto"/>
+                              <w:rPr>
+                                <w:rFonts w:ascii="Arial" w:hAnsi="Arial" w:cs="Arial"/>
+                                <w:color w:val="000000" w:themeColor="text1"/>
+                                <w:sz w:val="18"/>
+                                <w:szCs w:val="20"/>
+                              </w:rPr>
+                            </w:pPr>
+                            <w:r>
+                              <w:rPr>
+                                <w:rFonts w:ascii="Arial" w:hAnsi="Arial" w:cs="Arial"/>
+                                <w:color w:val="000000" w:themeColor="text1"/>
+                                <w:sz w:val="18"/>
+                                <w:szCs w:val="20"/>
+                              </w:rPr>
+                              <w:t xml:space="preserve">   - </w:t>
+                            </w:r>
+                            <w:r>
+                              <w:rPr>
+                                <w:rFonts w:ascii="Arial" w:hAnsi="Arial" w:cs="Arial"/>
+                                <w:color w:val="000000" w:themeColor="text1"/>
+                                <w:sz w:val="18"/>
+                                <w:szCs w:val="20"/>
+                              </w:rPr>
+                              <w:t>ACM Digital Library (n = 5)</w:t>
+                            </w:r>
+                          </w:p>
+                          <w:p>
+                            <w:pPr>
+                              <w:spacing w:after="0" w:line="240" w:lineRule="auto"/>
+                              <w:rPr>
+                                <w:rFonts w:ascii="Arial" w:hAnsi="Arial" w:cs="Arial"/>
+                                <w:color w:val="000000" w:themeColor="text1"/>
+                                <w:sz w:val="18"/>
+                                <w:szCs w:val="20"/>
+                              </w:rPr>
+                            </w:pPr>
+                          </w:p>
+                          <w:p>
+                            <w:pPr>
+                              <w:spacing w:after="0" w:line="240" w:lineRule="auto"/>
+                              <w:rPr>
+                                <w:rFonts w:ascii="Arial" w:hAnsi="Arial" w:cs="Arial"/>
+                                <w:color w:val="000000" w:themeColor="text1"/>
+                                <w:sz w:val="18"/>
+                                <w:szCs w:val="20"/>
+                              </w:rPr>
+                            </w:pPr>
+                            <w:r>
+                              <w:rPr>
+                                <w:rFonts w:ascii="Arial" w:hAnsi="Arial" w:cs="Arial"/>
+                                <w:color w:val="000000" w:themeColor="text1"/>
+                                <w:sz w:val="18"/>
+                                <w:szCs w:val="20"/>
+                              </w:rPr>
+                              <w:t xml:space="preserve">  Registers (n = 0)</w:t>
+                            </w:r>
+                          </w:p>
+                        </w:txbxContent>
+                      </wps:txbx>
+                      <wps:bodyPr rot="0" spcFirstLastPara="0" vertOverflow="overflow" horzOverflow="overflow" vert="horz" wrap="square" lIns="91440" tIns="45720" rIns="91440" bIns="45720" numCol="1" spcCol="0" rtlCol="0" fromWordArt="0" anchor="ctr" anchorCtr="0" forceAA="0" compatLnSpc="1">
+                        <a:prstTxWarp prst="textNoShape">
+                          <a:avLst/>
+                        </a:prstTxWarp>
+                        <a:noAutofit/>
+                      </wps:bodyPr>
+                    </wps:wsp>
+                  </a:graphicData>
+                </a:graphic>
+                <wp14:sizeRelH relativeFrom="margin">
+                  <wp14:pctWidth>0</wp14:pctWidth>
+                </wp14:sizeRelH>
+                <wp14:sizeRelV relativeFrom="margin">
+                  <wp14:pctHeight>0</wp14:pctHeight>
+                </wp14:sizeRelV>
+              </wp:anchor>
+            </w:drawing>
+          </mc:Choice>
+          <mc:Fallback>
+            <w:pict>
+              <v:rect w14:anchorId="65FC63CD" id="Rectangle 1" o:spid="_x0000_s1029" style="position:absolute;margin-left:42pt;margin-top:4.5pt;width:148.6pt;height:99pt;z-index:251659264;visibility:visible;mso-wrap-style:square;mso-width-percent:0;mso-height-percent:0;mso-wrap-distance-left:9pt;mso-wrap-distance-top:0;mso-wrap-distance-right:9pt;mso-wrap-distance-bottom:0;mso-position-horizontal:absolute;mso-position-horizontal-relative:text;mso-position-vertical:absolute;mso-position-vertical-relative:text;mso-width-percent:0;mso-height-percent:0;mso-width-relative:margin;mso-height-relative:margin;v-text-anchor:middle" o:gfxdata="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" filled="f" strokecolor="black [3213]" strokeweight="1pt">
+                <v:textbox>
+                  <w:txbxContent>
+                    <w:p>
+                      <w:pPr>
+                        <w:spacing w:after="0" w:line="240" w:lineRule="auto"/>
+                        <w:rPr>
+                          <w:rFonts w:ascii="Arial" w:hAnsi="Arial" w:cs="Arial"/>
+                          <w:color w:val="000000" w:themeColor="text1"/>
+                          <w:sz w:val="18"/>
+                          <w:szCs w:val="20"/>
+                        </w:rPr>
+                      </w:pPr>
+                      <w:r>
+                        <w:rPr>
+                          <w:rFonts w:ascii="Arial" w:hAnsi="Arial" w:cs="Arial"/>
+                          <w:color w:val="000000" w:themeColor="text1"/>
+                          <w:sz w:val="18"/>
+                          <w:szCs w:val="20"/>
+                        </w:rPr>
+                        <w:t>Records identified from*:</w:t>
+                      </w:r>
+                    </w:p>
+                    <w:p>
+                      <w:pPr>
+                        <w:spacing w:after="0" w:line="240" w:lineRule="auto"/>
+                        <w:rPr>
+                          <w:rFonts w:ascii="Arial" w:hAnsi="Arial" w:cs="Arial"/>
+                          <w:color w:val="000000" w:themeColor="text1"/>
+                          <w:sz w:val="18"/>
+                          <w:szCs w:val="20"/>
+                        </w:rPr>
+                      </w:pPr>
+                      <w:r>
+                        <w:rPr>
+                          <w:rFonts w:ascii="Arial" w:hAnsi="Arial" w:cs="Arial"/>
+                          <w:color w:val="000000" w:themeColor="text1"/>
+                          <w:sz w:val="18"/>
+                          <w:szCs w:val="20"/>
+                        </w:rPr>
+                        <w:t xml:space="preserve">  Databases (n = 1,9</w:t>
+                      </w:r>
+                      <w:r>
+                        <w:rPr>
+                          <w:rFonts w:ascii="Arial" w:hAnsi="Arial" w:cs="Arial"/>
+                          <w:color w:val="000000" w:themeColor="text1"/>
+                          <w:sz w:val="18"/>
+                          <w:szCs w:val="20"/>
+                        </w:rPr>
+                        <w:t>20</w:t>
+                      </w:r>
+                      <w:r>
+                        <w:rPr>
+                          <w:rFonts w:ascii="Arial" w:hAnsi="Arial" w:cs="Arial"/>
+                          <w:color w:val="000000" w:themeColor="text1"/>
+                          <w:sz w:val="18"/>
+                          <w:szCs w:val="20"/>
+                        </w:rPr>
+                        <w:t>)</w:t>
+                      </w:r>
+                    </w:p>
+                    <w:p>
+                      <w:pPr>
+                        <w:spacing w:after="0" w:line="240" w:lineRule="auto"/>
+                        <w:rPr>
+                          <w:rFonts w:ascii="Arial" w:hAnsi="Arial" w:cs="Arial"/>
+                          <w:color w:val="000000" w:themeColor="text1"/>
+                          <w:sz w:val="18"/>
+                          <w:szCs w:val="20"/>
+                        </w:rPr>
+                      </w:pPr>
+                      <w:r>
+                        <w:rPr>
+                          <w:rFonts w:ascii="Arial" w:hAnsi="Arial" w:cs="Arial"/>
+                          <w:color w:val="000000" w:themeColor="text1"/>
+                          <w:sz w:val="18"/>
+                          <w:szCs w:val="20"/>
+                        </w:rPr>
+                        <w:t xml:space="preserve">   - SCOPUS (n = 935)</w:t>
+                      </w:r>
+                    </w:p>
+                    <w:p>
+                      <w:pPr>
+                        <w:spacing w:after="0" w:line="240" w:lineRule="auto"/>
+                        <w:rPr>
+                          <w:rFonts w:ascii="Arial" w:hAnsi="Arial" w:cs="Arial"/>
+                          <w:color w:val="000000" w:themeColor="text1"/>
+                          <w:sz w:val="18"/>
+                          <w:szCs w:val="20"/>
+                        </w:rPr>
+                      </w:pPr>
+                      <w:r>
+                        <w:rPr>
+                          <w:rFonts w:ascii="Arial" w:hAnsi="Arial" w:cs="Arial"/>
+                          <w:color w:val="000000" w:themeColor="text1"/>
+                          <w:sz w:val="18"/>
+                          <w:szCs w:val="20"/>
+                        </w:rPr>
+                        <w:t xml:space="preserve">   - Web of Science (n = 942)</w:t>
+                      </w:r>
+                    </w:p>
+                    <w:p>
+                      <w:pPr>
+                        <w:spacing w:after="0" w:line="240" w:lineRule="auto"/>
+                        <w:rPr>
+                          <w:rFonts w:ascii="Arial" w:hAnsi="Arial" w:cs="Arial"/>
+                          <w:color w:val="000000" w:themeColor="text1"/>
+                          <w:sz w:val="18"/>
+                          <w:szCs w:val="20"/>
+                        </w:rPr>
+                      </w:pPr>
+                      <w:r>
+                        <w:rPr>
+                          <w:rFonts w:ascii="Arial" w:hAnsi="Arial" w:cs="Arial"/>
+                          <w:color w:val="000000" w:themeColor="text1"/>
+                          <w:sz w:val="18"/>
+                          <w:szCs w:val="20"/>
+                        </w:rPr>
+                        <w:t xml:space="preserve">   - IEEE Xplore (n = 38)</w:t>
+                      </w:r>
+                    </w:p>
+                    <w:p>
+                      <w:pPr>
+                        <w:spacing w:after="0" w:line="240" w:lineRule="auto"/>
+                        <w:rPr>
+                          <w:rFonts w:ascii="Arial" w:hAnsi="Arial" w:cs="Arial"/>
+                          <w:color w:val="000000" w:themeColor="text1"/>
+                          <w:sz w:val="18"/>
+                          <w:szCs w:val="20"/>
+                        </w:rPr>
+                      </w:pPr>
+                      <w:r>
+                        <w:rPr>
+                          <w:rFonts w:ascii="Arial" w:hAnsi="Arial" w:cs="Arial"/>
+                          <w:color w:val="000000" w:themeColor="text1"/>
+                          <w:sz w:val="18"/>
+                          <w:szCs w:val="20"/>
+                        </w:rPr>
+                        <w:t xml:space="preserve">   - </w:t>
+                      </w:r>
+                      <w:r>
+                        <w:rPr>
+                          <w:rFonts w:ascii="Arial" w:hAnsi="Arial" w:cs="Arial"/>
+                          <w:color w:val="000000" w:themeColor="text1"/>
+                          <w:sz w:val="18"/>
+                          <w:szCs w:val="20"/>
+                        </w:rPr>
+                        <w:t>ACM Digital Library (n = 5)</w:t>
+                      </w:r>
+                    </w:p>
+                    <w:p>
+                      <w:pPr>
+                        <w:spacing w:after="0" w:line="240" w:lineRule="auto"/>
+                        <w:rPr>
+                          <w:rFonts w:ascii="Arial" w:hAnsi="Arial" w:cs="Arial"/>
+                          <w:color w:val="000000" w:themeColor="text1"/>
+                          <w:sz w:val="18"/>
+                          <w:szCs w:val="20"/>
+                        </w:rPr>
+                      </w:pPr>
+                    </w:p>
+                    <w:p>
+                      <w:pPr>
+                        <w:spacing w:after="0" w:line="240" w:lineRule="auto"/>
+                        <w:rPr>
+                          <w:rFonts w:ascii="Arial" w:hAnsi="Arial" w:cs="Arial"/>
+                          <w:color w:val="000000" w:themeColor="text1"/>
+                          <w:sz w:val="18"/>
+                          <w:szCs w:val="20"/>
+                        </w:rPr>
+                      </w:pPr>
+                      <w:r>
+                        <w:rPr>
+                          <w:rFonts w:ascii="Arial" w:hAnsi="Arial" w:cs="Arial"/>
+                          <w:color w:val="000000" w:themeColor="text1"/>
+                          <w:sz w:val="18"/>
+                          <w:szCs w:val="20"/>
+                        </w:rPr>
+                        <w:t xml:space="preserve">  Registers (n = 0)</w:t>
+                      </w:r>
+                    </w:p>
+                  </w:txbxContent>
+                </v:textbox>
+              </v:rect>
+            </w:pict>
+          </mc:Fallback>
+        </mc:AlternateContent>
+      </w:r>
+    </w:p>
+    <w:p>
+      <w:pPr>
+        <w:spacing w:after="0" w:line="240" w:lineRule="auto"/>
+      </w:pPr>
+    </w:p>
+    <w:p>
+      <w:pPr>
+        <w:spacing w:after="0" w:line="240" w:lineRule="auto"/>
+      </w:pPr>
+      <w:r>
+        <w:rPr>
+          <w:noProof/>
+        </w:rPr>
+        <mc:AlternateContent>
+          <mc:Choice Requires="wps">
+            <w:drawing>
+              <wp:anchor distT="0" distB="0" distL="114300" distR="114300" simplePos="0" relativeHeight="251701248" behindDoc="0" locked="0" layoutInCell="1" allowOverlap="1" wp14:anchorId="3999D40D" wp14:editId="73DC2B82">
                 <wp:simplePos x="0" y="0"/>
                 <wp:positionH relativeFrom="column">
                   <wp:posOffset>-403543</wp:posOffset>
@@ -1353,11 +1447,6 @@
       <w:pPr>
         <w:spacing w:after="0" w:line="240" w:lineRule="auto"/>
       </w:pPr>
-    </w:p>
-    <w:p>
-      <w:pPr>
-        <w:spacing w:after="0" w:line="240" w:lineRule="auto"/>
-      </w:pPr>
       <w:r>
         <w:rPr>
           <w:noProof/>
@@ -1365,16 +1454,16 @@
         <mc:AlternateContent>
           <mc:Choice Requires="wps">
             <w:drawing>
-              <wp:anchor distT="0" distB="0" distL="114300" distR="114300" simplePos="0" relativeHeight="251661312" behindDoc="0" locked="0" layoutInCell="1" allowOverlap="1" wp14:anchorId="07961AC4" wp14:editId="2FC919A5">
+              <wp:anchor distT="0" distB="0" distL="114300" distR="114300" simplePos="0" relativeHeight="251661312" behindDoc="0" locked="0" layoutInCell="1" allowOverlap="1" wp14:anchorId="07961AC4" wp14:editId="7D2C4041">
                 <wp:simplePos x="0" y="0"/>
                 <wp:positionH relativeFrom="column">
                   <wp:posOffset>3048000</wp:posOffset>
                 </wp:positionH>
                 <wp:positionV relativeFrom="paragraph">
-                  <wp:posOffset>6350</wp:posOffset>
+                  <wp:posOffset>54609</wp:posOffset>
                 </wp:positionV>
-                <wp:extent cx="3067050" cy="661035"/>
-                <wp:effectExtent l="0" t="0" r="19050" b="24765"/>
+                <wp:extent cx="3178810" cy="876300"/>
+                <wp:effectExtent l="0" t="0" r="21590" b="19050"/>
                 <wp:wrapNone/>
                 <wp:docPr id="2" name="Rectangle 2"/>
                 <wp:cNvGraphicFramePr/>
@@ -1385,7 +1474,7 @@
                       <wps:spPr>
                         <a:xfrm>
                           <a:off x="0" y="0"/>
-                          <a:ext cx="3067050" cy="661035"/>
+                          <a:ext cx="3178810" cy="876300"/>
                         </a:xfrm>
                         <a:prstGeom prst="rect">
                           <a:avLst/>
@@ -1454,7 +1543,25 @@
                                 <w:sz w:val="18"/>
                                 <w:szCs w:val="20"/>
                               </w:rPr>
-                              <w:t xml:space="preserve">  Duplicate records removed (n = 1,002)</w:t>
+                              <w:t xml:space="preserve">  </w:t>
+                            </w:r>
+                            <w:r>
+                              <w:rPr>
+                                <w:rFonts w:ascii="Arial" w:hAnsi="Arial" w:cs="Arial"/>
+                                <w:color w:val="000000" w:themeColor="text1"/>
+                                <w:sz w:val="18"/>
+                                <w:szCs w:val="20"/>
+                              </w:rPr>
+                              <w:t xml:space="preserve">- </w:t>
+                            </w:r>
+                            <w:r>
+                              <w:rPr>
+                                <w:rFonts w:ascii="Arial" w:hAnsi="Arial" w:cs="Arial"/>
+                                <w:color w:val="000000" w:themeColor="text1"/>
+                                <w:sz w:val="18"/>
+                                <w:szCs w:val="20"/>
+                              </w:rPr>
+                              <w:t>Duplicate records removed (n = 1,002)</w:t>
                             </w:r>
                           </w:p>
                           <w:p>
@@ -1475,7 +1582,36 @@
                                 <w:sz w:val="18"/>
                                 <w:szCs w:val="20"/>
                               </w:rPr>
-                              <w:t xml:space="preserve">  Records marked as ineligible by automation tools (n = 0)</w:t>
+                              <w:t xml:space="preserve">  - </w:t>
+                            </w:r>
+                            <w:r>
+                              <w:rPr>
+                                <w:rFonts w:ascii="Arial" w:hAnsi="Arial" w:cs="Arial"/>
+                                <w:color w:val="000000" w:themeColor="text1"/>
+                                <w:sz w:val="18"/>
+                                <w:szCs w:val="20"/>
+                              </w:rPr>
+                              <w:t xml:space="preserve">ACM records excluded </w:t>
+                            </w:r>
+                            <w:proofErr w:type="gramStart"/>
+                            <w:r>
+                              <w:rPr>
+                                <w:rFonts w:ascii="Arial" w:hAnsi="Arial" w:cs="Arial"/>
+                                <w:color w:val="000000" w:themeColor="text1"/>
+                                <w:sz w:val="18"/>
+                                <w:szCs w:val="20"/>
+                              </w:rPr>
+                              <w:t>CI(</w:t>
+                            </w:r>
+                            <w:proofErr w:type="gramEnd"/>
+                            <w:r>
+                              <w:rPr>
+                                <w:rFonts w:ascii="Arial" w:hAnsi="Arial" w:cs="Arial"/>
+                                <w:color w:val="000000" w:themeColor="text1"/>
+                                <w:sz w:val="18"/>
+                                <w:szCs w:val="20"/>
+                              </w:rPr>
+                              <w:t>4) not OA (n = 5)</w:t>
                             </w:r>
                           </w:p>
                           <w:p>
@@ -1496,7 +1632,85 @@
                                 <w:sz w:val="18"/>
                                 <w:szCs w:val="20"/>
                               </w:rPr>
-                              <w:t xml:space="preserve">  Records removed for other reasons (n = 0)</w:t>
+                              <w:t xml:space="preserve">  </w:t>
+                            </w:r>
+                            <w:r>
+                              <w:rPr>
+                                <w:rFonts w:ascii="Arial" w:hAnsi="Arial" w:cs="Arial"/>
+                                <w:color w:val="000000" w:themeColor="text1"/>
+                                <w:sz w:val="18"/>
+                                <w:szCs w:val="20"/>
+                              </w:rPr>
+                              <w:t xml:space="preserve">- </w:t>
+                            </w:r>
+                            <w:r>
+                              <w:rPr>
+                                <w:rFonts w:ascii="Arial" w:hAnsi="Arial" w:cs="Arial"/>
+                                <w:color w:val="000000" w:themeColor="text1"/>
+                                <w:sz w:val="18"/>
+                                <w:szCs w:val="20"/>
+                              </w:rPr>
+                              <w:t>Records marked as ineligible by automation tools (n = 0)</w:t>
+                            </w:r>
+                          </w:p>
+                          <w:p>
+                            <w:pPr>
+                              <w:spacing w:after="0" w:line="240" w:lineRule="auto"/>
+                              <w:ind w:left="142"/>
+                              <w:rPr>
+                                <w:rFonts w:ascii="Arial" w:hAnsi="Arial" w:cs="Arial"/>
+                                <w:color w:val="000000" w:themeColor="text1"/>
+                                <w:sz w:val="18"/>
+                                <w:szCs w:val="20"/>
+                              </w:rPr>
+                            </w:pPr>
+                            <w:r>
+                              <w:rPr>
+                                <w:rFonts w:ascii="Arial" w:hAnsi="Arial" w:cs="Arial"/>
+                                <w:color w:val="000000" w:themeColor="text1"/>
+                                <w:sz w:val="18"/>
+                                <w:szCs w:val="20"/>
+                              </w:rPr>
+                              <w:t xml:space="preserve">  </w:t>
+                            </w:r>
+                            <w:r>
+                              <w:rPr>
+                                <w:rFonts w:ascii="Arial" w:hAnsi="Arial" w:cs="Arial"/>
+                                <w:color w:val="000000" w:themeColor="text1"/>
+                                <w:sz w:val="18"/>
+                                <w:szCs w:val="20"/>
+                              </w:rPr>
+                              <w:t xml:space="preserve">- </w:t>
+                            </w:r>
+                            <w:r>
+                              <w:rPr>
+                                <w:rFonts w:ascii="Arial" w:hAnsi="Arial" w:cs="Arial"/>
+                                <w:color w:val="000000" w:themeColor="text1"/>
+                                <w:sz w:val="18"/>
+                                <w:szCs w:val="20"/>
+                              </w:rPr>
+                              <w:t>Records removed for other reasons (n = 0)</w:t>
+                            </w:r>
+                          </w:p>
+                          <w:p>
+                            <w:pPr>
+                              <w:spacing w:after="0" w:line="240" w:lineRule="auto"/>
+                              <w:ind w:left="142"/>
+                              <w:rPr>
+                                <w:rFonts w:ascii="Arial" w:hAnsi="Arial" w:cs="Arial"/>
+                                <w:color w:val="000000" w:themeColor="text1"/>
+                                <w:sz w:val="18"/>
+                                <w:szCs w:val="20"/>
+                              </w:rPr>
+                            </w:pPr>
+                            <w:r>
+                              <w:rPr>
+                                <w:rFonts w:ascii="Arial" w:hAnsi="Arial" w:cs="Arial"/>
+                                <w:color w:val="000000" w:themeColor="text1"/>
+                                <w:sz w:val="18"/>
+                                <w:szCs w:val="20"/>
+                              </w:rPr>
+                              <w:t>Total removed (n = 1,007)</w:t>
                             </w:r>
                           </w:p>
                         </w:txbxContent>
@@ -1521,7 +1735,7 @@
           </mc:Choice>
           <mc:Fallback>
             <w:pict>
-              <v:rect w14:anchorId="07961AC4" id="_x0000_s1031" style="position:absolute;margin-left:240pt;margin-top:.5pt;width:241.5pt;height:52.05pt;z-index:251661312;visibility:visible;mso-wrap-style:square;mso-width-percent:0;mso-height-percent:0;mso-wrap-distance-left:9pt;mso-wrap-distance-top:0;mso-wrap-distance-right:9pt;mso-wrap-distance-bottom:0;mso-position-horizontal:absolute;mso-position-horizontal-relative:text;mso-position-vertical:absolute;mso-position-vertical-relative:text;mso-width-percent:0;mso-height-percent:0;mso-width-relative:margin;mso-height-relative:margin;v-text-anchor:middle" o:gfxdata="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" filled="f" strokecolor="black [3213]" strokeweight="1pt">
+              <v:rect w14:anchorId="07961AC4" id="_x0000_s1031" style="position:absolute;margin-left:240pt;margin-top:4.3pt;width:250.3pt;height:69pt;z-index:251661312;visibility:visible;mso-wrap-style:square;mso-width-percent:0;mso-height-percent:0;mso-wrap-distance-left:9pt;mso-wrap-distance-top:0;mso-wrap-distance-right:9pt;mso-wrap-distance-bottom:0;mso-position-horizontal:absolute;mso-position-horizontal-relative:text;mso-position-vertical:absolute;mso-position-vertical-relative:text;mso-width-percent:0;mso-height-percent:0;mso-width-relative:margin;mso-height-relative:margin;v-text-anchor:middle" o:gfxdata="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" filled="f" strokecolor="black [3213]" strokeweight="1pt">
                 <v:textbox inset="0,0,0,0">
                   <w:txbxContent>
                     <w:p>
@@ -1563,7 +1777,25 @@
                           <w:sz w:val="18"/>
                           <w:szCs w:val="20"/>
                         </w:rPr>
-                        <w:t xml:space="preserve">  Duplicate records removed (n = 1,002)</w:t>
+                        <w:t xml:space="preserve">  </w:t>
+                      </w:r>
+                      <w:r>
+                        <w:rPr>
+                          <w:rFonts w:ascii="Arial" w:hAnsi="Arial" w:cs="Arial"/>
+                          <w:color w:val="000000" w:themeColor="text1"/>
+                          <w:sz w:val="18"/>
+                          <w:szCs w:val="20"/>
+                        </w:rPr>
+                        <w:t xml:space="preserve">- </w:t>
+                      </w:r>
+                      <w:r>
+                        <w:rPr>
+                          <w:rFonts w:ascii="Arial" w:hAnsi="Arial" w:cs="Arial"/>
+                          <w:color w:val="000000" w:themeColor="text1"/>
+                          <w:sz w:val="18"/>
+                          <w:szCs w:val="20"/>
+                        </w:rPr>
+                        <w:t>Duplicate records removed (n = 1,002)</w:t>
                       </w:r>
                     </w:p>
                     <w:p>
@@ -1584,7 +1816,36 @@
                           <w:sz w:val="18"/>
                           <w:szCs w:val="20"/>
                         </w:rPr>
-                        <w:t xml:space="preserve">  Records marked as ineligible by automation tools (n = 0)</w:t>
+                        <w:t xml:space="preserve">  - </w:t>
+                      </w:r>
+                      <w:r>
+                        <w:rPr>
+                          <w:rFonts w:ascii="Arial" w:hAnsi="Arial" w:cs="Arial"/>
+                          <w:color w:val="000000" w:themeColor="text1"/>
+                          <w:sz w:val="18"/>
+                          <w:szCs w:val="20"/>
+                        </w:rPr>
+                        <w:t xml:space="preserve">ACM records excluded </w:t>
+                      </w:r>
+                      <w:proofErr w:type="gramStart"/>
+                      <w:r>
+                        <w:rPr>
+                          <w:rFonts w:ascii="Arial" w:hAnsi="Arial" w:cs="Arial"/>
+                          <w:color w:val="000000" w:themeColor="text1"/>
+                          <w:sz w:val="18"/>
+                          <w:szCs w:val="20"/>
+                        </w:rPr>
+                        <w:t>CI(</w:t>
+                      </w:r>
+                      <w:proofErr w:type="gramEnd"/>
+                      <w:r>
+                        <w:rPr>
+                          <w:rFonts w:ascii="Arial" w:hAnsi="Arial" w:cs="Arial"/>
+                          <w:color w:val="000000" w:themeColor="text1"/>
+                          <w:sz w:val="18"/>
+                          <w:szCs w:val="20"/>
+                        </w:rPr>
+                        <w:t>4) not OA (n = 5)</w:t>
                       </w:r>
                     </w:p>
                     <w:p>
@@ -1605,7 +1866,85 @@
                           <w:sz w:val="18"/>
                           <w:szCs w:val="20"/>
                         </w:rPr>
-                        <w:t xml:space="preserve">  Records removed for other reasons (n = 0)</w:t>
+                        <w:t xml:space="preserve">  </w:t>
+                      </w:r>
+                      <w:r>
+                        <w:rPr>
+                          <w:rFonts w:ascii="Arial" w:hAnsi="Arial" w:cs="Arial"/>
+                          <w:color w:val="000000" w:themeColor="text1"/>
+                          <w:sz w:val="18"/>
+                          <w:szCs w:val="20"/>
+                        </w:rPr>
+                        <w:t xml:space="preserve">- </w:t>
+                      </w:r>
+                      <w:r>
+                        <w:rPr>
+                          <w:rFonts w:ascii="Arial" w:hAnsi="Arial" w:cs="Arial"/>
+                          <w:color w:val="000000" w:themeColor="text1"/>
+                          <w:sz w:val="18"/>
+                          <w:szCs w:val="20"/>
+                        </w:rPr>
+                        <w:t>Records marked as ineligible by automation tools (n = 0)</w:t>
+                      </w:r>
+                    </w:p>
+                    <w:p>
+                      <w:pPr>
+                        <w:spacing w:after="0" w:line="240" w:lineRule="auto"/>
+                        <w:ind w:left="142"/>
+                        <w:rPr>
+                          <w:rFonts w:ascii="Arial" w:hAnsi="Arial" w:cs="Arial"/>
+                          <w:color w:val="000000" w:themeColor="text1"/>
+                          <w:sz w:val="18"/>
+                          <w:szCs w:val="20"/>
+                        </w:rPr>
+                      </w:pPr>
+                      <w:r>
+                        <w:rPr>
+                          <w:rFonts w:ascii="Arial" w:hAnsi="Arial" w:cs="Arial"/>
+                          <w:color w:val="000000" w:themeColor="text1"/>
+                          <w:sz w:val="18"/>
+                          <w:szCs w:val="20"/>
+                        </w:rPr>
+                        <w:t xml:space="preserve">  </w:t>
+                      </w:r>
+                      <w:r>
+                        <w:rPr>
+                          <w:rFonts w:ascii="Arial" w:hAnsi="Arial" w:cs="Arial"/>
+                          <w:color w:val="000000" w:themeColor="text1"/>
+                          <w:sz w:val="18"/>
+                          <w:szCs w:val="20"/>
+                        </w:rPr>
+                        <w:t xml:space="preserve">- </w:t>
+                      </w:r>
+                      <w:r>
+                        <w:rPr>
+                          <w:rFonts w:ascii="Arial" w:hAnsi="Arial" w:cs="Arial"/>
+                          <w:color w:val="000000" w:themeColor="text1"/>
+                          <w:sz w:val="18"/>
+                          <w:szCs w:val="20"/>
+                        </w:rPr>
+                        <w:t>Records removed for other reasons (n = 0)</w:t>
+                      </w:r>
+                    </w:p>
+                    <w:p>
+                      <w:pPr>
+                        <w:spacing w:after="0" w:line="240" w:lineRule="auto"/>
+                        <w:ind w:left="142"/>
+                        <w:rPr>
+                          <w:rFonts w:ascii="Arial" w:hAnsi="Arial" w:cs="Arial"/>
+                          <w:color w:val="000000" w:themeColor="text1"/>
+                          <w:sz w:val="18"/>
+                          <w:szCs w:val="20"/>
+                        </w:rPr>
+                      </w:pPr>
+                      <w:r>
+                        <w:rPr>
+                          <w:rFonts w:ascii="Arial" w:hAnsi="Arial" w:cs="Arial"/>
+                          <w:color w:val="000000" w:themeColor="text1"/>
+                          <w:sz w:val="18"/>
+                          <w:szCs w:val="20"/>
+                        </w:rPr>
+                        <w:t>Total removed (n = 1,007)</w:t>
                       </w:r>
                     </w:p>
                   </w:txbxContent>
@@ -1615,6 +1954,11 @@
           </mc:Fallback>
         </mc:AlternateContent>
       </w:r>
+    </w:p>
+    <w:p>
+      <w:pPr>
+        <w:spacing w:after="0" w:line="240" w:lineRule="auto"/>
+      </w:pPr>
     </w:p>
     <w:p>
       <w:pPr>
@@ -1707,16 +2051,16 @@
         <mc:AlternateContent>
           <mc:Choice Requires="wps">
             <w:drawing>
-              <wp:anchor distT="0" distB="0" distL="114300" distR="114300" simplePos="0" relativeHeight="251706368" behindDoc="0" locked="0" layoutInCell="1" allowOverlap="1" wp14:anchorId="56EC9F21" wp14:editId="5E7B966D">
+              <wp:anchor distT="0" distB="0" distL="114300" distR="114300" simplePos="0" relativeHeight="251706368" behindDoc="0" locked="0" layoutInCell="1" allowOverlap="1" wp14:anchorId="56EC9F21" wp14:editId="09CC5B1B">
                 <wp:simplePos x="0" y="0"/>
                 <wp:positionH relativeFrom="column">
-                  <wp:posOffset>1399091</wp:posOffset>
+                  <wp:posOffset>1400954</wp:posOffset>
                 </wp:positionH>
                 <wp:positionV relativeFrom="paragraph">
-                  <wp:posOffset>50689</wp:posOffset>
+                  <wp:posOffset>125308</wp:posOffset>
                 </wp:positionV>
-                <wp:extent cx="3137" cy="358705"/>
-                <wp:effectExtent l="57150" t="0" r="73660" b="60960"/>
+                <wp:extent cx="3148" cy="282301"/>
+                <wp:effectExtent l="76200" t="0" r="73660" b="60960"/>
                 <wp:wrapNone/>
                 <wp:docPr id="27" name="Straight Arrow Connector 27"/>
                 <wp:cNvGraphicFramePr/>
@@ -1725,9 +2069,9 @@
                     <wps:wsp>
                       <wps:cNvCnPr/>
                       <wps:spPr>
-                        <a:xfrm>
+                        <a:xfrm flipH="1">
                           <a:off x="0" y="0"/>
-                          <a:ext cx="3137" cy="358705"/>
+                          <a:ext cx="3148" cy="282301"/>
                         </a:xfrm>
                         <a:prstGeom prst="straightConnector1">
                           <a:avLst/>
@@ -1768,7 +2112,7 @@
           </mc:Choice>
           <mc:Fallback>
             <w:pict>
-              <v:shape w14:anchorId="6877E486" id="Straight Arrow Connector 27" o:spid="_x0000_s1026" type="#_x0000_t32" style="position:absolute;margin-left:110.15pt;margin-top:4pt;width:.25pt;height:28.25pt;z-index:251706368;visibility:visible;mso-wrap-style:square;mso-width-percent:0;mso-height-percent:0;mso-wrap-distance-left:9pt;mso-wrap-distance-top:0;mso-wrap-distance-right:9pt;mso-wrap-distance-bottom:0;mso-position-horizontal:absolute;mso-position-horizontal-relative:text;mso-position-vertical:absolute;mso-position-vertical-relative:text;mso-width-percent:0;mso-height-percent:0;mso-width-relative:margin;mso-height-relative:margin" o:gfxdata="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" strokecolor="black [3213]" strokeweight=".5pt">
+              <v:shape w14:anchorId="5636BE3A" id="Straight Arrow Connector 27" o:spid="_x0000_s1026" type="#_x0000_t32" style="position:absolute;margin-left:110.3pt;margin-top:9.85pt;width:.25pt;height:22.25pt;flip:x;z-index:251706368;visibility:visible;mso-wrap-style:square;mso-width-percent:0;mso-height-percent:0;mso-wrap-distance-left:9pt;mso-wrap-distance-top:0;mso-wrap-distance-right:9pt;mso-wrap-distance-bottom:0;mso-position-horizontal:absolute;mso-position-horizontal-relative:text;mso-position-vertical:absolute;mso-position-vertical-relative:text;mso-width-percent:0;mso-height-percent:0;mso-width-relative:margin;mso-height-relative:margin" o:gfxdata="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" strokecolor="black [3213]" strokeweight=".5pt">
                 <v:stroke endarrow="block" joinstyle="miter"/>
               </v:shape>
             </w:pict>
@@ -1792,15 +2136,15 @@
         <mc:AlternateContent>
           <mc:Choice Requires="wps">
             <w:drawing>
-              <wp:anchor distT="0" distB="0" distL="114300" distR="114300" simplePos="0" relativeHeight="251665408" behindDoc="0" locked="0" layoutInCell="1" allowOverlap="1" wp14:anchorId="4FF0996A" wp14:editId="570A6838">
+              <wp:anchor distT="0" distB="0" distL="114300" distR="114300" simplePos="0" relativeHeight="251665408" behindDoc="0" locked="0" layoutInCell="1" allowOverlap="1" wp14:anchorId="4FF0996A" wp14:editId="39705B56">
                 <wp:simplePos x="0" y="0"/>
                 <wp:positionH relativeFrom="column">
-                  <wp:posOffset>3032106</wp:posOffset>
+                  <wp:posOffset>3050540</wp:posOffset>
                 </wp:positionH>
                 <wp:positionV relativeFrom="paragraph">
-                  <wp:posOffset>65982</wp:posOffset>
+                  <wp:posOffset>167005</wp:posOffset>
                 </wp:positionV>
-                <wp:extent cx="1887220" cy="397934"/>
+                <wp:extent cx="1887220" cy="397510"/>
                 <wp:effectExtent l="0" t="0" r="17780" b="21590"/>
                 <wp:wrapNone/>
                 <wp:docPr id="4" name="Rectangle 4"/>
@@ -1812,7 +2156,7 @@
                       <wps:spPr>
                         <a:xfrm>
                           <a:off x="0" y="0"/>
-                          <a:ext cx="1887220" cy="397934"/>
+                          <a:ext cx="1887220" cy="397510"/>
                         </a:xfrm>
                         <a:prstGeom prst="rect">
                           <a:avLst/>
@@ -1967,7 +2311,7 @@
           </mc:Choice>
           <mc:Fallback>
             <w:pict>
-              <v:rect w14:anchorId="4FF0996A" id="Rectangle 4" o:spid="_x0000_s1032" style="position:absolute;margin-left:238.75pt;margin-top:5.2pt;width:148.6pt;height:31.35pt;z-index:251665408;visibility:visible;mso-wrap-style:square;mso-width-percent:0;mso-height-percent:0;mso-wrap-distance-left:9pt;mso-wrap-distance-top:0;mso-wrap-distance-right:9pt;mso-wrap-distance-bottom:0;mso-position-horizontal:absolute;mso-position-horizontal-relative:text;mso-position-vertical:absolute;mso-position-vertical-relative:text;mso-width-percent:0;mso-height-percent:0;mso-width-relative:margin;mso-height-relative:margin;v-text-anchor:middle" o:gfxdata="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" filled="f" strokecolor="black [3213]" strokeweight="1pt">
+              <v:rect w14:anchorId="4FF0996A" id="Rectangle 4" o:spid="_x0000_s1032" style="position:absolute;margin-left:240.2pt;margin-top:13.15pt;width:148.6pt;height:31.3pt;z-index:251665408;visibility:visible;mso-wrap-style:square;mso-width-percent:0;mso-height-percent:0;mso-wrap-distance-left:9pt;mso-wrap-distance-top:0;mso-wrap-distance-right:9pt;mso-wrap-distance-bottom:0;mso-position-horizontal:absolute;mso-position-horizontal-relative:text;mso-position-vertical:absolute;mso-position-vertical-relative:text;mso-width-percent:0;mso-height-percent:0;mso-width-relative:margin;mso-height-relative:margin;v-text-anchor:middle" o:gfxdata="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" filled="f" strokecolor="black [3213]" strokeweight="1pt">
                 <v:textbox>
                   <w:txbxContent>
                     <w:p>
@@ -2087,7 +2431,7 @@
         <mc:AlternateContent>
           <mc:Choice Requires="wps">
             <w:drawing>
-              <wp:anchor distT="0" distB="0" distL="114300" distR="114300" simplePos="0" relativeHeight="251663360" behindDoc="0" locked="0" layoutInCell="1" allowOverlap="1" wp14:anchorId="4C37AEA5" wp14:editId="4211F34C">
+              <wp:anchor distT="0" distB="0" distL="114300" distR="114300" simplePos="0" relativeHeight="251663360" behindDoc="0" locked="0" layoutInCell="1" allowOverlap="1" wp14:anchorId="4C37AEA5" wp14:editId="389BB598">
                 <wp:simplePos x="0" y="0"/>
                 <wp:positionH relativeFrom="column">
                   <wp:posOffset>558177</wp:posOffset>
@@ -2256,7 +2600,7 @@
         <mc:AlternateContent>
           <mc:Choice Requires="wps">
             <w:drawing>
-              <wp:anchor distT="0" distB="0" distL="114300" distR="114300" simplePos="0" relativeHeight="251681792" behindDoc="0" locked="0" layoutInCell="1" allowOverlap="1" wp14:anchorId="268C9137" wp14:editId="569E4D85">
+              <wp:anchor distT="0" distB="0" distL="114300" distR="114300" simplePos="0" relativeHeight="251681792" behindDoc="0" locked="0" layoutInCell="1" allowOverlap="1" wp14:anchorId="268C9137" wp14:editId="48926B0D">
                 <wp:simplePos x="0" y="0"/>
                 <wp:positionH relativeFrom="column">
                   <wp:posOffset>2453640</wp:posOffset>
@@ -2311,7 +2655,7 @@
           </mc:Choice>
           <mc:Fallback>
             <w:pict>
-              <v:shape w14:anchorId="3DC9F395" id="Straight Arrow Connector 15" o:spid="_x0000_s1026" type="#_x0000_t32" style="position:absolute;margin-left:193.2pt;margin-top:25.85pt;width:44.35pt;height:0;z-index:251681792;visibility:visible;mso-wrap-style:square;mso-wrap-distance-left:9pt;mso-wrap-distance-top:0;mso-wrap-distance-right:9pt;mso-wrap-distance-bottom:0;mso-position-horizontal:absolute;mso-position-horizontal-relative:text;mso-position-vertical:absolute;mso-position-vertical-relative:text" o:gfxdata="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" strokecolor="black [3213]" strokeweight=".5pt">
+              <v:shape w14:anchorId="1636F4EE" id="Straight Arrow Connector 15" o:spid="_x0000_s1026" type="#_x0000_t32" style="position:absolute;margin-left:193.2pt;margin-top:25.85pt;width:44.35pt;height:0;z-index:251681792;visibility:visible;mso-wrap-style:square;mso-wrap-distance-left:9pt;mso-wrap-distance-top:0;mso-wrap-distance-right:9pt;mso-wrap-distance-bottom:0;mso-position-horizontal:absolute;mso-position-horizontal-relative:text;mso-position-vertical:absolute;mso-position-vertical-relative:text" o:gfxdata="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" strokecolor="black [3213]" strokeweight=".5pt">
                 <v:stroke endarrow="block" joinstyle="miter"/>
               </v:shape>
             </w:pict>
@@ -2335,7 +2679,7 @@
         <mc:AlternateContent>
           <mc:Choice Requires="wps">
             <w:drawing>
-              <wp:anchor distT="0" distB="0" distL="114300" distR="114300" simplePos="0" relativeHeight="251724800" behindDoc="0" locked="0" layoutInCell="1" allowOverlap="1" wp14:anchorId="2CA1D844" wp14:editId="3B133C9B">
+              <wp:anchor distT="0" distB="0" distL="114300" distR="114300" simplePos="0" relativeHeight="251724800" behindDoc="0" locked="0" layoutInCell="1" allowOverlap="1" wp14:anchorId="2CA1D844" wp14:editId="34219B9A">
                 <wp:simplePos x="0" y="0"/>
                 <wp:positionH relativeFrom="column">
                   <wp:posOffset>1411921</wp:posOffset>
@@ -2396,7 +2740,7 @@
           </mc:Choice>
           <mc:Fallback>
             <w:pict>
-              <v:shape w14:anchorId="49E0AC95" id="Straight Arrow Connector 27" o:spid="_x0000_s1026" type="#_x0000_t32" style="position:absolute;margin-left:111.15pt;margin-top:10.15pt;width:.25pt;height:16.8pt;z-index:251724800;visibility:visible;mso-wrap-style:square;mso-width-percent:0;mso-height-percent:0;mso-wrap-distance-left:9pt;mso-wrap-distance-top:0;mso-wrap-distance-right:9pt;mso-wrap-distance-bottom:0;mso-position-horizontal:absolute;mso-position-horizontal-relative:text;mso-position-vertical:absolute;mso-position-vertical-relative:text;mso-width-percent:0;mso-height-percent:0;mso-width-relative:margin;mso-height-relative:margin" o:gfxdata="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" strokecolor="black [3213]" strokeweight=".5pt">
+              <v:shape w14:anchorId="7205B8D5" id="Straight Arrow Connector 27" o:spid="_x0000_s1026" type="#_x0000_t32" style="position:absolute;margin-left:111.15pt;margin-top:10.15pt;width:.25pt;height:16.8pt;z-index:251724800;visibility:visible;mso-wrap-style:square;mso-width-percent:0;mso-height-percent:0;mso-wrap-distance-left:9pt;mso-wrap-distance-top:0;mso-wrap-distance-right:9pt;mso-wrap-distance-bottom:0;mso-position-horizontal:absolute;mso-position-horizontal-relative:text;mso-position-vertical:absolute;mso-position-vertical-relative:text;mso-width-percent:0;mso-height-percent:0;mso-width-relative:margin;mso-height-relative:margin" o:gfxdata="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" strokecolor="black [3213]" strokeweight=".5pt">
                 <v:stroke endarrow="block" joinstyle="miter"/>
               </v:shape>
             </w:pict>
@@ -2415,13 +2759,13 @@
         <mc:AlternateContent>
           <mc:Choice Requires="wps">
             <w:drawing>
-              <wp:anchor distT="0" distB="0" distL="114300" distR="114300" simplePos="0" relativeHeight="251718656" behindDoc="0" locked="0" layoutInCell="1" allowOverlap="1" wp14:anchorId="1C9EC9A9" wp14:editId="48388065">
+              <wp:anchor distT="0" distB="0" distL="114300" distR="114300" simplePos="0" relativeHeight="251718656" behindDoc="0" locked="0" layoutInCell="1" allowOverlap="1" wp14:anchorId="1C9EC9A9" wp14:editId="5D0D28DD">
                 <wp:simplePos x="0" y="0"/>
                 <wp:positionH relativeFrom="column">
-                  <wp:posOffset>3026147</wp:posOffset>
+                  <wp:posOffset>3038475</wp:posOffset>
                 </wp:positionH>
                 <wp:positionV relativeFrom="paragraph">
-                  <wp:posOffset>39777</wp:posOffset>
+                  <wp:posOffset>128270</wp:posOffset>
                 </wp:positionV>
                 <wp:extent cx="1887220" cy="397510"/>
                 <wp:effectExtent l="0" t="0" r="17780" b="21590"/>
@@ -2527,7 +2871,7 @@
           </mc:Choice>
           <mc:Fallback>
             <w:pict>
-              <v:rect w14:anchorId="1C9EC9A9" id="_x0000_s1034" style="position:absolute;margin-left:238.3pt;margin-top:3.15pt;width:148.6pt;height:31.3pt;z-index:251718656;visibility:visible;mso-wrap-style:square;mso-width-percent:0;mso-height-percent:0;mso-wrap-distance-left:9pt;mso-wrap-distance-top:0;mso-wrap-distance-right:9pt;mso-wrap-distance-bottom:0;mso-position-horizontal:absolute;mso-position-horizontal-relative:text;mso-position-vertical:absolute;mso-position-vertical-relative:text;mso-width-percent:0;mso-height-percent:0;mso-width-relative:margin;mso-height-relative:margin;v-text-anchor:middle" o:gfxdata="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" filled="f" strokecolor="black [3213]" strokeweight="1pt">
+              <v:rect w14:anchorId="1C9EC9A9" id="_x0000_s1034" style="position:absolute;margin-left:239.25pt;margin-top:10.1pt;width:148.6pt;height:31.3pt;z-index:251718656;visibility:visible;mso-wrap-style:square;mso-width-percent:0;mso-height-percent:0;mso-wrap-distance-left:9pt;mso-wrap-distance-top:0;mso-wrap-distance-right:9pt;mso-wrap-distance-bottom:0;mso-position-horizontal:absolute;mso-position-horizontal-relative:text;mso-position-vertical:absolute;mso-position-vertical-relative:text;mso-width-percent:0;mso-height-percent:0;mso-width-relative:margin;mso-height-relative:margin;v-text-anchor:middle" o:gfxdata="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" filled="f" strokecolor="black [3213]" strokeweight="1pt">
                 <v:textbox>
                   <w:txbxContent>
                     <w:p>
@@ -2837,13 +3181,13 @@
         <mc:AlternateContent>
           <mc:Choice Requires="wps">
             <w:drawing>
-              <wp:anchor distT="0" distB="0" distL="114300" distR="114300" simplePos="0" relativeHeight="251671552" behindDoc="0" locked="0" layoutInCell="1" allowOverlap="1" wp14:anchorId="0A6784D8" wp14:editId="322F8EFB">
+              <wp:anchor distT="0" distB="0" distL="114300" distR="114300" simplePos="0" relativeHeight="251671552" behindDoc="0" locked="0" layoutInCell="1" allowOverlap="1" wp14:anchorId="0A6784D8" wp14:editId="76BDD726">
                 <wp:simplePos x="0" y="0"/>
                 <wp:positionH relativeFrom="column">
-                  <wp:posOffset>3019245</wp:posOffset>
+                  <wp:posOffset>3037840</wp:posOffset>
                 </wp:positionH>
                 <wp:positionV relativeFrom="paragraph">
-                  <wp:posOffset>10747</wp:posOffset>
+                  <wp:posOffset>99060</wp:posOffset>
                 </wp:positionV>
                 <wp:extent cx="2751827" cy="925195"/>
                 <wp:effectExtent l="0" t="0" r="10795" b="27305"/>
@@ -3043,7 +3387,7 @@
           </mc:Choice>
           <mc:Fallback>
             <w:pict>
-              <v:rect w14:anchorId="0A6784D8" id="Rectangle 9" o:spid="_x0000_s1036" style="position:absolute;margin-left:237.75pt;margin-top:.85pt;width:216.7pt;height:72.85pt;z-index:251671552;visibility:visible;mso-wrap-style:square;mso-width-percent:0;mso-height-percent:0;mso-wrap-distance-left:9pt;mso-wrap-distance-top:0;mso-wrap-distance-right:9pt;mso-wrap-distance-bottom:0;mso-position-horizontal:absolute;mso-position-horizontal-relative:text;mso-position-vertical:absolute;mso-position-vertical-relative:text;mso-width-percent:0;mso-height-percent:0;mso-width-relative:margin;mso-height-relative:margin;v-text-anchor:middle" o:gfxdata="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" filled="f" strokecolor="black [3213]" strokeweight="1pt">
+              <v:rect w14:anchorId="0A6784D8" id="Rectangle 9" o:spid="_x0000_s1036" style="position:absolute;margin-left:239.2pt;margin-top:7.8pt;width:216.7pt;height:72.85pt;z-index:251671552;visibility:visible;mso-wrap-style:square;mso-width-percent:0;mso-height-percent:0;mso-wrap-distance-left:9pt;mso-wrap-distance-top:0;mso-wrap-distance-right:9pt;mso-wrap-distance-bottom:0;mso-position-horizontal:absolute;mso-position-horizontal-relative:text;mso-position-vertical:absolute;mso-position-vertical-relative:text;mso-width-percent:0;mso-height-percent:0;mso-width-relative:margin;mso-height-relative:margin;v-text-anchor:middle" o:gfxdata="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" filled="f" strokecolor="black [3213]" strokeweight="1pt">
                 <v:textbox inset="0,0,0,0">
                   <w:txbxContent>
                     <w:p>
@@ -3905,13 +4249,13 @@
         <mc:AlternateContent>
           <mc:Choice Requires="wps">
             <w:drawing>
-              <wp:anchor distT="0" distB="0" distL="114300" distR="114300" simplePos="0" relativeHeight="251722752" behindDoc="0" locked="0" layoutInCell="1" allowOverlap="1" wp14:anchorId="73CCC501" wp14:editId="6BE4F365">
+              <wp:anchor distT="0" distB="0" distL="114300" distR="114300" simplePos="0" relativeHeight="251722752" behindDoc="0" locked="0" layoutInCell="1" allowOverlap="1" wp14:anchorId="73CCC501" wp14:editId="04CE0705">
                 <wp:simplePos x="0" y="0"/>
                 <wp:positionH relativeFrom="column">
-                  <wp:posOffset>3045126</wp:posOffset>
+                  <wp:posOffset>3057525</wp:posOffset>
                 </wp:positionH>
                 <wp:positionV relativeFrom="paragraph">
-                  <wp:posOffset>5679</wp:posOffset>
+                  <wp:posOffset>87630</wp:posOffset>
                 </wp:positionV>
                 <wp:extent cx="2009954" cy="802005"/>
                 <wp:effectExtent l="0" t="0" r="28575" b="17145"/>
@@ -3973,7 +4317,7 @@
                                 <w:sz w:val="18"/>
                                 <w:szCs w:val="20"/>
                               </w:rPr>
-                              <w:t>Records excluded after post-search</w:t>
+                              <w:t>Records excluded after post-search integrity checking (n = 4):</w:t>
                             </w:r>
                           </w:p>
                           <w:p>
@@ -3994,88 +4338,7 @@
                                 <w:sz w:val="18"/>
                                 <w:szCs w:val="20"/>
                               </w:rPr>
-                              <w:t xml:space="preserve">integrity checking (n = </w:t>
-                            </w:r>
-                            <w:r>
-                              <w:rPr>
-                                <w:rFonts w:ascii="Arial" w:hAnsi="Arial" w:cs="Arial"/>
-                                <w:color w:val="000000" w:themeColor="text1"/>
-                                <w:sz w:val="18"/>
-                                <w:szCs w:val="20"/>
-                              </w:rPr>
-                              <w:t>4</w:t>
-                            </w:r>
-                            <w:r>
-                              <w:rPr>
-                                <w:rFonts w:ascii="Arial" w:hAnsi="Arial" w:cs="Arial"/>
-                                <w:color w:val="000000" w:themeColor="text1"/>
-                                <w:sz w:val="18"/>
-                                <w:szCs w:val="20"/>
-                              </w:rPr>
-                              <w:t>):</w:t>
-                            </w:r>
-                          </w:p>
-                          <w:p>
-                            <w:pPr>
-                              <w:spacing w:after="0" w:line="240" w:lineRule="auto"/>
-                              <w:ind w:left="284"/>
-                              <w:rPr>
-                                <w:rFonts w:ascii="Arial" w:hAnsi="Arial" w:cs="Arial"/>
-                                <w:color w:val="000000" w:themeColor="text1"/>
-                                <w:sz w:val="18"/>
-                                <w:szCs w:val="20"/>
-                              </w:rPr>
-                            </w:pPr>
-                            <w:r>
-                              <w:rPr>
-                                <w:rFonts w:ascii="Arial" w:hAnsi="Arial" w:cs="Arial"/>
-                                <w:color w:val="000000" w:themeColor="text1"/>
-                                <w:sz w:val="18"/>
-                                <w:szCs w:val="20"/>
-                              </w:rPr>
-                              <w:t>Retracted by their publishers;</w:t>
-                            </w:r>
-                          </w:p>
-                          <w:p>
-                            <w:pPr>
-                              <w:spacing w:after="0" w:line="240" w:lineRule="auto"/>
-                              <w:ind w:left="284"/>
-                              <w:rPr>
-                                <w:rFonts w:ascii="Arial" w:hAnsi="Arial" w:cs="Arial"/>
-                                <w:color w:val="000000" w:themeColor="text1"/>
-                                <w:sz w:val="18"/>
-                                <w:szCs w:val="20"/>
-                              </w:rPr>
-                            </w:pPr>
-                            <w:r>
-                              <w:rPr>
-                                <w:rFonts w:ascii="Arial" w:hAnsi="Arial" w:cs="Arial"/>
-                                <w:color w:val="000000" w:themeColor="text1"/>
-                                <w:sz w:val="18"/>
-                                <w:szCs w:val="20"/>
-                              </w:rPr>
-                              <w:t>documented separately for ethical</w:t>
-                            </w:r>
-                          </w:p>
-                          <w:p>
-                            <w:pPr>
-                              <w:spacing w:after="0" w:line="240" w:lineRule="auto"/>
-                              <w:ind w:left="284"/>
-                              <w:rPr>
-                                <w:rFonts w:ascii="Arial" w:hAnsi="Arial" w:cs="Arial"/>
-                                <w:color w:val="000000" w:themeColor="text1"/>
-                                <w:sz w:val="18"/>
-                                <w:szCs w:val="20"/>
-                              </w:rPr>
-                            </w:pPr>
-                            <w:r>
-                              <w:rPr>
-                                <w:rFonts w:ascii="Arial" w:hAnsi="Arial" w:cs="Arial"/>
-                                <w:color w:val="000000" w:themeColor="text1"/>
-                                <w:sz w:val="18"/>
-                                <w:szCs w:val="20"/>
-                              </w:rPr>
-                              <w:t>reporting only (Section 2.7)</w:t>
+                              <w:t>Retracted by their publishers; documented separately for ethical reporting only (Section 2.7)</w:t>
                             </w:r>
                           </w:p>
                         </w:txbxContent>
@@ -4100,7 +4363,7 @@
           </mc:Choice>
           <mc:Fallback>
             <w:pict>
-              <v:rect w14:anchorId="73CCC501" id="_x0000_s1040" style="position:absolute;margin-left:239.75pt;margin-top:.45pt;width:158.25pt;height:63.15pt;z-index:251722752;visibility:visible;mso-wrap-style:square;mso-width-percent:0;mso-height-percent:0;mso-wrap-distance-left:9pt;mso-wrap-distance-top:0;mso-wrap-distance-right:9pt;mso-wrap-distance-bottom:0;mso-position-horizontal:absolute;mso-position-horizontal-relative:text;mso-position-vertical:absolute;mso-position-vertical-relative:text;mso-width-percent:0;mso-height-percent:0;mso-width-relative:margin;mso-height-relative:margin;v-text-anchor:middle" o:gfxdata="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" filled="f" strokecolor="black [3213]" strokeweight="1pt">
+              <v:rect w14:anchorId="73CCC501" id="_x0000_s1040" style="position:absolute;margin-left:240.75pt;margin-top:6.9pt;width:158.25pt;height:63.15pt;z-index:251722752;visibility:visible;mso-wrap-style:square;mso-width-percent:0;mso-height-percent:0;mso-wrap-distance-left:9pt;mso-wrap-distance-top:0;mso-wrap-distance-right:9pt;mso-wrap-distance-bottom:0;mso-position-horizontal:absolute;mso-position-horizontal-relative:text;mso-position-vertical:absolute;mso-position-vertical-relative:text;mso-width-percent:0;mso-height-percent:0;mso-width-relative:margin;mso-height-relative:margin;v-text-anchor:middle" o:gfxdata="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" filled="f" strokecolor="black [3213]" strokeweight="1pt">
                 <v:textbox inset="0,0,0,0">
                   <w:txbxContent>
                     <w:p>
@@ -4121,7 +4384,7 @@
                           <w:sz w:val="18"/>
                           <w:szCs w:val="20"/>
                         </w:rPr>
-                        <w:t>Records excluded after post-search</w:t>
+                        <w:t>Records excluded after post-search integrity checking (n = 4):</w:t>
                       </w:r>
                     </w:p>
                     <w:p>
@@ -4142,88 +4405,7 @@
                           <w:sz w:val="18"/>
                           <w:szCs w:val="20"/>
                         </w:rPr>
-                        <w:t xml:space="preserve">integrity checking (n = </w:t>
-                      </w:r>
-                      <w:r>
-                        <w:rPr>
-                          <w:rFonts w:ascii="Arial" w:hAnsi="Arial" w:cs="Arial"/>
-                          <w:color w:val="000000" w:themeColor="text1"/>
-                          <w:sz w:val="18"/>
-                          <w:szCs w:val="20"/>
-                        </w:rPr>
-                        <w:t>4</w:t>
-                      </w:r>
-                      <w:r>
-                        <w:rPr>
-                          <w:rFonts w:ascii="Arial" w:hAnsi="Arial" w:cs="Arial"/>
-                          <w:color w:val="000000" w:themeColor="text1"/>
-                          <w:sz w:val="18"/>
-                          <w:szCs w:val="20"/>
-                        </w:rPr>
-                        <w:t>):</w:t>
-                      </w:r>
-                    </w:p>
-                    <w:p>
-                      <w:pPr>
-                        <w:spacing w:after="0" w:line="240" w:lineRule="auto"/>
-                        <w:ind w:left="284"/>
-                        <w:rPr>
-                          <w:rFonts w:ascii="Arial" w:hAnsi="Arial" w:cs="Arial"/>
-                          <w:color w:val="000000" w:themeColor="text1"/>
-                          <w:sz w:val="18"/>
-                          <w:szCs w:val="20"/>
-                        </w:rPr>
-                      </w:pPr>
-                      <w:r>
-                        <w:rPr>
-                          <w:rFonts w:ascii="Arial" w:hAnsi="Arial" w:cs="Arial"/>
-                          <w:color w:val="000000" w:themeColor="text1"/>
-                          <w:sz w:val="18"/>
-                          <w:szCs w:val="20"/>
-                        </w:rPr>
-                        <w:t>Retracted by their publishers;</w:t>
-                      </w:r>
-                    </w:p>
-                    <w:p>
-                      <w:pPr>
-                        <w:spacing w:after="0" w:line="240" w:lineRule="auto"/>
-                        <w:ind w:left="284"/>
-                        <w:rPr>
-                          <w:rFonts w:ascii="Arial" w:hAnsi="Arial" w:cs="Arial"/>
-                          <w:color w:val="000000" w:themeColor="text1"/>
-                          <w:sz w:val="18"/>
-                          <w:szCs w:val="20"/>
-                        </w:rPr>
-                      </w:pPr>
-                      <w:r>
-                        <w:rPr>
-                          <w:rFonts w:ascii="Arial" w:hAnsi="Arial" w:cs="Arial"/>
-                          <w:color w:val="000000" w:themeColor="text1"/>
-                          <w:sz w:val="18"/>
-                          <w:szCs w:val="20"/>
-                        </w:rPr>
-                        <w:t>documented separately for ethical</w:t>
-                      </w:r>
-                    </w:p>
-                    <w:p>
-                      <w:pPr>
-                        <w:spacing w:after="0" w:line="240" w:lineRule="auto"/>
-                        <w:ind w:left="284"/>
-                        <w:rPr>
-                          <w:rFonts w:ascii="Arial" w:hAnsi="Arial" w:cs="Arial"/>
-                          <w:color w:val="000000" w:themeColor="text1"/>
-                          <w:sz w:val="18"/>
-                          <w:szCs w:val="20"/>
-                        </w:rPr>
-                      </w:pPr>
-                      <w:r>
-                        <w:rPr>
-                          <w:rFonts w:ascii="Arial" w:hAnsi="Arial" w:cs="Arial"/>
-                          <w:color w:val="000000" w:themeColor="text1"/>
-                          <w:sz w:val="18"/>
-                          <w:szCs w:val="20"/>
-                        </w:rPr>
-                        <w:t>reporting only (Section 2.7)</w:t>
+                        <w:t>Retracted by their publishers; documented separately for ethical reporting only (Section 2.7)</w:t>
                       </w:r>
                     </w:p>
                   </w:txbxContent>
@@ -4409,7 +4591,184 @@
         <mc:AlternateContent>
           <mc:Choice Requires="wps">
             <w:drawing>
-              <wp:anchor distT="0" distB="0" distL="114300" distR="114300" simplePos="0" relativeHeight="251730944" behindDoc="0" locked="0" layoutInCell="1" allowOverlap="1" wp14:anchorId="2981E01D" wp14:editId="646EAEB6">
+              <wp:anchor distT="0" distB="0" distL="114300" distR="114300" simplePos="0" relativeHeight="251678720" behindDoc="0" locked="0" layoutInCell="1" allowOverlap="1" wp14:anchorId="2957DE69" wp14:editId="615C435A">
+                <wp:simplePos x="0" y="0"/>
+                <wp:positionH relativeFrom="column">
+                  <wp:posOffset>3037205</wp:posOffset>
+                </wp:positionH>
+                <wp:positionV relativeFrom="paragraph">
+                  <wp:posOffset>158115</wp:posOffset>
+                </wp:positionV>
+                <wp:extent cx="2620978" cy="683537"/>
+                <wp:effectExtent l="0" t="0" r="27305" b="21590"/>
+                <wp:wrapNone/>
+                <wp:docPr id="13" name="Rectangle 13"/>
+                <wp:cNvGraphicFramePr/>
+                <a:graphic xmlns:a="http://schemas.openxmlformats.org/drawingml/2006/main">
+                  <a:graphicData uri="http://schemas.microsoft.com/office/word/2010/wordprocessingShape">
+                    <wps:wsp>
+                      <wps:cNvSpPr/>
+                      <wps:spPr>
+                        <a:xfrm>
+                          <a:off x="0" y="0"/>
+                          <a:ext cx="2620978" cy="683537"/>
+                        </a:xfrm>
+                        <a:prstGeom prst="rect">
+                          <a:avLst/>
+                        </a:prstGeom>
+                        <a:noFill/>
+                        <a:ln>
+                          <a:solidFill>
+                            <a:schemeClr val="tx1"/>
+                          </a:solidFill>
+                        </a:ln>
+                      </wps:spPr>
+                      <wps:style>
+                        <a:lnRef idx="2">
+                          <a:schemeClr val="accent1">
+                            <a:shade val="50000"/>
+                          </a:schemeClr>
+                        </a:lnRef>
+                        <a:fillRef idx="1">
+                          <a:schemeClr val="accent1"/>
+                        </a:fillRef>
+                        <a:effectRef idx="0">
+                          <a:schemeClr val="accent1"/>
+                        </a:effectRef>
+                        <a:fontRef idx="minor">
+                          <a:schemeClr val="lt1"/>
+                        </a:fontRef>
+                      </wps:style>
+                      <wps:txbx>
+                        <w:txbxContent>
+                          <w:p>
+                            <w:pPr>
+                              <w:spacing w:after="0" w:line="240" w:lineRule="auto"/>
+                              <w:rPr>
+                                <w:rFonts w:ascii="Arial" w:hAnsi="Arial" w:cs="Arial"/>
+                                <w:color w:val="000000" w:themeColor="text1"/>
+                                <w:sz w:val="18"/>
+                                <w:szCs w:val="20"/>
+                                <w:lang w:val="en-US"/>
+                              </w:rPr>
+                            </w:pPr>
+                            <w:r>
+                              <w:rPr>
+                                <w:rFonts w:ascii="Arial" w:hAnsi="Arial" w:cs="Arial"/>
+                                <w:color w:val="000000" w:themeColor="text1"/>
+                                <w:sz w:val="18"/>
+                                <w:szCs w:val="20"/>
+                                <w:lang w:val="en-US"/>
+                              </w:rPr>
+                              <w:t>Studies classified as contextual reference outside the eligible set (n = 7):</w:t>
+                            </w:r>
+                          </w:p>
+                          <w:p>
+                            <w:pPr>
+                              <w:spacing w:after="0" w:line="240" w:lineRule="auto"/>
+                              <w:rPr>
+                                <w:rFonts w:ascii="Arial" w:hAnsi="Arial" w:cs="Arial"/>
+                                <w:color w:val="000000" w:themeColor="text1"/>
+                                <w:sz w:val="18"/>
+                                <w:szCs w:val="20"/>
+                                <w:lang w:val="en-US"/>
+                              </w:rPr>
+                            </w:pPr>
+                            <w:r>
+                              <w:rPr>
+                                <w:rFonts w:ascii="Arial" w:hAnsi="Arial" w:cs="Arial"/>
+                                <w:color w:val="000000" w:themeColor="text1"/>
+                                <w:sz w:val="18"/>
+                                <w:szCs w:val="20"/>
+                                <w:lang w:val="en-US"/>
+                              </w:rPr>
+                              <w:t>Non-facial modalities or adult-only participants; documented in Supplementary Material S4</w:t>
+                            </w:r>
+                          </w:p>
+                        </w:txbxContent>
+                      </wps:txbx>
+                      <wps:bodyPr rot="0" spcFirstLastPara="0" vertOverflow="overflow" horzOverflow="overflow" vert="horz" wrap="square" lIns="91440" tIns="45720" rIns="91440" bIns="45720" numCol="1" spcCol="0" rtlCol="0" fromWordArt="0" anchor="ctr" anchorCtr="0" forceAA="0" compatLnSpc="1">
+                        <a:prstTxWarp prst="textNoShape">
+                          <a:avLst/>
+                        </a:prstTxWarp>
+                        <a:noAutofit/>
+                      </wps:bodyPr>
+                    </wps:wsp>
+                  </a:graphicData>
+                </a:graphic>
+                <wp14:sizeRelH relativeFrom="margin">
+                  <wp14:pctWidth>0</wp14:pctWidth>
+                </wp14:sizeRelH>
+                <wp14:sizeRelV relativeFrom="margin">
+                  <wp14:pctHeight>0</wp14:pctHeight>
+                </wp14:sizeRelV>
+              </wp:anchor>
+            </w:drawing>
+          </mc:Choice>
+          <mc:Fallback>
+            <w:pict>
+              <v:rect w14:anchorId="2957DE69" id="Rectangle 13" o:spid="_x0000_s1041" style="position:absolute;margin-left:239.15pt;margin-top:12.45pt;width:206.4pt;height:53.8pt;z-index:251678720;visibility:visible;mso-wrap-style:square;mso-width-percent:0;mso-height-percent:0;mso-wrap-distance-left:9pt;mso-wrap-distance-top:0;mso-wrap-distance-right:9pt;mso-wrap-distance-bottom:0;mso-position-horizontal:absolute;mso-position-horizontal-relative:text;mso-position-vertical:absolute;mso-position-vertical-relative:text;mso-width-percent:0;mso-height-percent:0;mso-width-relative:margin;mso-height-relative:margin;v-text-anchor:middle" o:gfxdata="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" filled="f" strokecolor="black [3213]" strokeweight="1pt">
+                <v:textbox>
+                  <w:txbxContent>
+                    <w:p>
+                      <w:pPr>
+                        <w:spacing w:after="0" w:line="240" w:lineRule="auto"/>
+                        <w:rPr>
+                          <w:rFonts w:ascii="Arial" w:hAnsi="Arial" w:cs="Arial"/>
+                          <w:color w:val="000000" w:themeColor="text1"/>
+                          <w:sz w:val="18"/>
+                          <w:szCs w:val="20"/>
+                          <w:lang w:val="en-US"/>
+                        </w:rPr>
+                      </w:pPr>
+                      <w:r>
+                        <w:rPr>
+                          <w:rFonts w:ascii="Arial" w:hAnsi="Arial" w:cs="Arial"/>
+                          <w:color w:val="000000" w:themeColor="text1"/>
+                          <w:sz w:val="18"/>
+                          <w:szCs w:val="20"/>
+                          <w:lang w:val="en-US"/>
+                        </w:rPr>
+                        <w:t>Studies classified as contextual reference outside the eligible set (n = 7):</w:t>
+                      </w:r>
+                    </w:p>
+                    <w:p>
+                      <w:pPr>
+                        <w:spacing w:after="0" w:line="240" w:lineRule="auto"/>
+                        <w:rPr>
+                          <w:rFonts w:ascii="Arial" w:hAnsi="Arial" w:cs="Arial"/>
+                          <w:color w:val="000000" w:themeColor="text1"/>
+                          <w:sz w:val="18"/>
+                          <w:szCs w:val="20"/>
+                          <w:lang w:val="en-US"/>
+                        </w:rPr>
+                      </w:pPr>
+                      <w:r>
+                        <w:rPr>
+                          <w:rFonts w:ascii="Arial" w:hAnsi="Arial" w:cs="Arial"/>
+                          <w:color w:val="000000" w:themeColor="text1"/>
+                          <w:sz w:val="18"/>
+                          <w:szCs w:val="20"/>
+                          <w:lang w:val="en-US"/>
+                        </w:rPr>
+                        <w:t>Non-facial modalities or adult-only participants; documented in Supplementary Material S4</w:t>
+                      </w:r>
+                    </w:p>
+                  </w:txbxContent>
+                </v:textbox>
+              </v:rect>
+            </w:pict>
+          </mc:Fallback>
+        </mc:AlternateContent>
+      </w:r>
+      <w:r>
+        <w:rPr>
+          <w:noProof/>
+        </w:rPr>
+        <mc:AlternateContent>
+          <mc:Choice Requires="wps">
+            <w:drawing>
+              <wp:anchor distT="0" distB="0" distL="114300" distR="114300" simplePos="0" relativeHeight="251730944" behindDoc="0" locked="0" layoutInCell="1" allowOverlap="1" wp14:anchorId="2981E01D" wp14:editId="45310299">
                 <wp:simplePos x="0" y="0"/>
                 <wp:positionH relativeFrom="column">
                   <wp:posOffset>526553</wp:posOffset>
@@ -4537,7 +4896,7 @@
           </mc:Choice>
           <mc:Fallback>
             <w:pict>
-              <v:rect w14:anchorId="2981E01D" id="_x0000_s1041" style="position:absolute;margin-left:41.45pt;margin-top:8.3pt;width:151.9pt;height:20.15pt;z-index:251730944;visibility:visible;mso-wrap-style:square;mso-width-percent:0;mso-height-percent:0;mso-wrap-distance-left:9pt;mso-wrap-distance-top:0;mso-wrap-distance-right:9pt;mso-wrap-distance-bottom:0;mso-position-horizontal:absolute;mso-position-horizontal-relative:text;mso-position-vertical:absolute;mso-position-vertical-relative:text;mso-width-percent:0;mso-height-percent:0;mso-width-relative:margin;mso-height-relative:margin;v-text-anchor:middle" o:gfxdata="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" filled="f" strokecolor="black [3213]" strokeweight="1pt">
+              <v:rect w14:anchorId="2981E01D" id="_x0000_s1042" style="position:absolute;margin-left:41.45pt;margin-top:8.3pt;width:151.9pt;height:20.15pt;z-index:251730944;visibility:visible;mso-wrap-style:square;mso-width-percent:0;mso-height-percent:0;mso-wrap-distance-left:9pt;mso-wrap-distance-top:0;mso-wrap-distance-right:9pt;mso-wrap-distance-bottom:0;mso-position-horizontal:absolute;mso-position-horizontal-relative:text;mso-position-vertical:absolute;mso-position-vertical-relative:text;mso-width-percent:0;mso-height-percent:0;mso-width-relative:margin;mso-height-relative:margin;v-text-anchor:middle" o:gfxdata="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" filled="f" strokecolor="black [3213]" strokeweight="1pt">
                 <v:textbox>
                   <w:txbxContent>
                     <w:p>
@@ -4594,271 +4953,6 @@
                           <w:szCs w:val="20"/>
                         </w:rPr>
                         <w:t>)</w:t>
-                      </w:r>
-                    </w:p>
-                  </w:txbxContent>
-                </v:textbox>
-              </v:rect>
-            </w:pict>
-          </mc:Fallback>
-        </mc:AlternateContent>
-      </w:r>
-      <w:r>
-        <w:rPr>
-          <w:noProof/>
-        </w:rPr>
-        <mc:AlternateContent>
-          <mc:Choice Requires="wps">
-            <w:drawing>
-              <wp:anchor distT="0" distB="0" distL="114300" distR="114300" simplePos="0" relativeHeight="251678720" behindDoc="0" locked="0" layoutInCell="1" allowOverlap="1" wp14:anchorId="2957DE69" wp14:editId="1ED2072F">
-                <wp:simplePos x="0" y="0"/>
-                <wp:positionH relativeFrom="column">
-                  <wp:posOffset>3037439</wp:posOffset>
-                </wp:positionH>
-                <wp:positionV relativeFrom="paragraph">
-                  <wp:posOffset>75785</wp:posOffset>
-                </wp:positionV>
-                <wp:extent cx="2620978" cy="683537"/>
-                <wp:effectExtent l="0" t="0" r="27305" b="21590"/>
-                <wp:wrapNone/>
-                <wp:docPr id="13" name="Rectangle 13"/>
-                <wp:cNvGraphicFramePr/>
-                <a:graphic xmlns:a="http://schemas.openxmlformats.org/drawingml/2006/main">
-                  <a:graphicData uri="http://schemas.microsoft.com/office/word/2010/wordprocessingShape">
-                    <wps:wsp>
-                      <wps:cNvSpPr/>
-                      <wps:spPr>
-                        <a:xfrm>
-                          <a:off x="0" y="0"/>
-                          <a:ext cx="2620978" cy="683537"/>
-                        </a:xfrm>
-                        <a:prstGeom prst="rect">
-                          <a:avLst/>
-                        </a:prstGeom>
-                        <a:noFill/>
-                        <a:ln>
-                          <a:solidFill>
-                            <a:schemeClr val="tx1"/>
-                          </a:solidFill>
-                        </a:ln>
-                      </wps:spPr>
-                      <wps:style>
-                        <a:lnRef idx="2">
-                          <a:schemeClr val="accent1">
-                            <a:shade val="50000"/>
-                          </a:schemeClr>
-                        </a:lnRef>
-                        <a:fillRef idx="1">
-                          <a:schemeClr val="accent1"/>
-                        </a:fillRef>
-                        <a:effectRef idx="0">
-                          <a:schemeClr val="accent1"/>
-                        </a:effectRef>
-                        <a:fontRef idx="minor">
-                          <a:schemeClr val="lt1"/>
-                        </a:fontRef>
-                      </wps:style>
-                      <wps:txbx>
-                        <w:txbxContent>
-                          <w:p>
-                            <w:pPr>
-                              <w:spacing w:after="0" w:line="240" w:lineRule="auto"/>
-                              <w:rPr>
-                                <w:rFonts w:ascii="Arial" w:hAnsi="Arial" w:cs="Arial"/>
-                                <w:color w:val="000000" w:themeColor="text1"/>
-                                <w:sz w:val="18"/>
-                                <w:szCs w:val="20"/>
-                                <w:lang w:val="en-US"/>
-                              </w:rPr>
-                            </w:pPr>
-                            <w:r>
-                              <w:rPr>
-                                <w:rFonts w:ascii="Arial" w:hAnsi="Arial" w:cs="Arial"/>
-                                <w:color w:val="000000" w:themeColor="text1"/>
-                                <w:sz w:val="18"/>
-                                <w:szCs w:val="20"/>
-                                <w:lang w:val="en-US"/>
-                              </w:rPr>
-                              <w:t>Studies classified as contextual reference</w:t>
-                            </w:r>
-                          </w:p>
-                          <w:p>
-                            <w:pPr>
-                              <w:spacing w:after="0" w:line="240" w:lineRule="auto"/>
-                              <w:rPr>
-                                <w:rFonts w:ascii="Arial" w:hAnsi="Arial" w:cs="Arial"/>
-                                <w:color w:val="000000" w:themeColor="text1"/>
-                                <w:sz w:val="18"/>
-                                <w:szCs w:val="20"/>
-                                <w:lang w:val="en-US"/>
-                              </w:rPr>
-                            </w:pPr>
-                            <w:r>
-                              <w:rPr>
-                                <w:rFonts w:ascii="Arial" w:hAnsi="Arial" w:cs="Arial"/>
-                                <w:color w:val="000000" w:themeColor="text1"/>
-                                <w:sz w:val="18"/>
-                                <w:szCs w:val="20"/>
-                                <w:lang w:val="en-US"/>
-                              </w:rPr>
-                              <w:t>outside the eligible set (n = 7)</w:t>
-                            </w:r>
-                          </w:p>
-                          <w:p>
-                            <w:pPr>
-                              <w:spacing w:after="0" w:line="240" w:lineRule="auto"/>
-                              <w:rPr>
-                                <w:rFonts w:ascii="Arial" w:hAnsi="Arial" w:cs="Arial"/>
-                                <w:color w:val="000000" w:themeColor="text1"/>
-                                <w:sz w:val="18"/>
-                                <w:szCs w:val="20"/>
-                                <w:lang w:val="en-US"/>
-                              </w:rPr>
-                            </w:pPr>
-                            <w:r>
-                              <w:rPr>
-                                <w:rFonts w:ascii="Arial" w:hAnsi="Arial" w:cs="Arial"/>
-                                <w:color w:val="000000" w:themeColor="text1"/>
-                                <w:sz w:val="18"/>
-                                <w:szCs w:val="20"/>
-                                <w:lang w:val="en-US"/>
-                              </w:rPr>
-                              <w:t>Non-facial modalities or adult-only participants;</w:t>
-                            </w:r>
-                          </w:p>
-                          <w:p>
-                            <w:pPr>
-                              <w:spacing w:after="0" w:line="240" w:lineRule="auto"/>
-                              <w:rPr>
-                                <w:rFonts w:ascii="Arial" w:hAnsi="Arial" w:cs="Arial"/>
-                                <w:color w:val="000000" w:themeColor="text1"/>
-                                <w:sz w:val="18"/>
-                                <w:szCs w:val="20"/>
-                                <w:lang w:val="en-US"/>
-                              </w:rPr>
-                            </w:pPr>
-                            <w:r>
-                              <w:rPr>
-                                <w:rFonts w:ascii="Arial" w:hAnsi="Arial" w:cs="Arial"/>
-                                <w:color w:val="000000" w:themeColor="text1"/>
-                                <w:sz w:val="18"/>
-                                <w:szCs w:val="20"/>
-                                <w:lang w:val="en-US"/>
-                              </w:rPr>
-                              <w:t>documented in Supplementary Material S4</w:t>
-                            </w:r>
-                          </w:p>
-                        </w:txbxContent>
-                      </wps:txbx>
-                      <wps:bodyPr rot="0" spcFirstLastPara="0" vertOverflow="overflow" horzOverflow="overflow" vert="horz" wrap="square" lIns="91440" tIns="45720" rIns="91440" bIns="45720" numCol="1" spcCol="0" rtlCol="0" fromWordArt="0" anchor="ctr" anchorCtr="0" forceAA="0" compatLnSpc="1">
-                        <a:prstTxWarp prst="textNoShape">
-                          <a:avLst/>
-                        </a:prstTxWarp>
-                        <a:noAutofit/>
-                      </wps:bodyPr>
-                    </wps:wsp>
-                  </a:graphicData>
-                </a:graphic>
-                <wp14:sizeRelH relativeFrom="margin">
-                  <wp14:pctWidth>0</wp14:pctWidth>
-                </wp14:sizeRelH>
-                <wp14:sizeRelV relativeFrom="margin">
-                  <wp14:pctHeight>0</wp14:pctHeight>
-                </wp14:sizeRelV>
-              </wp:anchor>
-            </w:drawing>
-          </mc:Choice>
-          <mc:Fallback>
-            <w:pict>
-              <v:rect w14:anchorId="2957DE69" id="Rectangle 13" o:spid="_x0000_s1042" style="position:absolute;margin-left:239.15pt;margin-top:5.95pt;width:206.4pt;height:53.8pt;z-index:251678720;visibility:visible;mso-wrap-style:square;mso-width-percent:0;mso-height-percent:0;mso-wrap-distance-left:9pt;mso-wrap-distance-top:0;mso-wrap-distance-right:9pt;mso-wrap-distance-bottom:0;mso-position-horizontal:absolute;mso-position-horizontal-relative:text;mso-position-vertical:absolute;mso-position-vertical-relative:text;mso-width-percent:0;mso-height-percent:0;mso-width-relative:margin;mso-height-relative:margin;v-text-anchor:middle" o:gfxdata="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" filled="f" strokecolor="black [3213]" strokeweight="1pt">
-                <v:textbox>
-                  <w:txbxContent>
-                    <w:p>
-                      <w:pPr>
-                        <w:spacing w:after="0" w:line="240" w:lineRule="auto"/>
-                        <w:rPr>
-                          <w:rFonts w:ascii="Arial" w:hAnsi="Arial" w:cs="Arial"/>
-                          <w:color w:val="000000" w:themeColor="text1"/>
-                          <w:sz w:val="18"/>
-                          <w:szCs w:val="20"/>
-                          <w:lang w:val="en-US"/>
-                        </w:rPr>
-                      </w:pPr>
-                      <w:r>
-                        <w:rPr>
-                          <w:rFonts w:ascii="Arial" w:hAnsi="Arial" w:cs="Arial"/>
-                          <w:color w:val="000000" w:themeColor="text1"/>
-                          <w:sz w:val="18"/>
-                          <w:szCs w:val="20"/>
-                          <w:lang w:val="en-US"/>
-                        </w:rPr>
-                        <w:t>Studies classified as contextual reference</w:t>
-                      </w:r>
-                    </w:p>
-                    <w:p>
-                      <w:pPr>
-                        <w:spacing w:after="0" w:line="240" w:lineRule="auto"/>
-                        <w:rPr>
-                          <w:rFonts w:ascii="Arial" w:hAnsi="Arial" w:cs="Arial"/>
-                          <w:color w:val="000000" w:themeColor="text1"/>
-                          <w:sz w:val="18"/>
-                          <w:szCs w:val="20"/>
-                          <w:lang w:val="en-US"/>
-                        </w:rPr>
-                      </w:pPr>
-                      <w:r>
-                        <w:rPr>
-                          <w:rFonts w:ascii="Arial" w:hAnsi="Arial" w:cs="Arial"/>
-                          <w:color w:val="000000" w:themeColor="text1"/>
-                          <w:sz w:val="18"/>
-                          <w:szCs w:val="20"/>
-                          <w:lang w:val="en-US"/>
-                        </w:rPr>
-                        <w:t>outside the eligible set (n = 7)</w:t>
-                      </w:r>
-                    </w:p>
-                    <w:p>
-                      <w:pPr>
-                        <w:spacing w:after="0" w:line="240" w:lineRule="auto"/>
-                        <w:rPr>
-                          <w:rFonts w:ascii="Arial" w:hAnsi="Arial" w:cs="Arial"/>
-                          <w:color w:val="000000" w:themeColor="text1"/>
-                          <w:sz w:val="18"/>
-                          <w:szCs w:val="20"/>
-                          <w:lang w:val="en-US"/>
-                        </w:rPr>
-                      </w:pPr>
-                      <w:r>
-                        <w:rPr>
-                          <w:rFonts w:ascii="Arial" w:hAnsi="Arial" w:cs="Arial"/>
-                          <w:color w:val="000000" w:themeColor="text1"/>
-                          <w:sz w:val="18"/>
-                          <w:szCs w:val="20"/>
-                          <w:lang w:val="en-US"/>
-                        </w:rPr>
-                        <w:t>Non-facial modalities or adult-only participants;</w:t>
-                      </w:r>
-                    </w:p>
-                    <w:p>
-                      <w:pPr>
-                        <w:spacing w:after="0" w:line="240" w:lineRule="auto"/>
-                        <w:rPr>
-                          <w:rFonts w:ascii="Arial" w:hAnsi="Arial" w:cs="Arial"/>
-                          <w:color w:val="000000" w:themeColor="text1"/>
-                          <w:sz w:val="18"/>
-                          <w:szCs w:val="20"/>
-                          <w:lang w:val="en-US"/>
-                        </w:rPr>
-                      </w:pPr>
-                      <w:r>
-                        <w:rPr>
-                          <w:rFonts w:ascii="Arial" w:hAnsi="Arial" w:cs="Arial"/>
-                          <w:color w:val="000000" w:themeColor="text1"/>
-                          <w:sz w:val="18"/>
-                          <w:szCs w:val="20"/>
-                          <w:lang w:val="en-US"/>
-                        </w:rPr>
-                        <w:t>documented in Supplementary Material S4</w:t>
                       </w:r>
                     </w:p>
                   </w:txbxContent>
@@ -4954,13 +5048,13 @@
         <mc:AlternateContent>
           <mc:Choice Requires="wps">
             <w:drawing>
-              <wp:anchor distT="0" distB="0" distL="114300" distR="114300" simplePos="0" relativeHeight="251737088" behindDoc="0" locked="0" layoutInCell="1" allowOverlap="1" wp14:anchorId="23C1261D" wp14:editId="6B7449A8">
+              <wp:anchor distT="0" distB="0" distL="114300" distR="114300" simplePos="0" relativeHeight="251737088" behindDoc="0" locked="0" layoutInCell="1" allowOverlap="1" wp14:anchorId="23C1261D" wp14:editId="7907FB2E">
                 <wp:simplePos x="0" y="0"/>
                 <wp:positionH relativeFrom="column">
-                  <wp:posOffset>1461380</wp:posOffset>
+                  <wp:posOffset>1461135</wp:posOffset>
                 </wp:positionH>
                 <wp:positionV relativeFrom="paragraph">
-                  <wp:posOffset>38081</wp:posOffset>
+                  <wp:posOffset>26035</wp:posOffset>
                 </wp:positionV>
                 <wp:extent cx="0" cy="493414"/>
                 <wp:effectExtent l="76200" t="0" r="57150" b="59055"/>
@@ -5015,7 +5109,7 @@
           </mc:Choice>
           <mc:Fallback>
             <w:pict>
-              <v:shape w14:anchorId="4D301207" id="Straight Arrow Connector 27" o:spid="_x0000_s1026" type="#_x0000_t32" style="position:absolute;margin-left:115.05pt;margin-top:3pt;width:0;height:38.85pt;z-index:251737088;visibility:visible;mso-wrap-style:square;mso-width-percent:0;mso-height-percent:0;mso-wrap-distance-left:9pt;mso-wrap-distance-top:0;mso-wrap-distance-right:9pt;mso-wrap-distance-bottom:0;mso-position-horizontal:absolute;mso-position-horizontal-relative:text;mso-position-vertical:absolute;mso-position-vertical-relative:text;mso-width-percent:0;mso-height-percent:0;mso-width-relative:margin;mso-height-relative:margin" o:gfxdata="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" strokecolor="black [3213]" strokeweight=".5pt">
+              <v:shape w14:anchorId="39211F2D" id="Straight Arrow Connector 27" o:spid="_x0000_s1026" type="#_x0000_t32" style="position:absolute;margin-left:115.05pt;margin-top:2.05pt;width:0;height:38.85pt;z-index:251737088;visibility:visible;mso-wrap-style:square;mso-width-percent:0;mso-height-percent:0;mso-wrap-distance-left:9pt;mso-wrap-distance-top:0;mso-wrap-distance-right:9pt;mso-wrap-distance-bottom:0;mso-position-horizontal:absolute;mso-position-horizontal-relative:text;mso-position-vertical:absolute;mso-position-vertical-relative:text;mso-width-percent:0;mso-height-percent:0;mso-width-relative:margin;mso-height-relative:margin" o:gfxdata="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" strokecolor="black [3213]" strokeweight=".5pt">
                 <v:stroke endarrow="block" joinstyle="miter"/>
               </v:shape>
             </w:pict>

</xml_diff>

<commit_message>
fix(prisma): clarify ACM exclusion label — 5 records excluded CI(4), detail in fig1 caption
</commit_message>
<xml_diff>
--- a/prisma/PRISMA_2020.docx
+++ b/prisma/PRISMA_2020.docx
@@ -1454,7 +1454,7 @@
         <mc:AlternateContent>
           <mc:Choice Requires="wps">
             <w:drawing>
-              <wp:anchor distT="0" distB="0" distL="114300" distR="114300" simplePos="0" relativeHeight="251661312" behindDoc="0" locked="0" layoutInCell="1" allowOverlap="1" wp14:anchorId="07961AC4" wp14:editId="7D2C4041">
+              <wp:anchor distT="0" distB="0" distL="114300" distR="114300" simplePos="0" relativeHeight="251661312" behindDoc="0" locked="0" layoutInCell="1" allowOverlap="1" wp14:anchorId="07961AC4" wp14:editId="430625C9">
                 <wp:simplePos x="0" y="0"/>
                 <wp:positionH relativeFrom="column">
                   <wp:posOffset>3048000</wp:posOffset>
@@ -1582,36 +1582,16 @@
                                 <w:sz w:val="18"/>
                                 <w:szCs w:val="20"/>
                               </w:rPr>
-                              <w:t xml:space="preserve">  - </w:t>
-                            </w:r>
-                            <w:r>
-                              <w:rPr>
-                                <w:rFonts w:ascii="Arial" w:hAnsi="Arial" w:cs="Arial"/>
-                                <w:color w:val="000000" w:themeColor="text1"/>
-                                <w:sz w:val="18"/>
-                                <w:szCs w:val="20"/>
-                              </w:rPr>
-                              <w:t xml:space="preserve">ACM records excluded </w:t>
-                            </w:r>
-                            <w:proofErr w:type="gramStart"/>
-                            <w:r>
-                              <w:rPr>
-                                <w:rFonts w:ascii="Arial" w:hAnsi="Arial" w:cs="Arial"/>
-                                <w:color w:val="000000" w:themeColor="text1"/>
-                                <w:sz w:val="18"/>
-                                <w:szCs w:val="20"/>
-                              </w:rPr>
-                              <w:t>CI(</w:t>
-                            </w:r>
-                            <w:proofErr w:type="gramEnd"/>
-                            <w:r>
-                              <w:rPr>
-                                <w:rFonts w:ascii="Arial" w:hAnsi="Arial" w:cs="Arial"/>
-                                <w:color w:val="000000" w:themeColor="text1"/>
-                                <w:sz w:val="18"/>
-                                <w:szCs w:val="20"/>
-                              </w:rPr>
-                              <w:t>4) not OA (n = 5)</w:t>
+                              <w:t xml:space="preserve">  </w:t>
+                            </w:r>
+                            <w:r>
+                              <w:rPr>
+                                <w:rFonts w:ascii="Arial" w:hAnsi="Arial" w:cs="Arial"/>
+                                <w:color w:val="000000" w:themeColor="text1"/>
+                                <w:sz w:val="18"/>
+                                <w:szCs w:val="20"/>
+                              </w:rPr>
+                              <w:t>- ACM records excluded before screening (n = 5)</w:t>
                             </w:r>
                           </w:p>
                           <w:p>
@@ -1816,36 +1796,16 @@
                           <w:sz w:val="18"/>
                           <w:szCs w:val="20"/>
                         </w:rPr>
-                        <w:t xml:space="preserve">  - </w:t>
-                      </w:r>
-                      <w:r>
-                        <w:rPr>
-                          <w:rFonts w:ascii="Arial" w:hAnsi="Arial" w:cs="Arial"/>
-                          <w:color w:val="000000" w:themeColor="text1"/>
-                          <w:sz w:val="18"/>
-                          <w:szCs w:val="20"/>
-                        </w:rPr>
-                        <w:t xml:space="preserve">ACM records excluded </w:t>
-                      </w:r>
-                      <w:proofErr w:type="gramStart"/>
-                      <w:r>
-                        <w:rPr>
-                          <w:rFonts w:ascii="Arial" w:hAnsi="Arial" w:cs="Arial"/>
-                          <w:color w:val="000000" w:themeColor="text1"/>
-                          <w:sz w:val="18"/>
-                          <w:szCs w:val="20"/>
-                        </w:rPr>
-                        <w:t>CI(</w:t>
-                      </w:r>
-                      <w:proofErr w:type="gramEnd"/>
-                      <w:r>
-                        <w:rPr>
-                          <w:rFonts w:ascii="Arial" w:hAnsi="Arial" w:cs="Arial"/>
-                          <w:color w:val="000000" w:themeColor="text1"/>
-                          <w:sz w:val="18"/>
-                          <w:szCs w:val="20"/>
-                        </w:rPr>
-                        <w:t>4) not OA (n = 5)</w:t>
+                        <w:t xml:space="preserve">  </w:t>
+                      </w:r>
+                      <w:r>
+                        <w:rPr>
+                          <w:rFonts w:ascii="Arial" w:hAnsi="Arial" w:cs="Arial"/>
+                          <w:color w:val="000000" w:themeColor="text1"/>
+                          <w:sz w:val="18"/>
+                          <w:szCs w:val="20"/>
+                        </w:rPr>
+                        <w:t>- ACM records excluded before screening (n = 5)</w:t>
                       </w:r>
                     </w:p>
                     <w:p>

</xml_diff>